<commit_message>
Update Chapter 6 - Ranking Basics with revised docx and v2 PDF
</commit_message>
<xml_diff>
--- a/chapters/Chapter 06/Chapter 06 - Ranking Basics.docx
+++ b/chapters/Chapter 06/Chapter 06 - Ranking Basics.docx
@@ -65,7 +65,25 @@
         <w:footnoteReference w:id="1"/>
       </w:r>
       <w:r>
-        <w:t xml:space="preserve"> architecture: retrieval surfaces hundreds of candidates, a first-stage ranker (lightweight model) filters them down to roughly 100, a second-stage ranker (heavy neural model) scores those precisely, and a value function combines multi-task predictions into a final score. This chapter focuses on the first-stage ranker: a model that is more expressive than retrieval but still efficient enough to score hundreds of candidates within tight latency budgets.</w:t>
+        <w:t xml:space="preserve"> architecture: retrieval </w:t>
+      </w:r>
+      <w:r>
+        <w:t>stage selections few 1000</w:t>
+      </w:r>
+      <w:r>
+        <w:t xml:space="preserve"> candidates, a first-stage ranker (lightweight model) filters them down to </w:t>
+      </w:r>
+      <w:r>
+        <w:t>few</w:t>
+      </w:r>
+      <w:r>
+        <w:t xml:space="preserve"> 100</w:t>
+      </w:r>
+      <w:r>
+        <w:t>s</w:t>
+      </w:r>
+      <w:r>
+        <w:t>, a second-stage ranker (heavy neural model) scores those precisely, and a value function combines multi-task predictions into a final score. This chapter focuses on the first-stage ranker: a model that is more expressive than retrieval but still efficient enough to score hundreds of candidates within tight latency budgets.</w:t>
       </w:r>
     </w:p>
     <w:p>
@@ -143,15 +161,7 @@
         <w:spacing w:after="120" w:line="276" w:lineRule="auto"/>
       </w:pPr>
       <w:r>
-        <w:t xml:space="preserve">Each item receives an independent score with no awareness of what other candidates are </w:t>
-      </w:r>
-      <w:proofErr w:type="gramStart"/>
-      <w:r>
-        <w:t>in</w:t>
-      </w:r>
-      <w:proofErr w:type="gramEnd"/>
-      <w:r>
-        <w:t xml:space="preserve"> the list. </w:t>
+        <w:t xml:space="preserve">Each item receives an independent score with no awareness of what other candidates are in the list. </w:t>
       </w:r>
       <w:r>
         <w:t>Does not directly optimize the ordering of items relative to each other.</w:t>
@@ -165,33 +175,7 @@
         <w:t>Even if the pointwise score is not calibrated to be the probability of a click</w:t>
       </w:r>
       <w:r>
-        <w:t xml:space="preserve">, pointwise approaches work well in practice because ranking only requires monotonic scores: if </w:t>
-      </w:r>
-      <w:proofErr w:type="gramStart"/>
-      <w:r>
-        <w:t>P(</w:t>
-      </w:r>
-      <w:proofErr w:type="spellStart"/>
-      <w:proofErr w:type="gramEnd"/>
-      <w:r>
-        <w:t>click|item</w:t>
-      </w:r>
-      <w:proofErr w:type="spellEnd"/>
-      <w:r>
-        <w:t xml:space="preserve"> A) &gt; </w:t>
-      </w:r>
-      <w:proofErr w:type="gramStart"/>
-      <w:r>
-        <w:t>P(</w:t>
-      </w:r>
-      <w:proofErr w:type="spellStart"/>
-      <w:proofErr w:type="gramEnd"/>
-      <w:r>
-        <w:t>click|item</w:t>
-      </w:r>
-      <w:proofErr w:type="spellEnd"/>
-      <w:r>
-        <w:t xml:space="preserve"> B), the ranker will place A above B regardless of the absolute probability values</w:t>
+        <w:t>, pointwise approaches work well in practice because ranking only requires monotonic scores: if P(click|item A) &gt; P(click|item B), the ranker will place A above B regardless of the absolute probability values</w:t>
       </w:r>
     </w:p>
     <w:p>
@@ -240,36 +224,34 @@
           <w:szCs w:val="20"/>
         </w:rPr>
         <w:br/>
-        <w:t xml:space="preserve">import </w:t>
-      </w:r>
-      <w:proofErr w:type="spellStart"/>
+        <w:t>import xgboost as xgb</w:t>
+      </w:r>
       <w:r>
         <w:rPr>
           <w:rFonts w:ascii="Consolas" w:hAnsi="Consolas" w:cs="Consolas"/>
           <w:sz w:val="20"/>
           <w:szCs w:val="20"/>
         </w:rPr>
-        <w:t>xgboost</w:t>
-      </w:r>
-      <w:proofErr w:type="spellEnd"/>
+        <w:br/>
+      </w:r>
       <w:r>
         <w:rPr>
           <w:rFonts w:ascii="Consolas" w:hAnsi="Consolas" w:cs="Consolas"/>
           <w:sz w:val="20"/>
           <w:szCs w:val="20"/>
         </w:rPr>
-        <w:t xml:space="preserve"> as </w:t>
-      </w:r>
-      <w:proofErr w:type="spellStart"/>
+        <w:br/>
+        <w:t>model = xgb.XGBClassifier(</w:t>
+      </w:r>
       <w:r>
         <w:rPr>
           <w:rFonts w:ascii="Consolas" w:hAnsi="Consolas" w:cs="Consolas"/>
           <w:sz w:val="20"/>
           <w:szCs w:val="20"/>
         </w:rPr>
-        <w:t>xgb</w:t>
-      </w:r>
-      <w:proofErr w:type="spellEnd"/>
+        <w:br/>
+        <w:t xml:space="preserve">    objective='binary:logistic',   # Pointwise: independent P(click) per item</w:t>
+      </w:r>
       <w:r>
         <w:rPr>
           <w:rFonts w:ascii="Consolas" w:hAnsi="Consolas" w:cs="Consolas"/>
@@ -277,6 +259,7 @@
           <w:szCs w:val="20"/>
         </w:rPr>
         <w:br/>
+        <w:t xml:space="preserve">    eval_metric='auc',</w:t>
       </w:r>
       <w:r>
         <w:rPr>
@@ -285,160 +268,7 @@
           <w:szCs w:val="20"/>
         </w:rPr>
         <w:br/>
-        <w:t xml:space="preserve">model = </w:t>
-      </w:r>
-      <w:proofErr w:type="spellStart"/>
-      <w:r>
-        <w:rPr>
-          <w:rFonts w:ascii="Consolas" w:hAnsi="Consolas" w:cs="Consolas"/>
-          <w:sz w:val="20"/>
-          <w:szCs w:val="20"/>
-        </w:rPr>
-        <w:t>xgb.XGBClassifier</w:t>
-      </w:r>
-      <w:proofErr w:type="spellEnd"/>
-      <w:r>
-        <w:rPr>
-          <w:rFonts w:ascii="Consolas" w:hAnsi="Consolas" w:cs="Consolas"/>
-          <w:sz w:val="20"/>
-          <w:szCs w:val="20"/>
-        </w:rPr>
-        <w:t>(</w:t>
-      </w:r>
-      <w:r>
-        <w:rPr>
-          <w:rFonts w:ascii="Consolas" w:hAnsi="Consolas" w:cs="Consolas"/>
-          <w:sz w:val="20"/>
-          <w:szCs w:val="20"/>
-        </w:rPr>
-        <w:br/>
-        <w:t xml:space="preserve">    objective='</w:t>
-      </w:r>
-      <w:proofErr w:type="spellStart"/>
-      <w:r>
-        <w:rPr>
-          <w:rFonts w:ascii="Consolas" w:hAnsi="Consolas" w:cs="Consolas"/>
-          <w:sz w:val="20"/>
-          <w:szCs w:val="20"/>
-        </w:rPr>
-        <w:t>binary:logistic</w:t>
-      </w:r>
-      <w:proofErr w:type="spellEnd"/>
-      <w:r>
-        <w:rPr>
-          <w:rFonts w:ascii="Consolas" w:hAnsi="Consolas" w:cs="Consolas"/>
-          <w:sz w:val="20"/>
-          <w:szCs w:val="20"/>
-        </w:rPr>
-        <w:t>',   # Pointwise: independent P(click) per item</w:t>
-      </w:r>
-      <w:r>
-        <w:rPr>
-          <w:rFonts w:ascii="Consolas" w:hAnsi="Consolas" w:cs="Consolas"/>
-          <w:sz w:val="20"/>
-          <w:szCs w:val="20"/>
-        </w:rPr>
-        <w:br/>
-        <w:t xml:space="preserve">    </w:t>
-      </w:r>
-      <w:proofErr w:type="spellStart"/>
-      <w:r>
-        <w:rPr>
-          <w:rFonts w:ascii="Consolas" w:hAnsi="Consolas" w:cs="Consolas"/>
-          <w:sz w:val="20"/>
-          <w:szCs w:val="20"/>
-        </w:rPr>
-        <w:t>eval_metric</w:t>
-      </w:r>
-      <w:proofErr w:type="spellEnd"/>
-      <w:r>
-        <w:rPr>
-          <w:rFonts w:ascii="Consolas" w:hAnsi="Consolas" w:cs="Consolas"/>
-          <w:sz w:val="20"/>
-          <w:szCs w:val="20"/>
-        </w:rPr>
-        <w:t>='</w:t>
-      </w:r>
-      <w:proofErr w:type="spellStart"/>
-      <w:r>
-        <w:rPr>
-          <w:rFonts w:ascii="Consolas" w:hAnsi="Consolas" w:cs="Consolas"/>
-          <w:sz w:val="20"/>
-          <w:szCs w:val="20"/>
-        </w:rPr>
-        <w:t>auc</w:t>
-      </w:r>
-      <w:proofErr w:type="spellEnd"/>
-      <w:r>
-        <w:rPr>
-          <w:rFonts w:ascii="Consolas" w:hAnsi="Consolas" w:cs="Consolas"/>
-          <w:sz w:val="20"/>
-          <w:szCs w:val="20"/>
-        </w:rPr>
-        <w:t>',</w:t>
-      </w:r>
-      <w:r>
-        <w:rPr>
-          <w:rFonts w:ascii="Consolas" w:hAnsi="Consolas" w:cs="Consolas"/>
-          <w:sz w:val="20"/>
-          <w:szCs w:val="20"/>
-        </w:rPr>
-        <w:br/>
-        <w:t xml:space="preserve">    </w:t>
-      </w:r>
-      <w:proofErr w:type="spellStart"/>
-      <w:r>
-        <w:rPr>
-          <w:rFonts w:ascii="Consolas" w:hAnsi="Consolas" w:cs="Consolas"/>
-          <w:sz w:val="20"/>
-          <w:szCs w:val="20"/>
-        </w:rPr>
-        <w:t>n_estimators</w:t>
-      </w:r>
-      <w:proofErr w:type="spellEnd"/>
-      <w:r>
-        <w:rPr>
-          <w:rFonts w:ascii="Consolas" w:hAnsi="Consolas" w:cs="Consolas"/>
-          <w:sz w:val="20"/>
-          <w:szCs w:val="20"/>
-        </w:rPr>
-        <w:t xml:space="preserve">=100, </w:t>
-      </w:r>
-      <w:proofErr w:type="spellStart"/>
-      <w:r>
-        <w:rPr>
-          <w:rFonts w:ascii="Consolas" w:hAnsi="Consolas" w:cs="Consolas"/>
-          <w:sz w:val="20"/>
-          <w:szCs w:val="20"/>
-        </w:rPr>
-        <w:t>max_depth</w:t>
-      </w:r>
-      <w:proofErr w:type="spellEnd"/>
-      <w:r>
-        <w:rPr>
-          <w:rFonts w:ascii="Consolas" w:hAnsi="Consolas" w:cs="Consolas"/>
-          <w:sz w:val="20"/>
-          <w:szCs w:val="20"/>
-        </w:rPr>
-        <w:t xml:space="preserve">=6, </w:t>
-      </w:r>
-      <w:proofErr w:type="spellStart"/>
-      <w:r>
-        <w:rPr>
-          <w:rFonts w:ascii="Consolas" w:hAnsi="Consolas" w:cs="Consolas"/>
-          <w:sz w:val="20"/>
-          <w:szCs w:val="20"/>
-        </w:rPr>
-        <w:t>learning_rate</w:t>
-      </w:r>
-      <w:proofErr w:type="spellEnd"/>
-      <w:r>
-        <w:rPr>
-          <w:rFonts w:ascii="Consolas" w:hAnsi="Consolas" w:cs="Consolas"/>
-          <w:sz w:val="20"/>
-          <w:szCs w:val="20"/>
-        </w:rPr>
-        <w:t>=0.1</w:t>
+        <w:t xml:space="preserve">    n_estimators=100, max_depth=6, learning_rate=0.1</w:t>
       </w:r>
       <w:r>
         <w:rPr>
@@ -456,114 +286,7 @@
           <w:szCs w:val="20"/>
         </w:rPr>
         <w:br/>
-      </w:r>
-      <w:proofErr w:type="spellStart"/>
-      <w:r>
-        <w:rPr>
-          <w:rFonts w:ascii="Consolas" w:hAnsi="Consolas" w:cs="Consolas"/>
-          <w:sz w:val="20"/>
-          <w:szCs w:val="20"/>
-        </w:rPr>
-        <w:t>model.fit</w:t>
-      </w:r>
-      <w:proofErr w:type="spellEnd"/>
-      <w:r>
-        <w:rPr>
-          <w:rFonts w:ascii="Consolas" w:hAnsi="Consolas" w:cs="Consolas"/>
-          <w:sz w:val="20"/>
-          <w:szCs w:val="20"/>
-        </w:rPr>
-        <w:t>(</w:t>
-      </w:r>
-      <w:proofErr w:type="spellStart"/>
-      <w:r>
-        <w:rPr>
-          <w:rFonts w:ascii="Consolas" w:hAnsi="Consolas" w:cs="Consolas"/>
-          <w:sz w:val="20"/>
-          <w:szCs w:val="20"/>
-        </w:rPr>
-        <w:t>X_train</w:t>
-      </w:r>
-      <w:proofErr w:type="spellEnd"/>
-      <w:r>
-        <w:rPr>
-          <w:rFonts w:ascii="Consolas" w:hAnsi="Consolas" w:cs="Consolas"/>
-          <w:sz w:val="20"/>
-          <w:szCs w:val="20"/>
-        </w:rPr>
-        <w:t xml:space="preserve">, </w:t>
-      </w:r>
-      <w:proofErr w:type="spellStart"/>
-      <w:r>
-        <w:rPr>
-          <w:rFonts w:ascii="Consolas" w:hAnsi="Consolas" w:cs="Consolas"/>
-          <w:sz w:val="20"/>
-          <w:szCs w:val="20"/>
-        </w:rPr>
-        <w:t>y_train</w:t>
-      </w:r>
-      <w:proofErr w:type="spellEnd"/>
-      <w:r>
-        <w:rPr>
-          <w:rFonts w:ascii="Consolas" w:hAnsi="Consolas" w:cs="Consolas"/>
-          <w:sz w:val="20"/>
-          <w:szCs w:val="20"/>
-        </w:rPr>
-        <w:t xml:space="preserve">, </w:t>
-      </w:r>
-      <w:proofErr w:type="spellStart"/>
-      <w:r>
-        <w:rPr>
-          <w:rFonts w:ascii="Consolas" w:hAnsi="Consolas" w:cs="Consolas"/>
-          <w:sz w:val="20"/>
-          <w:szCs w:val="20"/>
-        </w:rPr>
-        <w:t>eval_set</w:t>
-      </w:r>
-      <w:proofErr w:type="spellEnd"/>
-      <w:r>
-        <w:rPr>
-          <w:rFonts w:ascii="Consolas" w:hAnsi="Consolas" w:cs="Consolas"/>
-          <w:sz w:val="20"/>
-          <w:szCs w:val="20"/>
-        </w:rPr>
-        <w:t>=[(</w:t>
-      </w:r>
-      <w:proofErr w:type="spellStart"/>
-      <w:r>
-        <w:rPr>
-          <w:rFonts w:ascii="Consolas" w:hAnsi="Consolas" w:cs="Consolas"/>
-          <w:sz w:val="20"/>
-          <w:szCs w:val="20"/>
-        </w:rPr>
-        <w:t>X_val</w:t>
-      </w:r>
-      <w:proofErr w:type="spellEnd"/>
-      <w:r>
-        <w:rPr>
-          <w:rFonts w:ascii="Consolas" w:hAnsi="Consolas" w:cs="Consolas"/>
-          <w:sz w:val="20"/>
-          <w:szCs w:val="20"/>
-        </w:rPr>
-        <w:t xml:space="preserve">, </w:t>
-      </w:r>
-      <w:proofErr w:type="spellStart"/>
-      <w:r>
-        <w:rPr>
-          <w:rFonts w:ascii="Consolas" w:hAnsi="Consolas" w:cs="Consolas"/>
-          <w:sz w:val="20"/>
-          <w:szCs w:val="20"/>
-        </w:rPr>
-        <w:t>y_val</w:t>
-      </w:r>
-      <w:proofErr w:type="spellEnd"/>
-      <w:r>
-        <w:rPr>
-          <w:rFonts w:ascii="Consolas" w:hAnsi="Consolas" w:cs="Consolas"/>
-          <w:sz w:val="20"/>
-          <w:szCs w:val="20"/>
-        </w:rPr>
-        <w:t>)])</w:t>
+        <w:t>model.fit(X_train, y_train, eval_set=[(X_val, y_val)])</w:t>
       </w:r>
       <w:r>
         <w:rPr>
@@ -589,140 +312,16 @@
           <w:szCs w:val="20"/>
         </w:rPr>
         <w:br/>
-      </w:r>
-      <w:proofErr w:type="spellStart"/>
+        <w:t>proba = model.predict_proba(X_test)[:, 1]</w:t>
+      </w:r>
       <w:r>
         <w:rPr>
           <w:rFonts w:ascii="Consolas" w:hAnsi="Consolas" w:cs="Consolas"/>
           <w:sz w:val="20"/>
           <w:szCs w:val="20"/>
         </w:rPr>
-        <w:t>proba</w:t>
-      </w:r>
-      <w:proofErr w:type="spellEnd"/>
-      <w:r>
-        <w:rPr>
-          <w:rFonts w:ascii="Consolas" w:hAnsi="Consolas" w:cs="Consolas"/>
-          <w:sz w:val="20"/>
-          <w:szCs w:val="20"/>
-        </w:rPr>
-        <w:t xml:space="preserve"> = </w:t>
-      </w:r>
-      <w:proofErr w:type="spellStart"/>
-      <w:r>
-        <w:rPr>
-          <w:rFonts w:ascii="Consolas" w:hAnsi="Consolas" w:cs="Consolas"/>
-          <w:sz w:val="20"/>
-          <w:szCs w:val="20"/>
-        </w:rPr>
-        <w:t>model.predict_proba</w:t>
-      </w:r>
-      <w:proofErr w:type="spellEnd"/>
-      <w:r>
-        <w:rPr>
-          <w:rFonts w:ascii="Consolas" w:hAnsi="Consolas" w:cs="Consolas"/>
-          <w:sz w:val="20"/>
-          <w:szCs w:val="20"/>
-        </w:rPr>
-        <w:t>(</w:t>
-      </w:r>
-      <w:proofErr w:type="spellStart"/>
-      <w:r>
-        <w:rPr>
-          <w:rFonts w:ascii="Consolas" w:hAnsi="Consolas" w:cs="Consolas"/>
-          <w:sz w:val="20"/>
-          <w:szCs w:val="20"/>
-        </w:rPr>
-        <w:t>X_test</w:t>
-      </w:r>
-      <w:proofErr w:type="spellEnd"/>
-      <w:r>
-        <w:rPr>
-          <w:rFonts w:ascii="Consolas" w:hAnsi="Consolas" w:cs="Consolas"/>
-          <w:sz w:val="20"/>
-          <w:szCs w:val="20"/>
-        </w:rPr>
-        <w:t>)[:, 1]</w:t>
-      </w:r>
-      <w:r>
-        <w:rPr>
-          <w:rFonts w:ascii="Consolas" w:hAnsi="Consolas" w:cs="Consolas"/>
-          <w:sz w:val="20"/>
-          <w:szCs w:val="20"/>
-        </w:rPr>
         <w:br/>
-      </w:r>
-      <w:proofErr w:type="spellStart"/>
-      <w:r>
-        <w:rPr>
-          <w:rFonts w:ascii="Consolas" w:hAnsi="Consolas" w:cs="Consolas"/>
-          <w:sz w:val="20"/>
-          <w:szCs w:val="20"/>
-        </w:rPr>
-        <w:t>ranked_items</w:t>
-      </w:r>
-      <w:proofErr w:type="spellEnd"/>
-      <w:r>
-        <w:rPr>
-          <w:rFonts w:ascii="Consolas" w:hAnsi="Consolas" w:cs="Consolas"/>
-          <w:sz w:val="20"/>
-          <w:szCs w:val="20"/>
-        </w:rPr>
-        <w:t xml:space="preserve"> = </w:t>
-      </w:r>
-      <w:proofErr w:type="spellStart"/>
-      <w:r>
-        <w:rPr>
-          <w:rFonts w:ascii="Consolas" w:hAnsi="Consolas" w:cs="Consolas"/>
-          <w:sz w:val="20"/>
-          <w:szCs w:val="20"/>
-        </w:rPr>
-        <w:t>item_ids</w:t>
-      </w:r>
-      <w:proofErr w:type="spellEnd"/>
-      <w:r>
-        <w:rPr>
-          <w:rFonts w:ascii="Consolas" w:hAnsi="Consolas" w:cs="Consolas"/>
-          <w:sz w:val="20"/>
-          <w:szCs w:val="20"/>
-        </w:rPr>
-        <w:t>[</w:t>
-      </w:r>
-      <w:proofErr w:type="spellStart"/>
-      <w:r>
-        <w:rPr>
-          <w:rFonts w:ascii="Consolas" w:hAnsi="Consolas" w:cs="Consolas"/>
-          <w:sz w:val="20"/>
-          <w:szCs w:val="20"/>
-        </w:rPr>
-        <w:t>np.argsort</w:t>
-      </w:r>
-      <w:proofErr w:type="spellEnd"/>
-      <w:r>
-        <w:rPr>
-          <w:rFonts w:ascii="Consolas" w:hAnsi="Consolas" w:cs="Consolas"/>
-          <w:sz w:val="20"/>
-          <w:szCs w:val="20"/>
-        </w:rPr>
-        <w:t>(-</w:t>
-      </w:r>
-      <w:proofErr w:type="spellStart"/>
-      <w:r>
-        <w:rPr>
-          <w:rFonts w:ascii="Consolas" w:hAnsi="Consolas" w:cs="Consolas"/>
-          <w:sz w:val="20"/>
-          <w:szCs w:val="20"/>
-        </w:rPr>
-        <w:t>proba</w:t>
-      </w:r>
-      <w:proofErr w:type="spellEnd"/>
-      <w:r>
-        <w:rPr>
-          <w:rFonts w:ascii="Consolas" w:hAnsi="Consolas" w:cs="Consolas"/>
-          <w:sz w:val="20"/>
-          <w:szCs w:val="20"/>
-        </w:rPr>
-        <w:t>)]</w:t>
+        <w:t>ranked_items = item_ids[np.argsort(-proba)]</w:t>
       </w:r>
     </w:p>
     <w:p>
@@ -750,21 +349,12 @@
         </w:numPr>
         <w:spacing w:after="120" w:line="276" w:lineRule="auto"/>
       </w:pPr>
-      <w:proofErr w:type="spellStart"/>
       <w:r>
         <w:rPr>
           <w:b/>
           <w:bCs/>
         </w:rPr>
-        <w:t>RankNet</w:t>
-      </w:r>
-      <w:proofErr w:type="spellEnd"/>
-      <w:r>
-        <w:rPr>
-          <w:b/>
-          <w:bCs/>
-        </w:rPr>
-        <w:t xml:space="preserve">: </w:t>
+        <w:t xml:space="preserve">RankNet: </w:t>
       </w:r>
       <w:r>
         <w:t>Uses a logistic loss on score differences to learn pairwise preferences</w:t>
@@ -779,21 +369,12 @@
         </w:numPr>
         <w:spacing w:after="120" w:line="276" w:lineRule="auto"/>
       </w:pPr>
-      <w:proofErr w:type="spellStart"/>
       <w:r>
         <w:rPr>
           <w:b/>
           <w:bCs/>
         </w:rPr>
-        <w:t>LambdaRank</w:t>
-      </w:r>
-      <w:proofErr w:type="spellEnd"/>
-      <w:r>
-        <w:rPr>
-          <w:b/>
-          <w:bCs/>
-        </w:rPr>
-        <w:t xml:space="preserve">: </w:t>
+        <w:t xml:space="preserve">LambdaRank: </w:t>
       </w:r>
       <w:r>
         <w:t>Weights pairwise gradients by the change in NDCG that swapping two items would produce, effectively optimizing NDCG through pairwise comparisons</w:t>
@@ -808,72 +389,27 @@
         </w:numPr>
         <w:spacing w:after="120" w:line="276" w:lineRule="auto"/>
       </w:pPr>
-      <w:proofErr w:type="spellStart"/>
       <w:r>
         <w:rPr>
           <w:b/>
           <w:bCs/>
         </w:rPr>
-        <w:t>LambdaMART</w:t>
-      </w:r>
-      <w:proofErr w:type="spellEnd"/>
-      <w:r>
-        <w:rPr>
-          <w:b/>
-          <w:bCs/>
-        </w:rPr>
-        <w:t xml:space="preserve">: </w:t>
-      </w:r>
-      <w:r>
-        <w:t xml:space="preserve">Combines </w:t>
-      </w:r>
-      <w:proofErr w:type="spellStart"/>
-      <w:r>
-        <w:t>LambdaRank</w:t>
-      </w:r>
-      <w:proofErr w:type="spellEnd"/>
-      <w:r>
-        <w:t xml:space="preserve"> with gradient boosted trees (MART), widely considered the gold standard for feature-based ranking</w:t>
+        <w:t xml:space="preserve">LambdaMART: </w:t>
+      </w:r>
+      <w:r>
+        <w:t>Combines LambdaRank with gradient boosted trees (MART), widely considered the gold standard for feature-based ranking</w:t>
       </w:r>
     </w:p>
     <w:p>
       <w:pPr>
         <w:spacing w:after="200" w:line="276" w:lineRule="auto"/>
       </w:pPr>
-      <w:proofErr w:type="spellStart"/>
       <w:r>
         <w:lastRenderedPageBreak/>
-        <w:t>LambdaMART</w:t>
-      </w:r>
-      <w:proofErr w:type="spellEnd"/>
-      <w:r>
-        <w:t xml:space="preserve"> deserves a deeper look because it underpins </w:t>
-      </w:r>
-      <w:proofErr w:type="spellStart"/>
-      <w:r>
-        <w:t>XGBoost’s</w:t>
-      </w:r>
-      <w:proofErr w:type="spellEnd"/>
-      <w:r>
-        <w:t xml:space="preserve"> </w:t>
-      </w:r>
-      <w:proofErr w:type="spellStart"/>
-      <w:proofErr w:type="gramStart"/>
-      <w:r>
-        <w:t>rank:pairwise</w:t>
-      </w:r>
-      <w:proofErr w:type="spellEnd"/>
-      <w:proofErr w:type="gramEnd"/>
-      <w:r>
-        <w:t xml:space="preserve"> objective that we use in </w:t>
-      </w:r>
-      <w:r>
-        <w:t xml:space="preserve">the companion </w:t>
-      </w:r>
-      <w:proofErr w:type="spellStart"/>
-      <w:proofErr w:type="gramStart"/>
-      <w:r>
-        <w:t>exercises</w:t>
+        <w:t xml:space="preserve">LambdaMART deserves a deeper look because it underpins XGBoost’s rank:pairwise objective that we use in </w:t>
+      </w:r>
+      <w:r>
+        <w:t>the companion exercises</w:t>
       </w:r>
       <w:r>
         <w:t>.</w:t>
@@ -882,20 +418,7 @@
         <w:t>R</w:t>
       </w:r>
       <w:r>
-        <w:t>ather</w:t>
-      </w:r>
-      <w:proofErr w:type="spellEnd"/>
-      <w:proofErr w:type="gramEnd"/>
-      <w:r>
-        <w:t xml:space="preserve"> than defining a loss function and deriving gradients from it, </w:t>
-      </w:r>
-      <w:proofErr w:type="spellStart"/>
-      <w:r>
-        <w:t>LambdaMART</w:t>
-      </w:r>
-      <w:proofErr w:type="spellEnd"/>
-      <w:r>
-        <w:t xml:space="preserve"> defines the gradients directly.</w:t>
+        <w:t>ather than defining a loss function and deriving gradients from it, LambdaMART defines the gradients directly.</w:t>
       </w:r>
     </w:p>
     <w:p>
@@ -903,68 +426,19 @@
         <w:spacing w:after="200" w:line="276" w:lineRule="auto"/>
       </w:pPr>
       <w:r>
-        <w:t xml:space="preserve">Traditional approaches to optimizing NDCG face a fundamental obstacle: NDCG is a step function of the ranking permutation, so it has zero gradients almost everywhere. </w:t>
-      </w:r>
-      <w:proofErr w:type="spellStart"/>
-      <w:r>
-        <w:t>LambdaRank</w:t>
-      </w:r>
-      <w:proofErr w:type="spellEnd"/>
-      <w:r>
-        <w:t xml:space="preserve"> sidesteps this by defining pseudo-gradients (called lambdas) for each document pair:</w:t>
+        <w:t>Traditional approaches to optimizing NDCG face a fundamental obstacle: NDCG is a step function of the ranking permutation, so it has zero gradients almost everywhere. LambdaRank sidesteps this by defining pseudo-gradients (called lambdas) for each document pair:</w:t>
       </w:r>
     </w:p>
     <w:p>
       <w:pPr>
         <w:spacing w:after="200" w:line="276" w:lineRule="auto"/>
       </w:pPr>
-      <w:proofErr w:type="spellStart"/>
       <w:r>
         <w:rPr>
           <w:i/>
           <w:iCs/>
         </w:rPr>
-        <w:t>lambda_ij</w:t>
-      </w:r>
-      <w:proofErr w:type="spellEnd"/>
-      <w:r>
-        <w:rPr>
-          <w:i/>
-          <w:iCs/>
-        </w:rPr>
-        <w:t xml:space="preserve"> = </w:t>
-      </w:r>
-      <w:proofErr w:type="spellStart"/>
-      <w:r>
-        <w:rPr>
-          <w:i/>
-          <w:iCs/>
-        </w:rPr>
-        <w:t>sigma_ij</w:t>
-      </w:r>
-      <w:proofErr w:type="spellEnd"/>
-      <w:r>
-        <w:rPr>
-          <w:i/>
-          <w:iCs/>
-        </w:rPr>
-        <w:t xml:space="preserve"> * |</w:t>
-      </w:r>
-      <w:proofErr w:type="spellStart"/>
-      <w:r>
-        <w:rPr>
-          <w:i/>
-          <w:iCs/>
-        </w:rPr>
-        <w:t>delta_NDCG_ij</w:t>
-      </w:r>
-      <w:proofErr w:type="spellEnd"/>
-      <w:r>
-        <w:rPr>
-          <w:i/>
-          <w:iCs/>
-        </w:rPr>
-        <w:t>|</w:t>
+        <w:t>lambda_ij = sigma_ij * |delta_NDCG_ij|</w:t>
       </w:r>
     </w:p>
     <w:p>
@@ -972,47 +446,7 @@
         <w:spacing w:after="200" w:line="276" w:lineRule="auto"/>
       </w:pPr>
       <w:r>
-        <w:t xml:space="preserve">where </w:t>
-      </w:r>
-      <w:proofErr w:type="spellStart"/>
-      <w:r>
-        <w:t>sigma_ij</w:t>
-      </w:r>
-      <w:proofErr w:type="spellEnd"/>
-      <w:r>
-        <w:t xml:space="preserve"> is the logistic gradient for the pair (</w:t>
-      </w:r>
-      <w:proofErr w:type="spellStart"/>
-      <w:r>
-        <w:t>i</w:t>
-      </w:r>
-      <w:proofErr w:type="spellEnd"/>
-      <w:r>
-        <w:t>, j) based on their score difference, and |</w:t>
-      </w:r>
-      <w:proofErr w:type="spellStart"/>
-      <w:r>
-        <w:t>delta_NDCG_ij</w:t>
-      </w:r>
-      <w:proofErr w:type="spellEnd"/>
-      <w:r>
-        <w:t xml:space="preserve">| is the absolute change in NDCG that would result from swapping items </w:t>
-      </w:r>
-      <w:proofErr w:type="spellStart"/>
-      <w:r>
-        <w:t>i</w:t>
-      </w:r>
-      <w:proofErr w:type="spellEnd"/>
-      <w:r>
-        <w:t xml:space="preserve"> and j in the current ranking. The logistic component provides the direction (which item should rank higher), while the NDCG delta provides the magnitude (how much the ranking metric cares about this </w:t>
-      </w:r>
-      <w:proofErr w:type="gramStart"/>
-      <w:r>
-        <w:t>particular swap</w:t>
-      </w:r>
-      <w:proofErr w:type="gramEnd"/>
-      <w:r>
-        <w:t>).</w:t>
+        <w:t>where sigma_ij is the logistic gradient for the pair (i, j) based on their score difference, and |delta_NDCG_ij| is the absolute change in NDCG that would result from swapping items i and j in the current ranking. The logistic component provides the direction (which item should rank higher), while the NDCG delta provides the magnitude (how much the ranking metric cares about this particular swap).</w:t>
       </w:r>
     </w:p>
     <w:p>
@@ -1020,44 +454,15 @@
         <w:spacing w:after="200" w:line="276" w:lineRule="auto"/>
       </w:pPr>
       <w:r>
-        <w:t xml:space="preserve">This weighting is what makes </w:t>
-      </w:r>
-      <w:proofErr w:type="spellStart"/>
-      <w:r>
-        <w:t>LambdaMART</w:t>
-      </w:r>
-      <w:proofErr w:type="spellEnd"/>
-      <w:r>
-        <w:t xml:space="preserve"> effectively listwise despite using pairwise comparisons: swapping two items near the top of the list produces a larger </w:t>
-      </w:r>
-      <w:proofErr w:type="spellStart"/>
-      <w:r>
-        <w:t>delta_NDCG</w:t>
-      </w:r>
-      <w:proofErr w:type="spellEnd"/>
-      <w:r>
-        <w:t xml:space="preserve"> than swapping two items at position 50 and 51, so the model focuses its capacity on getting the top of the ranking right.</w:t>
+        <w:t>This weighting is what makes LambdaMART effectively listwise despite using pairwise comparisons: swapping two items near the top of the list produces a larger delta_NDCG than swapping two items at position 50 and 51, so the model focuses its capacity on getting the top of the ranking right.</w:t>
       </w:r>
     </w:p>
     <w:p>
       <w:pPr>
         <w:spacing w:after="200" w:line="276" w:lineRule="auto"/>
       </w:pPr>
-      <w:proofErr w:type="spellStart"/>
-      <w:r>
-        <w:t>LambdaMART</w:t>
-      </w:r>
-      <w:proofErr w:type="spellEnd"/>
-      <w:r>
-        <w:t xml:space="preserve"> combines these lambda gradients with gradient boosted decision trees (Multiple Additive Regression Trees, or MART). At each boosting iteration, a new tree </w:t>
-      </w:r>
-      <w:proofErr w:type="gramStart"/>
-      <w:r>
-        <w:t>is fit to</w:t>
-      </w:r>
-      <w:proofErr w:type="gramEnd"/>
-      <w:r>
-        <w:t xml:space="preserve"> the lambda gradients, refining the model’s ranking. The result is a model that optimizes NDCG indirectly but effectively, without ever defining a differentiable loss function.</w:t>
+      <w:r>
+        <w:t>LambdaMART combines these lambda gradients with gradient boosted decision trees (Multiple Additive Regression Trees, or MART). At each boosting iteration, a new tree is fit to the lambda gradients, refining the model’s ranking. The result is a model that optimizes NDCG indirectly but effectively, without ever defining a differentiable loss function.</w:t>
       </w:r>
     </w:p>
     <w:p>
@@ -1065,39 +470,10 @@
         <w:spacing w:after="200" w:line="276" w:lineRule="auto"/>
       </w:pPr>
       <w:r>
-        <w:t xml:space="preserve">In the tutorial accompanying this chapter, </w:t>
-      </w:r>
-      <w:proofErr w:type="spellStart"/>
-      <w:r>
-        <w:t>LambdaMART</w:t>
-      </w:r>
-      <w:proofErr w:type="spellEnd"/>
-      <w:r>
-        <w:t xml:space="preserve"> is implemented through the </w:t>
-      </w:r>
-      <w:proofErr w:type="spellStart"/>
-      <w:proofErr w:type="gramStart"/>
-      <w:r>
-        <w:t>XGBRanker</w:t>
-      </w:r>
-      <w:proofErr w:type="spellEnd"/>
-      <w:r>
-        <w:t>(</w:t>
-      </w:r>
-      <w:proofErr w:type="gramEnd"/>
-      <w:r>
-        <w:t>)</w:t>
-      </w:r>
-      <w:r>
-        <w:t xml:space="preserve">. If you are using the </w:t>
-      </w:r>
-      <w:proofErr w:type="spellStart"/>
-      <w:r>
-        <w:t>dmlc</w:t>
-      </w:r>
-      <w:proofErr w:type="spellEnd"/>
-      <w:r>
-        <w:t xml:space="preserve"> library, the core </w:t>
+        <w:t>In the tutorial accompanying this chapter, LambdaMART is implemented through the XGBRanker()</w:t>
+      </w:r>
+      <w:r>
+        <w:t xml:space="preserve">. If you are using the dmlc library, the core </w:t>
       </w:r>
       <w:r>
         <w:t>logic is as follows:</w:t>
@@ -1120,170 +496,34 @@
           <w:sz w:val="20"/>
           <w:szCs w:val="20"/>
         </w:rPr>
-        <w:t xml:space="preserve"># Pairwise approach: </w:t>
-      </w:r>
-      <w:proofErr w:type="spellStart"/>
+        <w:t># Pairwise approach: LambdaMART via XGBRanker</w:t>
+      </w:r>
       <w:r>
         <w:rPr>
           <w:rFonts w:ascii="Consolas" w:hAnsi="Consolas" w:cs="Consolas"/>
           <w:sz w:val="20"/>
           <w:szCs w:val="20"/>
         </w:rPr>
-        <w:t>LambdaMART</w:t>
-      </w:r>
-      <w:proofErr w:type="spellEnd"/>
+        <w:br/>
+        <w:t>model = xgb.XGBRanker(</w:t>
+      </w:r>
       <w:r>
         <w:rPr>
           <w:rFonts w:ascii="Consolas" w:hAnsi="Consolas" w:cs="Consolas"/>
           <w:sz w:val="20"/>
           <w:szCs w:val="20"/>
         </w:rPr>
-        <w:t xml:space="preserve"> via </w:t>
-      </w:r>
-      <w:proofErr w:type="spellStart"/>
+        <w:br/>
+        <w:t xml:space="preserve">    objective='rank:pairwise',     # LambdaMART: optimizes NDCG via pairwise lambdas</w:t>
+      </w:r>
       <w:r>
         <w:rPr>
           <w:rFonts w:ascii="Consolas" w:hAnsi="Consolas" w:cs="Consolas"/>
           <w:sz w:val="20"/>
           <w:szCs w:val="20"/>
         </w:rPr>
-        <w:t>XGBRanker</w:t>
-      </w:r>
-      <w:proofErr w:type="spellEnd"/>
-      <w:r>
-        <w:rPr>
-          <w:rFonts w:ascii="Consolas" w:hAnsi="Consolas" w:cs="Consolas"/>
-          <w:sz w:val="20"/>
-          <w:szCs w:val="20"/>
-        </w:rPr>
         <w:br/>
-        <w:t xml:space="preserve">model = </w:t>
-      </w:r>
-      <w:proofErr w:type="spellStart"/>
-      <w:r>
-        <w:rPr>
-          <w:rFonts w:ascii="Consolas" w:hAnsi="Consolas" w:cs="Consolas"/>
-          <w:sz w:val="20"/>
-          <w:szCs w:val="20"/>
-        </w:rPr>
-        <w:t>xgb.XGBRanker</w:t>
-      </w:r>
-      <w:proofErr w:type="spellEnd"/>
-      <w:r>
-        <w:rPr>
-          <w:rFonts w:ascii="Consolas" w:hAnsi="Consolas" w:cs="Consolas"/>
-          <w:sz w:val="20"/>
-          <w:szCs w:val="20"/>
-        </w:rPr>
-        <w:t>(</w:t>
-      </w:r>
-      <w:r>
-        <w:rPr>
-          <w:rFonts w:ascii="Consolas" w:hAnsi="Consolas" w:cs="Consolas"/>
-          <w:sz w:val="20"/>
-          <w:szCs w:val="20"/>
-        </w:rPr>
-        <w:br/>
-        <w:t xml:space="preserve">    objective='</w:t>
-      </w:r>
-      <w:proofErr w:type="spellStart"/>
-      <w:r>
-        <w:rPr>
-          <w:rFonts w:ascii="Consolas" w:hAnsi="Consolas" w:cs="Consolas"/>
-          <w:sz w:val="20"/>
-          <w:szCs w:val="20"/>
-        </w:rPr>
-        <w:t>rank:pairwise</w:t>
-      </w:r>
-      <w:proofErr w:type="spellEnd"/>
-      <w:r>
-        <w:rPr>
-          <w:rFonts w:ascii="Consolas" w:hAnsi="Consolas" w:cs="Consolas"/>
-          <w:sz w:val="20"/>
-          <w:szCs w:val="20"/>
-        </w:rPr>
-        <w:t xml:space="preserve">',     # </w:t>
-      </w:r>
-      <w:proofErr w:type="spellStart"/>
-      <w:r>
-        <w:rPr>
-          <w:rFonts w:ascii="Consolas" w:hAnsi="Consolas" w:cs="Consolas"/>
-          <w:sz w:val="20"/>
-          <w:szCs w:val="20"/>
-        </w:rPr>
-        <w:t>LambdaMART</w:t>
-      </w:r>
-      <w:proofErr w:type="spellEnd"/>
-      <w:r>
-        <w:rPr>
-          <w:rFonts w:ascii="Consolas" w:hAnsi="Consolas" w:cs="Consolas"/>
-          <w:sz w:val="20"/>
-          <w:szCs w:val="20"/>
-        </w:rPr>
-        <w:t>: optimizes NDCG via pairwise lambdas</w:t>
-      </w:r>
-      <w:r>
-        <w:rPr>
-          <w:rFonts w:ascii="Consolas" w:hAnsi="Consolas" w:cs="Consolas"/>
-          <w:sz w:val="20"/>
-          <w:szCs w:val="20"/>
-        </w:rPr>
-        <w:br/>
-        <w:t xml:space="preserve">    </w:t>
-      </w:r>
-      <w:proofErr w:type="spellStart"/>
-      <w:r>
-        <w:rPr>
-          <w:rFonts w:ascii="Consolas" w:hAnsi="Consolas" w:cs="Consolas"/>
-          <w:sz w:val="20"/>
-          <w:szCs w:val="20"/>
-        </w:rPr>
-        <w:t>n_estimators</w:t>
-      </w:r>
-      <w:proofErr w:type="spellEnd"/>
-      <w:r>
-        <w:rPr>
-          <w:rFonts w:ascii="Consolas" w:hAnsi="Consolas" w:cs="Consolas"/>
-          <w:sz w:val="20"/>
-          <w:szCs w:val="20"/>
-        </w:rPr>
-        <w:t xml:space="preserve">=100, </w:t>
-      </w:r>
-      <w:proofErr w:type="spellStart"/>
-      <w:r>
-        <w:rPr>
-          <w:rFonts w:ascii="Consolas" w:hAnsi="Consolas" w:cs="Consolas"/>
-          <w:sz w:val="20"/>
-          <w:szCs w:val="20"/>
-        </w:rPr>
-        <w:t>max_depth</w:t>
-      </w:r>
-      <w:proofErr w:type="spellEnd"/>
-      <w:r>
-        <w:rPr>
-          <w:rFonts w:ascii="Consolas" w:hAnsi="Consolas" w:cs="Consolas"/>
-          <w:sz w:val="20"/>
-          <w:szCs w:val="20"/>
-        </w:rPr>
-        <w:t xml:space="preserve">=6, </w:t>
-      </w:r>
-      <w:proofErr w:type="spellStart"/>
-      <w:r>
-        <w:rPr>
-          <w:rFonts w:ascii="Consolas" w:hAnsi="Consolas" w:cs="Consolas"/>
-          <w:sz w:val="20"/>
-          <w:szCs w:val="20"/>
-        </w:rPr>
-        <w:t>learning_rate</w:t>
-      </w:r>
-      <w:proofErr w:type="spellEnd"/>
-      <w:r>
-        <w:rPr>
-          <w:rFonts w:ascii="Consolas" w:hAnsi="Consolas" w:cs="Consolas"/>
-          <w:sz w:val="20"/>
-          <w:szCs w:val="20"/>
-        </w:rPr>
-        <w:t>=0.1</w:t>
+        <w:t xml:space="preserve">    n_estimators=100, max_depth=6, learning_rate=0.1</w:t>
       </w:r>
       <w:r>
         <w:rPr>
@@ -1319,177 +559,16 @@
           <w:szCs w:val="20"/>
         </w:rPr>
         <w:br/>
-      </w:r>
-      <w:proofErr w:type="spellStart"/>
+        <w:t>model.fit(X_train, y_train, group=train_groups,</w:t>
+      </w:r>
       <w:r>
         <w:rPr>
           <w:rFonts w:ascii="Consolas" w:hAnsi="Consolas" w:cs="Consolas"/>
           <w:sz w:val="20"/>
           <w:szCs w:val="20"/>
         </w:rPr>
-        <w:t>model.fit</w:t>
-      </w:r>
-      <w:proofErr w:type="spellEnd"/>
-      <w:r>
-        <w:rPr>
-          <w:rFonts w:ascii="Consolas" w:hAnsi="Consolas" w:cs="Consolas"/>
-          <w:sz w:val="20"/>
-          <w:szCs w:val="20"/>
-        </w:rPr>
-        <w:t>(</w:t>
-      </w:r>
-      <w:proofErr w:type="spellStart"/>
-      <w:r>
-        <w:rPr>
-          <w:rFonts w:ascii="Consolas" w:hAnsi="Consolas" w:cs="Consolas"/>
-          <w:sz w:val="20"/>
-          <w:szCs w:val="20"/>
-        </w:rPr>
-        <w:t>X_train</w:t>
-      </w:r>
-      <w:proofErr w:type="spellEnd"/>
-      <w:r>
-        <w:rPr>
-          <w:rFonts w:ascii="Consolas" w:hAnsi="Consolas" w:cs="Consolas"/>
-          <w:sz w:val="20"/>
-          <w:szCs w:val="20"/>
-        </w:rPr>
-        <w:t xml:space="preserve">, </w:t>
-      </w:r>
-      <w:proofErr w:type="spellStart"/>
-      <w:r>
-        <w:rPr>
-          <w:rFonts w:ascii="Consolas" w:hAnsi="Consolas" w:cs="Consolas"/>
-          <w:sz w:val="20"/>
-          <w:szCs w:val="20"/>
-        </w:rPr>
-        <w:t>y_train</w:t>
-      </w:r>
-      <w:proofErr w:type="spellEnd"/>
-      <w:r>
-        <w:rPr>
-          <w:rFonts w:ascii="Consolas" w:hAnsi="Consolas" w:cs="Consolas"/>
-          <w:sz w:val="20"/>
-          <w:szCs w:val="20"/>
-        </w:rPr>
-        <w:t>, group=</w:t>
-      </w:r>
-      <w:proofErr w:type="spellStart"/>
-      <w:r>
-        <w:rPr>
-          <w:rFonts w:ascii="Consolas" w:hAnsi="Consolas" w:cs="Consolas"/>
-          <w:sz w:val="20"/>
-          <w:szCs w:val="20"/>
-        </w:rPr>
-        <w:t>train_groups</w:t>
-      </w:r>
-      <w:proofErr w:type="spellEnd"/>
-      <w:r>
-        <w:rPr>
-          <w:rFonts w:ascii="Consolas" w:hAnsi="Consolas" w:cs="Consolas"/>
-          <w:sz w:val="20"/>
-          <w:szCs w:val="20"/>
-        </w:rPr>
-        <w:t>,</w:t>
-      </w:r>
-      <w:r>
-        <w:rPr>
-          <w:rFonts w:ascii="Consolas" w:hAnsi="Consolas" w:cs="Consolas"/>
-          <w:sz w:val="20"/>
-          <w:szCs w:val="20"/>
-        </w:rPr>
         <w:br/>
-        <w:t xml:space="preserve">          </w:t>
-      </w:r>
-      <w:proofErr w:type="spellStart"/>
-      <w:r>
-        <w:rPr>
-          <w:rFonts w:ascii="Consolas" w:hAnsi="Consolas" w:cs="Consolas"/>
-          <w:sz w:val="20"/>
-          <w:szCs w:val="20"/>
-        </w:rPr>
-        <w:t>eval_set</w:t>
-      </w:r>
-      <w:proofErr w:type="spellEnd"/>
-      <w:r>
-        <w:rPr>
-          <w:rFonts w:ascii="Consolas" w:hAnsi="Consolas" w:cs="Consolas"/>
-          <w:sz w:val="20"/>
-          <w:szCs w:val="20"/>
-        </w:rPr>
-        <w:t>=[(</w:t>
-      </w:r>
-      <w:proofErr w:type="spellStart"/>
-      <w:r>
-        <w:rPr>
-          <w:rFonts w:ascii="Consolas" w:hAnsi="Consolas" w:cs="Consolas"/>
-          <w:sz w:val="20"/>
-          <w:szCs w:val="20"/>
-        </w:rPr>
-        <w:t>X_test</w:t>
-      </w:r>
-      <w:proofErr w:type="spellEnd"/>
-      <w:r>
-        <w:rPr>
-          <w:rFonts w:ascii="Consolas" w:hAnsi="Consolas" w:cs="Consolas"/>
-          <w:sz w:val="20"/>
-          <w:szCs w:val="20"/>
-        </w:rPr>
-        <w:t xml:space="preserve">, </w:t>
-      </w:r>
-      <w:proofErr w:type="spellStart"/>
-      <w:r>
-        <w:rPr>
-          <w:rFonts w:ascii="Consolas" w:hAnsi="Consolas" w:cs="Consolas"/>
-          <w:sz w:val="20"/>
-          <w:szCs w:val="20"/>
-        </w:rPr>
-        <w:t>y_test</w:t>
-      </w:r>
-      <w:proofErr w:type="spellEnd"/>
-      <w:r>
-        <w:rPr>
-          <w:rFonts w:ascii="Consolas" w:hAnsi="Consolas" w:cs="Consolas"/>
-          <w:sz w:val="20"/>
-          <w:szCs w:val="20"/>
-        </w:rPr>
-        <w:t xml:space="preserve">)], </w:t>
-      </w:r>
-      <w:proofErr w:type="spellStart"/>
-      <w:r>
-        <w:rPr>
-          <w:rFonts w:ascii="Consolas" w:hAnsi="Consolas" w:cs="Consolas"/>
-          <w:sz w:val="20"/>
-          <w:szCs w:val="20"/>
-        </w:rPr>
-        <w:t>eval_group</w:t>
-      </w:r>
-      <w:proofErr w:type="spellEnd"/>
-      <w:r>
-        <w:rPr>
-          <w:rFonts w:ascii="Consolas" w:hAnsi="Consolas" w:cs="Consolas"/>
-          <w:sz w:val="20"/>
-          <w:szCs w:val="20"/>
-        </w:rPr>
-        <w:t>=[</w:t>
-      </w:r>
-      <w:proofErr w:type="spellStart"/>
-      <w:r>
-        <w:rPr>
-          <w:rFonts w:ascii="Consolas" w:hAnsi="Consolas" w:cs="Consolas"/>
-          <w:sz w:val="20"/>
-          <w:szCs w:val="20"/>
-        </w:rPr>
-        <w:t>test_groups</w:t>
-      </w:r>
-      <w:proofErr w:type="spellEnd"/>
-      <w:r>
-        <w:rPr>
-          <w:rFonts w:ascii="Consolas" w:hAnsi="Consolas" w:cs="Consolas"/>
-          <w:sz w:val="20"/>
-          <w:szCs w:val="20"/>
-        </w:rPr>
-        <w:t>])</w:t>
+        <w:t xml:space="preserve">          eval_set=[(X_test, y_test)], eval_group=[test_groups])</w:t>
       </w:r>
       <w:r>
         <w:rPr>
@@ -1515,105 +594,16 @@
           <w:szCs w:val="20"/>
         </w:rPr>
         <w:br/>
-        <w:t xml:space="preserve">scores = </w:t>
-      </w:r>
-      <w:proofErr w:type="spellStart"/>
+        <w:t>scores = model.predict(X_test)</w:t>
+      </w:r>
       <w:r>
         <w:rPr>
           <w:rFonts w:ascii="Consolas" w:hAnsi="Consolas" w:cs="Consolas"/>
           <w:sz w:val="20"/>
           <w:szCs w:val="20"/>
         </w:rPr>
-        <w:t>model.predict</w:t>
-      </w:r>
-      <w:proofErr w:type="spellEnd"/>
-      <w:r>
-        <w:rPr>
-          <w:rFonts w:ascii="Consolas" w:hAnsi="Consolas" w:cs="Consolas"/>
-          <w:sz w:val="20"/>
-          <w:szCs w:val="20"/>
-        </w:rPr>
-        <w:t>(</w:t>
-      </w:r>
-      <w:proofErr w:type="spellStart"/>
-      <w:r>
-        <w:rPr>
-          <w:rFonts w:ascii="Consolas" w:hAnsi="Consolas" w:cs="Consolas"/>
-          <w:sz w:val="20"/>
-          <w:szCs w:val="20"/>
-        </w:rPr>
-        <w:t>X_test</w:t>
-      </w:r>
-      <w:proofErr w:type="spellEnd"/>
-      <w:r>
-        <w:rPr>
-          <w:rFonts w:ascii="Consolas" w:hAnsi="Consolas" w:cs="Consolas"/>
-          <w:sz w:val="20"/>
-          <w:szCs w:val="20"/>
-        </w:rPr>
-        <w:t>)</w:t>
-      </w:r>
-      <w:r>
-        <w:rPr>
-          <w:rFonts w:ascii="Consolas" w:hAnsi="Consolas" w:cs="Consolas"/>
-          <w:sz w:val="20"/>
-          <w:szCs w:val="20"/>
-        </w:rPr>
         <w:br/>
-      </w:r>
-      <w:proofErr w:type="spellStart"/>
-      <w:r>
-        <w:rPr>
-          <w:rFonts w:ascii="Consolas" w:hAnsi="Consolas" w:cs="Consolas"/>
-          <w:sz w:val="20"/>
-          <w:szCs w:val="20"/>
-        </w:rPr>
-        <w:t>ranked_items</w:t>
-      </w:r>
-      <w:proofErr w:type="spellEnd"/>
-      <w:r>
-        <w:rPr>
-          <w:rFonts w:ascii="Consolas" w:hAnsi="Consolas" w:cs="Consolas"/>
-          <w:sz w:val="20"/>
-          <w:szCs w:val="20"/>
-        </w:rPr>
-        <w:t xml:space="preserve"> = </w:t>
-      </w:r>
-      <w:proofErr w:type="spellStart"/>
-      <w:r>
-        <w:rPr>
-          <w:rFonts w:ascii="Consolas" w:hAnsi="Consolas" w:cs="Consolas"/>
-          <w:sz w:val="20"/>
-          <w:szCs w:val="20"/>
-        </w:rPr>
-        <w:t>item_ids</w:t>
-      </w:r>
-      <w:proofErr w:type="spellEnd"/>
-      <w:r>
-        <w:rPr>
-          <w:rFonts w:ascii="Consolas" w:hAnsi="Consolas" w:cs="Consolas"/>
-          <w:sz w:val="20"/>
-          <w:szCs w:val="20"/>
-        </w:rPr>
-        <w:t>[</w:t>
-      </w:r>
-      <w:proofErr w:type="spellStart"/>
-      <w:r>
-        <w:rPr>
-          <w:rFonts w:ascii="Consolas" w:hAnsi="Consolas" w:cs="Consolas"/>
-          <w:sz w:val="20"/>
-          <w:szCs w:val="20"/>
-        </w:rPr>
-        <w:t>np.argsort</w:t>
-      </w:r>
-      <w:proofErr w:type="spellEnd"/>
-      <w:r>
-        <w:rPr>
-          <w:rFonts w:ascii="Consolas" w:hAnsi="Consolas" w:cs="Consolas"/>
-          <w:sz w:val="20"/>
-          <w:szCs w:val="20"/>
-        </w:rPr>
-        <w:t>(-scores)]</w:t>
+        <w:t>ranked_items = item_ids[np.argsort(-scores)]</w:t>
       </w:r>
     </w:p>
     <w:p>
@@ -1628,37 +618,13 @@
         <w:t>nuance to keep in mind</w:t>
       </w:r>
       <w:r>
-        <w:t xml:space="preserve">: the pairwise constraint exists only during training. When forming the training data, all valid pairs within a query group must be constructed, requiring O(n^2) comparisons per group. At inference time, however, the trained model scores each candidate independently, just like a pointwise model. </w:t>
-      </w:r>
-      <w:proofErr w:type="spellStart"/>
-      <w:r>
-        <w:t>XGBoost’s</w:t>
-      </w:r>
-      <w:proofErr w:type="spellEnd"/>
-      <w:r>
-        <w:t xml:space="preserve"> </w:t>
-      </w:r>
-      <w:proofErr w:type="spellStart"/>
-      <w:r>
-        <w:t>LambdaMART</w:t>
-      </w:r>
-      <w:proofErr w:type="spellEnd"/>
-      <w:r>
-        <w:t xml:space="preserve"> implementation, for example, produces a single scalar score per item at inference</w:t>
+        <w:t>: the pairwise constraint exists only during training. When forming the training data, all valid pairs within a query group must be constructed, requiring O(n^2) comparisons per group. At inference time, however, the trained model scores each candidate independently, just like a pointwise model. XGBoost’s LambdaMART implementation, for example, produces a single scalar score per item at inference</w:t>
       </w:r>
       <w:r>
         <w:t>. T</w:t>
       </w:r>
       <w:r>
-        <w:t xml:space="preserve">he pairwise comparison was absorbed into the learned gradient structure during training. This makes pairwise models just as </w:t>
-      </w:r>
-      <w:proofErr w:type="gramStart"/>
-      <w:r>
-        <w:t>fast to serve</w:t>
-      </w:r>
-      <w:proofErr w:type="gramEnd"/>
-      <w:r>
-        <w:t xml:space="preserve"> as pointwise models. </w:t>
+        <w:t xml:space="preserve">he pairwise comparison was absorbed into the learned gradient structure during training. This makes pairwise models just as fast to serve as pointwise models. </w:t>
       </w:r>
     </w:p>
     <w:p>
@@ -1666,71 +632,13 @@
         <w:spacing w:after="200" w:line="276" w:lineRule="auto"/>
       </w:pPr>
       <w:r>
-        <w:t xml:space="preserve">Concretely, </w:t>
-      </w:r>
-      <w:proofErr w:type="spellStart"/>
-      <w:r>
-        <w:t>XGBoost's</w:t>
-      </w:r>
-      <w:proofErr w:type="spellEnd"/>
-      <w:r>
-        <w:t xml:space="preserve"> </w:t>
-      </w:r>
-      <w:proofErr w:type="spellStart"/>
-      <w:proofErr w:type="gramStart"/>
-      <w:r>
-        <w:t>rank:pairwise</w:t>
-      </w:r>
-      <w:proofErr w:type="spellEnd"/>
-      <w:proofErr w:type="gramEnd"/>
-      <w:r>
-        <w:t xml:space="preserve"> objective does not enumerate every possible pair within a query group, which would be prohibitive for large </w:t>
+        <w:t xml:space="preserve">Concretely, XGBoost's rank:pairwise objective does not enumerate every possible pair within a query group, which would be prohibitive for large </w:t>
       </w:r>
       <w:r>
         <w:t xml:space="preserve">candidate </w:t>
       </w:r>
       <w:r>
-        <w:t xml:space="preserve">groups. Instead, for each boosting round it samples a bounded number of candidate pairs per positive item. The modern </w:t>
-      </w:r>
-      <w:proofErr w:type="spellStart"/>
-      <w:r>
-        <w:t>LambdaRank</w:t>
-      </w:r>
-      <w:proofErr w:type="spellEnd"/>
-      <w:r>
-        <w:t xml:space="preserve"> API (controlled via the </w:t>
-      </w:r>
-      <w:proofErr w:type="spellStart"/>
-      <w:r>
-        <w:t>lambdarank_num_pair_per_sample</w:t>
-      </w:r>
-      <w:proofErr w:type="spellEnd"/>
-      <w:r>
-        <w:t xml:space="preserve"> and </w:t>
-      </w:r>
-      <w:proofErr w:type="spellStart"/>
-      <w:r>
-        <w:t>lambdarank_pair_method</w:t>
-      </w:r>
-      <w:proofErr w:type="spellEnd"/>
-      <w:r>
-        <w:t xml:space="preserve"> parameters, added in XGBoost 2.0; see the XGBoost Learning to Rank tutorial in the DMLC documentation) lets you choose between uniform random sampling and </w:t>
-      </w:r>
-      <w:proofErr w:type="spellStart"/>
-      <w:r>
-        <w:t>topk</w:t>
-      </w:r>
-      <w:proofErr w:type="spellEnd"/>
-      <w:r>
-        <w:t xml:space="preserve"> sampling, where negatives are drawn preferentially from items the current model already scores highly. </w:t>
-      </w:r>
-      <w:proofErr w:type="spellStart"/>
-      <w:r>
-        <w:t>Topk</w:t>
-      </w:r>
-      <w:proofErr w:type="spellEnd"/>
-      <w:r>
-        <w:t xml:space="preserve"> sampling is the pairwise analogue of hard-negative mining: it forces the model to spend its gradient budget on the pairs it is currently getting wrong, rather than on easy pairs it already ranks correctly. In practice this keeps training time roughly linear in the number of positives per group, even for groups containing hundreds of candidates.</w:t>
+        <w:t>groups. Instead, for each boosting round it samples a bounded number of candidate pairs per positive item. The modern LambdaRank API (controlled via the lambdarank_num_pair_per_sample and lambdarank_pair_method parameters, added in XGBoost 2.0; see the XGBoost Learning to Rank tutorial in the DMLC documentation) lets you choose between uniform random sampling and topk sampling, where negatives are drawn preferentially from items the current model already scores highly. Topk sampling is the pairwise analogue of hard-negative mining: it forces the model to spend its gradient budget on the pairs it is currently getting wrong, rather than on easy pairs it already ranks correctly. In practice this keeps training time roughly linear in the number of positives per group, even for groups containing hundreds of candidates.</w:t>
       </w:r>
     </w:p>
     <w:p>
@@ -1746,15 +654,7 @@
         <w:spacing w:after="200" w:line="276" w:lineRule="auto"/>
       </w:pPr>
       <w:r>
-        <w:t xml:space="preserve">Listwise methods consider the entire candidate list and optimize a metric (such as NDCG) directly. These approaches work with differentiable approximations to rank metrics or use techniques like </w:t>
-      </w:r>
-      <w:proofErr w:type="spellStart"/>
-      <w:r>
-        <w:t>softmax</w:t>
-      </w:r>
-      <w:proofErr w:type="spellEnd"/>
-      <w:r>
-        <w:t xml:space="preserve"> over permutation probabilities.</w:t>
+        <w:t>Listwise methods consider the entire candidate list and optimize a metric (such as NDCG) directly. These approaches work with differentiable approximations to rank metrics or use techniques like softmax over permutation probabilities.</w:t>
       </w:r>
     </w:p>
     <w:p>
@@ -1766,13 +666,8 @@
         </w:numPr>
         <w:spacing w:after="120" w:line="276" w:lineRule="auto"/>
       </w:pPr>
-      <w:proofErr w:type="spellStart"/>
-      <w:r>
-        <w:t>LambdaRank</w:t>
-      </w:r>
-      <w:proofErr w:type="spellEnd"/>
-      <w:r>
-        <w:t xml:space="preserve"> is often considered listwise because it uses the full list's NDCG gradient via pairwise swaps weighted by NDCG change</w:t>
+      <w:r>
+        <w:t>LambdaRank is often considered listwise because it uses the full list's NDCG gradient via pairwise swaps weighted by NDCG change</w:t>
       </w:r>
     </w:p>
     <w:p>
@@ -1798,23 +693,7 @@
         <w:spacing w:after="120" w:line="276" w:lineRule="auto"/>
       </w:pPr>
       <w:r>
-        <w:t xml:space="preserve">In practice, </w:t>
-      </w:r>
-      <w:proofErr w:type="spellStart"/>
-      <w:r>
-        <w:t>LambdaMART</w:t>
-      </w:r>
-      <w:proofErr w:type="spellEnd"/>
-      <w:r>
-        <w:t xml:space="preserve"> (which uses </w:t>
-      </w:r>
-      <w:proofErr w:type="spellStart"/>
-      <w:r>
-        <w:t>LambdaRank</w:t>
-      </w:r>
-      <w:proofErr w:type="spellEnd"/>
-      <w:r>
-        <w:t>-style gradients in a GBDT) is the most common production-grade listwise approach</w:t>
+        <w:t>In practice, LambdaMART (which uses LambdaRank-style gradients in a GBDT) is the most common production-grade listwise approach</w:t>
       </w:r>
     </w:p>
     <w:tbl>
@@ -2216,21 +1095,12 @@
             <w:pPr>
               <w:spacing w:after="60"/>
             </w:pPr>
-            <w:proofErr w:type="gramStart"/>
             <w:r>
               <w:rPr>
                 <w:sz w:val="22"/>
                 <w:szCs w:val="22"/>
               </w:rPr>
-              <w:t>O(</w:t>
-            </w:r>
-            <w:proofErr w:type="gramEnd"/>
-            <w:r>
-              <w:rPr>
-                <w:sz w:val="22"/>
-                <w:szCs w:val="22"/>
-              </w:rPr>
-              <w:t>n^2) pairs, sampling needed</w:t>
+              <w:t>O(n^2) pairs, sampling needed</w:t>
             </w:r>
           </w:p>
         </w:tc>
@@ -2319,21 +1189,12 @@
             <w:pPr>
               <w:spacing w:after="60"/>
             </w:pPr>
-            <w:proofErr w:type="gramStart"/>
             <w:r>
               <w:rPr>
                 <w:sz w:val="22"/>
                 <w:szCs w:val="22"/>
               </w:rPr>
-              <w:t>Optimizes</w:t>
-            </w:r>
-            <w:proofErr w:type="gramEnd"/>
-            <w:r>
-              <w:rPr>
-                <w:sz w:val="22"/>
-                <w:szCs w:val="22"/>
-              </w:rPr>
-              <w:t xml:space="preserve"> ranking metrics</w:t>
+              <w:t>Optimizes ranking metrics</w:t>
             </w:r>
           </w:p>
         </w:tc>
@@ -2391,15 +1252,7 @@
         <w:t>T</w:t>
       </w:r>
       <w:r>
-        <w:t xml:space="preserve">he quality and coverage of input features </w:t>
-      </w:r>
-      <w:proofErr w:type="gramStart"/>
-      <w:r>
-        <w:t>remains</w:t>
-      </w:r>
-      <w:proofErr w:type="gramEnd"/>
-      <w:r>
-        <w:t xml:space="preserve"> one of the most impactful levers for ranking model performance. A good feature set captures the user's preferences, the item's characteristics, and the context of the interaction.</w:t>
+        <w:t>he quality and coverage of input features remains one of the most impactful levers for ranking model performance. A good feature set captures the user's preferences, the item's characteristics, and the context of the interaction.</w:t>
       </w:r>
     </w:p>
     <w:p>
@@ -2525,18 +1378,8 @@
           <w:sz w:val="20"/>
           <w:szCs w:val="20"/>
         </w:rPr>
-        <w:t xml:space="preserve">from models import </w:t>
-      </w:r>
-      <w:proofErr w:type="spellStart"/>
-      <w:r>
-        <w:rPr>
-          <w:rFonts w:ascii="Consolas" w:hAnsi="Consolas" w:cs="Consolas"/>
-          <w:sz w:val="20"/>
-          <w:szCs w:val="20"/>
-        </w:rPr>
-        <w:t>HistoricalFeatureBuilder</w:t>
-      </w:r>
-      <w:proofErr w:type="spellEnd"/>
+        <w:t>from models import HistoricalFeatureBuilder</w:t>
+      </w:r>
       <w:r>
         <w:rPr>
           <w:rFonts w:ascii="Consolas" w:hAnsi="Consolas" w:cs="Consolas"/>
@@ -2561,69 +1404,16 @@
           <w:szCs w:val="20"/>
         </w:rPr>
         <w:br/>
-        <w:t xml:space="preserve">builder = </w:t>
-      </w:r>
-      <w:proofErr w:type="spellStart"/>
+        <w:t>builder = HistoricalFeatureBuilder()</w:t>
+      </w:r>
       <w:r>
         <w:rPr>
           <w:rFonts w:ascii="Consolas" w:hAnsi="Consolas" w:cs="Consolas"/>
           <w:sz w:val="20"/>
           <w:szCs w:val="20"/>
         </w:rPr>
-        <w:t>HistoricalFeatureBuilder</w:t>
-      </w:r>
-      <w:proofErr w:type="spellEnd"/>
-      <w:r>
-        <w:rPr>
-          <w:rFonts w:ascii="Consolas" w:hAnsi="Consolas" w:cs="Consolas"/>
-          <w:sz w:val="20"/>
-          <w:szCs w:val="20"/>
-        </w:rPr>
-        <w:t>()</w:t>
-      </w:r>
-      <w:r>
-        <w:rPr>
-          <w:rFonts w:ascii="Consolas" w:hAnsi="Consolas" w:cs="Consolas"/>
-          <w:sz w:val="20"/>
-          <w:szCs w:val="20"/>
-        </w:rPr>
         <w:br/>
-      </w:r>
-      <w:proofErr w:type="spellStart"/>
-      <w:r>
-        <w:rPr>
-          <w:rFonts w:ascii="Consolas" w:hAnsi="Consolas" w:cs="Consolas"/>
-          <w:sz w:val="20"/>
-          <w:szCs w:val="20"/>
-        </w:rPr>
-        <w:t>builder.fit</w:t>
-      </w:r>
-      <w:proofErr w:type="spellEnd"/>
-      <w:r>
-        <w:rPr>
-          <w:rFonts w:ascii="Consolas" w:hAnsi="Consolas" w:cs="Consolas"/>
-          <w:sz w:val="20"/>
-          <w:szCs w:val="20"/>
-        </w:rPr>
-        <w:t>(</w:t>
-      </w:r>
-      <w:proofErr w:type="spellStart"/>
-      <w:r>
-        <w:rPr>
-          <w:rFonts w:ascii="Consolas" w:hAnsi="Consolas" w:cs="Consolas"/>
-          <w:sz w:val="20"/>
-          <w:szCs w:val="20"/>
-        </w:rPr>
-        <w:t>train_df</w:t>
-      </w:r>
-      <w:proofErr w:type="spellEnd"/>
-      <w:r>
-        <w:rPr>
-          <w:rFonts w:ascii="Consolas" w:hAnsi="Consolas" w:cs="Consolas"/>
-          <w:sz w:val="20"/>
-          <w:szCs w:val="20"/>
-        </w:rPr>
-        <w:t>)  # Learns user/item/user-item statistics</w:t>
+        <w:t>builder.fit(train_df)  # Learns user/item/user-item statistics</w:t>
       </w:r>
       <w:r>
         <w:rPr>
@@ -2649,193 +1439,33 @@
           <w:szCs w:val="20"/>
         </w:rPr>
         <w:br/>
-      </w:r>
-      <w:proofErr w:type="spellStart"/>
+        <w:t>train_df = builder.transform(train_df)</w:t>
+      </w:r>
       <w:r>
         <w:rPr>
           <w:rFonts w:ascii="Consolas" w:hAnsi="Consolas" w:cs="Consolas"/>
           <w:sz w:val="20"/>
           <w:szCs w:val="20"/>
         </w:rPr>
-        <w:t>train_df</w:t>
-      </w:r>
-      <w:proofErr w:type="spellEnd"/>
+        <w:br/>
+        <w:t>test_df = builder.transform(test_df)</w:t>
+      </w:r>
       <w:r>
         <w:rPr>
           <w:rFonts w:ascii="Consolas" w:hAnsi="Consolas" w:cs="Consolas"/>
           <w:sz w:val="20"/>
           <w:szCs w:val="20"/>
         </w:rPr>
-        <w:t xml:space="preserve"> = </w:t>
-      </w:r>
-      <w:proofErr w:type="spellStart"/>
+        <w:br/>
+      </w:r>
       <w:r>
         <w:rPr>
           <w:rFonts w:ascii="Consolas" w:hAnsi="Consolas" w:cs="Consolas"/>
           <w:sz w:val="20"/>
           <w:szCs w:val="20"/>
         </w:rPr>
-        <w:t>builder.transform</w:t>
-      </w:r>
-      <w:proofErr w:type="spellEnd"/>
-      <w:r>
-        <w:rPr>
-          <w:rFonts w:ascii="Consolas" w:hAnsi="Consolas" w:cs="Consolas"/>
-          <w:sz w:val="20"/>
-          <w:szCs w:val="20"/>
-        </w:rPr>
-        <w:t>(</w:t>
-      </w:r>
-      <w:proofErr w:type="spellStart"/>
-      <w:r>
-        <w:rPr>
-          <w:rFonts w:ascii="Consolas" w:hAnsi="Consolas" w:cs="Consolas"/>
-          <w:sz w:val="20"/>
-          <w:szCs w:val="20"/>
-        </w:rPr>
-        <w:t>train_df</w:t>
-      </w:r>
-      <w:proofErr w:type="spellEnd"/>
-      <w:r>
-        <w:rPr>
-          <w:rFonts w:ascii="Consolas" w:hAnsi="Consolas" w:cs="Consolas"/>
-          <w:sz w:val="20"/>
-          <w:szCs w:val="20"/>
-        </w:rPr>
-        <w:t>)</w:t>
-      </w:r>
-      <w:r>
-        <w:rPr>
-          <w:rFonts w:ascii="Consolas" w:hAnsi="Consolas" w:cs="Consolas"/>
-          <w:sz w:val="20"/>
-          <w:szCs w:val="20"/>
-        </w:rPr>
         <w:br/>
-      </w:r>
-      <w:proofErr w:type="spellStart"/>
-      <w:r>
-        <w:rPr>
-          <w:rFonts w:ascii="Consolas" w:hAnsi="Consolas" w:cs="Consolas"/>
-          <w:sz w:val="20"/>
-          <w:szCs w:val="20"/>
-        </w:rPr>
-        <w:t>test_df</w:t>
-      </w:r>
-      <w:proofErr w:type="spellEnd"/>
-      <w:r>
-        <w:rPr>
-          <w:rFonts w:ascii="Consolas" w:hAnsi="Consolas" w:cs="Consolas"/>
-          <w:sz w:val="20"/>
-          <w:szCs w:val="20"/>
-        </w:rPr>
-        <w:t xml:space="preserve"> = </w:t>
-      </w:r>
-      <w:proofErr w:type="spellStart"/>
-      <w:r>
-        <w:rPr>
-          <w:rFonts w:ascii="Consolas" w:hAnsi="Consolas" w:cs="Consolas"/>
-          <w:sz w:val="20"/>
-          <w:szCs w:val="20"/>
-        </w:rPr>
-        <w:t>builder.transform</w:t>
-      </w:r>
-      <w:proofErr w:type="spellEnd"/>
-      <w:r>
-        <w:rPr>
-          <w:rFonts w:ascii="Consolas" w:hAnsi="Consolas" w:cs="Consolas"/>
-          <w:sz w:val="20"/>
-          <w:szCs w:val="20"/>
-        </w:rPr>
-        <w:t>(</w:t>
-      </w:r>
-      <w:proofErr w:type="spellStart"/>
-      <w:r>
-        <w:rPr>
-          <w:rFonts w:ascii="Consolas" w:hAnsi="Consolas" w:cs="Consolas"/>
-          <w:sz w:val="20"/>
-          <w:szCs w:val="20"/>
-        </w:rPr>
-        <w:t>test_df</w:t>
-      </w:r>
-      <w:proofErr w:type="spellEnd"/>
-      <w:r>
-        <w:rPr>
-          <w:rFonts w:ascii="Consolas" w:hAnsi="Consolas" w:cs="Consolas"/>
-          <w:sz w:val="20"/>
-          <w:szCs w:val="20"/>
-        </w:rPr>
-        <w:t>)</w:t>
-      </w:r>
-      <w:r>
-        <w:rPr>
-          <w:rFonts w:ascii="Consolas" w:hAnsi="Consolas" w:cs="Consolas"/>
-          <w:sz w:val="20"/>
-          <w:szCs w:val="20"/>
-        </w:rPr>
-        <w:br/>
-      </w:r>
-      <w:r>
-        <w:rPr>
-          <w:rFonts w:ascii="Consolas" w:hAnsi="Consolas" w:cs="Consolas"/>
-          <w:sz w:val="20"/>
-          <w:szCs w:val="20"/>
-        </w:rPr>
-        <w:br/>
-        <w:t xml:space="preserve"># New features: </w:t>
-      </w:r>
-      <w:proofErr w:type="spellStart"/>
-      <w:r>
-        <w:rPr>
-          <w:rFonts w:ascii="Consolas" w:hAnsi="Consolas" w:cs="Consolas"/>
-          <w:sz w:val="20"/>
-          <w:szCs w:val="20"/>
-        </w:rPr>
-        <w:t>user_avg_completion</w:t>
-      </w:r>
-      <w:proofErr w:type="spellEnd"/>
-      <w:r>
-        <w:rPr>
-          <w:rFonts w:ascii="Consolas" w:hAnsi="Consolas" w:cs="Consolas"/>
-          <w:sz w:val="20"/>
-          <w:szCs w:val="20"/>
-        </w:rPr>
-        <w:t xml:space="preserve">, </w:t>
-      </w:r>
-      <w:proofErr w:type="spellStart"/>
-      <w:r>
-        <w:rPr>
-          <w:rFonts w:ascii="Consolas" w:hAnsi="Consolas" w:cs="Consolas"/>
-          <w:sz w:val="20"/>
-          <w:szCs w:val="20"/>
-        </w:rPr>
-        <w:t>item_total_plays</w:t>
-      </w:r>
-      <w:proofErr w:type="spellEnd"/>
-      <w:r>
-        <w:rPr>
-          <w:rFonts w:ascii="Consolas" w:hAnsi="Consolas" w:cs="Consolas"/>
-          <w:sz w:val="20"/>
-          <w:szCs w:val="20"/>
-        </w:rPr>
-        <w:t xml:space="preserve">, </w:t>
-      </w:r>
-      <w:proofErr w:type="spellStart"/>
-      <w:r>
-        <w:rPr>
-          <w:rFonts w:ascii="Consolas" w:hAnsi="Consolas" w:cs="Consolas"/>
-          <w:sz w:val="20"/>
-          <w:szCs w:val="20"/>
-        </w:rPr>
-        <w:t>has_listened_before</w:t>
-      </w:r>
-      <w:proofErr w:type="spellEnd"/>
-      <w:r>
-        <w:rPr>
-          <w:rFonts w:ascii="Consolas" w:hAnsi="Consolas" w:cs="Consolas"/>
-          <w:sz w:val="20"/>
-          <w:szCs w:val="20"/>
-        </w:rPr>
-        <w:t>, etc.</w:t>
+        <w:t># New features: user_avg_completion, item_total_plays, has_listened_before, etc.</w:t>
       </w:r>
     </w:p>
     <w:p>
@@ -2892,15 +1522,7 @@
         <w:t xml:space="preserve">Target encoding: </w:t>
       </w:r>
       <w:r>
-        <w:t xml:space="preserve">Replace a categorical value with the average target value (e.g., average CTR) for that category. </w:t>
-      </w:r>
-      <w:proofErr w:type="gramStart"/>
-      <w:r>
-        <w:t>Requires</w:t>
-      </w:r>
-      <w:proofErr w:type="gramEnd"/>
-      <w:r>
-        <w:t xml:space="preserve"> careful regularization to avoid overfitting on rare categories.</w:t>
+        <w:t>Replace a categorical value with the average target value (e.g., average CTR) for that category. Requires careful regularization to avoid overfitting on rare categories.</w:t>
       </w:r>
     </w:p>
     <w:p>
@@ -2956,15 +1578,7 @@
         <w:spacing w:after="200" w:line="276" w:lineRule="auto"/>
       </w:pPr>
       <w:r>
-        <w:t xml:space="preserve">Temporal features deserve special attention in ranking because user intent is highly </w:t>
-      </w:r>
-      <w:proofErr w:type="gramStart"/>
-      <w:r>
-        <w:t>time-dependent</w:t>
-      </w:r>
-      <w:proofErr w:type="gramEnd"/>
-      <w:r>
-        <w:t>. The same user may want different content at different times.</w:t>
+        <w:t>Temporal features deserve special attention in ranking because user intent is highly time-dependent. The same user may want different content at different times.</w:t>
       </w:r>
     </w:p>
     <w:p>
@@ -3032,55 +1646,7 @@
         <w:spacing w:after="200" w:line="276" w:lineRule="auto"/>
       </w:pPr>
       <w:r>
-        <w:t xml:space="preserve">Gradient Boosted Decision Trees (GBDTs), particularly XGBoost and </w:t>
-      </w:r>
-      <w:proofErr w:type="spellStart"/>
-      <w:r>
-        <w:t>LightGBM</w:t>
-      </w:r>
-      <w:proofErr w:type="spellEnd"/>
-      <w:r>
-        <w:t xml:space="preserve"> implementations, have been workhorses for ranking in production recommender systems since </w:t>
-      </w:r>
-      <w:proofErr w:type="spellStart"/>
-      <w:r>
-        <w:t>XGBoost’s</w:t>
-      </w:r>
-      <w:proofErr w:type="spellEnd"/>
-      <w:r>
-        <w:t xml:space="preserve"> release in 2014 (Chen &amp; </w:t>
-      </w:r>
-      <w:proofErr w:type="spellStart"/>
-      <w:r>
-        <w:t>Guestrin</w:t>
-      </w:r>
-      <w:proofErr w:type="spellEnd"/>
-      <w:r>
-        <w:t xml:space="preserve">, KDD 2016) and </w:t>
-      </w:r>
-      <w:proofErr w:type="spellStart"/>
-      <w:r>
-        <w:t>LightGBM</w:t>
-      </w:r>
-      <w:proofErr w:type="spellEnd"/>
-      <w:r>
-        <w:t xml:space="preserve"> in 2017 (Ke et al., </w:t>
-      </w:r>
-      <w:proofErr w:type="spellStart"/>
-      <w:r>
-        <w:t>NeurIPS</w:t>
-      </w:r>
-      <w:proofErr w:type="spellEnd"/>
-      <w:r>
-        <w:t xml:space="preserve"> 2017). They offer a compelling balance of accuracy, training speed, interpretability, and ease of deployment that makes them an ideal starting point for </w:t>
-      </w:r>
-      <w:proofErr w:type="gramStart"/>
-      <w:r>
-        <w:t>first-stage</w:t>
-      </w:r>
-      <w:proofErr w:type="gramEnd"/>
-      <w:r>
-        <w:t xml:space="preserve"> ranking.</w:t>
+        <w:t>Gradient Boosted Decision Trees (GBDTs), particularly XGBoost and LightGBM implementations, have been workhorses for ranking in production recommender systems since XGBoost’s release in 2014 (Chen &amp; Guestrin, KDD 2016) and LightGBM in 2017 (Ke et al., NeurIPS 2017). They offer a compelling balance of accuracy, training speed, interpretability, and ease of deployment that makes them an ideal starting point for first-stage ranking.</w:t>
       </w:r>
     </w:p>
     <w:p>
@@ -3154,15 +1720,7 @@
         <w:spacing w:after="120" w:line="276" w:lineRule="auto"/>
       </w:pPr>
       <w:r>
-        <w:t>Support ranking-specific objectives out of the box (</w:t>
-      </w:r>
-      <w:proofErr w:type="spellStart"/>
-      <w:r>
-        <w:t>LambdaMART</w:t>
-      </w:r>
-      <w:proofErr w:type="spellEnd"/>
-      <w:r>
-        <w:t xml:space="preserve"> for NDCG optimization)</w:t>
+        <w:t>Support ranking-specific objectives out of the box (LambdaMART for NDCG optimization)</w:t>
       </w:r>
     </w:p>
     <w:p>
@@ -3174,13 +1732,8 @@
         </w:numPr>
         <w:spacing w:after="120" w:line="276" w:lineRule="auto"/>
       </w:pPr>
-      <w:proofErr w:type="gramStart"/>
-      <w:r>
-        <w:t>Require</w:t>
-      </w:r>
-      <w:proofErr w:type="gramEnd"/>
-      <w:r>
-        <w:t xml:space="preserve"> less hyperparameter tuning than deep learning models and often work well with less training data</w:t>
+      <w:r>
+        <w:t>Require less hyperparameter tuning than deep learning models and often work well with less training data</w:t>
       </w:r>
     </w:p>
     <w:p>
@@ -3207,15 +1760,7 @@
         <w:t xml:space="preserve">XGBoost </w:t>
       </w:r>
       <w:r>
-        <w:t xml:space="preserve">implementation in the </w:t>
-      </w:r>
-      <w:proofErr w:type="spellStart"/>
-      <w:r>
-        <w:t>dmlc</w:t>
-      </w:r>
-      <w:proofErr w:type="spellEnd"/>
-      <w:r>
-        <w:t xml:space="preserve"> library </w:t>
+        <w:t xml:space="preserve">implementation in the dmlc library </w:t>
       </w:r>
       <w:r>
         <w:t>supports multiple ranking objectives. The choice depends on whether you need calibrated probabilities or optimized list ordering:</w:t>
@@ -3230,34 +1775,15 @@
         </w:numPr>
         <w:spacing w:after="120" w:line="276" w:lineRule="auto"/>
       </w:pPr>
-      <w:proofErr w:type="spellStart"/>
-      <w:proofErr w:type="gramStart"/>
       <w:r>
         <w:rPr>
           <w:b/>
           <w:bCs/>
         </w:rPr>
-        <w:t>binary:logistic</w:t>
-      </w:r>
-      <w:proofErr w:type="spellEnd"/>
-      <w:proofErr w:type="gramEnd"/>
-      <w:r>
-        <w:rPr>
-          <w:b/>
-          <w:bCs/>
-        </w:rPr>
-        <w:t xml:space="preserve"> (pointwise): </w:t>
-      </w:r>
-      <w:r>
-        <w:t xml:space="preserve">Predicts </w:t>
-      </w:r>
-      <w:proofErr w:type="gramStart"/>
-      <w:r>
-        <w:t>P(</w:t>
-      </w:r>
-      <w:proofErr w:type="gramEnd"/>
-      <w:r>
-        <w:t>click | user, item, context). Simple, produces calibrated probabilities, works well as a first baseline.</w:t>
+        <w:t xml:space="preserve">binary:logistic (pointwise): </w:t>
+      </w:r>
+      <w:r>
+        <w:t>Predicts P(click | user, item, context). Simple, produces calibrated probabilities, works well as a first baseline.</w:t>
       </w:r>
     </w:p>
     <w:p>
@@ -3269,39 +1795,12 @@
         </w:numPr>
         <w:spacing w:after="120" w:line="276" w:lineRule="auto"/>
       </w:pPr>
-      <w:proofErr w:type="spellStart"/>
-      <w:proofErr w:type="gramStart"/>
       <w:r>
         <w:rPr>
           <w:b/>
           <w:bCs/>
         </w:rPr>
-        <w:t>rank:pairwise</w:t>
-      </w:r>
-      <w:proofErr w:type="spellEnd"/>
-      <w:proofErr w:type="gramEnd"/>
-      <w:r>
-        <w:rPr>
-          <w:b/>
-          <w:bCs/>
-        </w:rPr>
-        <w:t xml:space="preserve"> (</w:t>
-      </w:r>
-      <w:proofErr w:type="spellStart"/>
-      <w:r>
-        <w:rPr>
-          <w:b/>
-          <w:bCs/>
-        </w:rPr>
-        <w:t>LambdaMART</w:t>
-      </w:r>
-      <w:proofErr w:type="spellEnd"/>
-      <w:r>
-        <w:rPr>
-          <w:b/>
-          <w:bCs/>
-        </w:rPr>
-        <w:t xml:space="preserve">): </w:t>
+        <w:t xml:space="preserve">rank:pairwise (LambdaMART): </w:t>
       </w:r>
       <w:r>
         <w:t>Optimizes NDCG by comparing pairs of items within the same query group. Requires a group parameter that tells XGBoost which items belong to the same user/session context.</w:t>
@@ -3316,44 +1815,15 @@
         </w:numPr>
         <w:spacing w:after="120" w:line="276" w:lineRule="auto"/>
       </w:pPr>
-      <w:proofErr w:type="spellStart"/>
-      <w:proofErr w:type="gramStart"/>
       <w:r>
         <w:rPr>
           <w:b/>
           <w:bCs/>
         </w:rPr>
-        <w:t>rank:ndcg</w:t>
-      </w:r>
-      <w:proofErr w:type="spellEnd"/>
-      <w:proofErr w:type="gramEnd"/>
-      <w:r>
-        <w:rPr>
-          <w:b/>
-          <w:bCs/>
-        </w:rPr>
-        <w:t xml:space="preserve">: </w:t>
-      </w:r>
-      <w:r>
-        <w:t xml:space="preserve">Directly optimizes a proxy of NDCG. </w:t>
-      </w:r>
-      <w:proofErr w:type="gramStart"/>
-      <w:r>
-        <w:t>Similar to</w:t>
-      </w:r>
-      <w:proofErr w:type="gramEnd"/>
-      <w:r>
-        <w:t xml:space="preserve"> </w:t>
-      </w:r>
-      <w:proofErr w:type="spellStart"/>
-      <w:proofErr w:type="gramStart"/>
-      <w:r>
-        <w:t>rank:pairwise</w:t>
-      </w:r>
-      <w:proofErr w:type="spellEnd"/>
-      <w:proofErr w:type="gramEnd"/>
-      <w:r>
-        <w:t xml:space="preserve"> but with a different loss formulation.</w:t>
+        <w:t xml:space="preserve">rank:ndcg: </w:t>
+      </w:r>
+      <w:r>
+        <w:t>Directly optimizes a proxy of NDCG. Similar to rank:pairwise but with a different loss formulation.</w:t>
       </w:r>
     </w:p>
     <w:p>
@@ -3420,39 +1890,7 @@
           <w:i/>
           <w:sz w:val="20"/>
         </w:rPr>
-        <w:t xml:space="preserve"> search ranking training set. Each row is one (query, candidate) pair. Items with the same </w:t>
-      </w:r>
-      <w:proofErr w:type="spellStart"/>
-      <w:r>
-        <w:rPr>
-          <w:i/>
-          <w:sz w:val="20"/>
-        </w:rPr>
-        <w:t>query_id</w:t>
-      </w:r>
-      <w:proofErr w:type="spellEnd"/>
-      <w:r>
-        <w:rPr>
-          <w:i/>
-          <w:sz w:val="20"/>
-        </w:rPr>
-        <w:t xml:space="preserve"> form one query group; the graded label (0/1/2) is what </w:t>
-      </w:r>
-      <w:proofErr w:type="spellStart"/>
-      <w:r>
-        <w:rPr>
-          <w:i/>
-          <w:sz w:val="20"/>
-        </w:rPr>
-        <w:t>LambdaMART</w:t>
-      </w:r>
-      <w:proofErr w:type="spellEnd"/>
-      <w:r>
-        <w:rPr>
-          <w:i/>
-          <w:sz w:val="20"/>
-        </w:rPr>
-        <w:t xml:space="preserve"> optimizes via pairwise comparisons within a group.</w:t>
+        <w:t xml:space="preserve"> search ranking training set. Each row is one (query, candidate) pair. Items with the same query_id form one query group; the graded label (0/1/2) is what LambdaMART optimizes via pairwise comparisons within a group.</w:t>
       </w:r>
     </w:p>
     <w:tbl>
@@ -3483,7 +1921,6 @@
             <w:shd w:val="clear" w:color="auto" w:fill="E8EEF7"/>
           </w:tcPr>
           <w:p>
-            <w:proofErr w:type="spellStart"/>
             <w:r>
               <w:rPr>
                 <w:b/>
@@ -3491,7 +1928,6 @@
               <w:lastRenderedPageBreak/>
               <w:t>query_id</w:t>
             </w:r>
-            <w:proofErr w:type="spellEnd"/>
           </w:p>
         </w:tc>
         <w:tc>
@@ -3500,14 +1936,12 @@
             <w:shd w:val="clear" w:color="auto" w:fill="E8EEF7"/>
           </w:tcPr>
           <w:p>
-            <w:proofErr w:type="spellStart"/>
             <w:r>
               <w:rPr>
                 <w:b/>
               </w:rPr>
               <w:t>query_text</w:t>
             </w:r>
-            <w:proofErr w:type="spellEnd"/>
           </w:p>
         </w:tc>
         <w:tc>
@@ -3516,14 +1950,12 @@
             <w:shd w:val="clear" w:color="auto" w:fill="E8EEF7"/>
           </w:tcPr>
           <w:p>
-            <w:proofErr w:type="spellStart"/>
             <w:r>
               <w:rPr>
                 <w:b/>
               </w:rPr>
               <w:t>product_id</w:t>
             </w:r>
-            <w:proofErr w:type="spellEnd"/>
           </w:p>
         </w:tc>
         <w:tc>
@@ -4058,7 +2490,6 @@
         </w:rPr>
         <w:t xml:space="preserve">, candidate) pair. Items with the same </w:t>
       </w:r>
-      <w:proofErr w:type="spellStart"/>
       <w:r>
         <w:rPr>
           <w:i/>
@@ -4071,15 +2502,7 @@
           <w:i/>
           <w:sz w:val="20"/>
         </w:rPr>
-        <w:t>_id</w:t>
-      </w:r>
-      <w:proofErr w:type="spellEnd"/>
-      <w:r>
-        <w:rPr>
-          <w:i/>
-          <w:sz w:val="20"/>
-        </w:rPr>
-        <w:t xml:space="preserve"> form one group</w:t>
+        <w:t>_id form one group</w:t>
       </w:r>
       <w:r>
         <w:rPr>
@@ -4116,14 +2539,12 @@
             <w:shd w:val="clear" w:color="auto" w:fill="E8EEF7"/>
           </w:tcPr>
           <w:p>
-            <w:proofErr w:type="spellStart"/>
             <w:r>
               <w:rPr>
                 <w:b/>
               </w:rPr>
               <w:t>User_id</w:t>
             </w:r>
-            <w:proofErr w:type="spellEnd"/>
           </w:p>
         </w:tc>
         <w:tc>
@@ -4132,14 +2553,12 @@
             <w:shd w:val="clear" w:color="auto" w:fill="E8EEF7"/>
           </w:tcPr>
           <w:p>
-            <w:proofErr w:type="spellStart"/>
             <w:r>
               <w:rPr>
                 <w:b/>
               </w:rPr>
               <w:t>item_id</w:t>
             </w:r>
-            <w:proofErr w:type="spellEnd"/>
           </w:p>
         </w:tc>
         <w:tc>
@@ -4148,14 +2567,12 @@
             <w:shd w:val="clear" w:color="auto" w:fill="E8EEF7"/>
           </w:tcPr>
           <w:p>
-            <w:proofErr w:type="spellStart"/>
             <w:r>
               <w:rPr>
                 <w:b/>
               </w:rPr>
               <w:t>User_genre_pref_score</w:t>
             </w:r>
-            <w:proofErr w:type="spellEnd"/>
           </w:p>
         </w:tc>
         <w:tc>
@@ -4164,14 +2581,12 @@
             <w:shd w:val="clear" w:color="auto" w:fill="E8EEF7"/>
           </w:tcPr>
           <w:p>
-            <w:proofErr w:type="spellStart"/>
             <w:r>
               <w:rPr>
                 <w:b/>
               </w:rPr>
               <w:t>Item_popularity</w:t>
             </w:r>
-            <w:proofErr w:type="spellEnd"/>
           </w:p>
         </w:tc>
         <w:tc>
@@ -4213,20 +2628,7 @@
           </w:tcPr>
           <w:p>
             <w:r>
-              <w:t>'</w:t>
-            </w:r>
-            <w:proofErr w:type="spellStart"/>
-            <w:proofErr w:type="gramStart"/>
-            <w:r>
-              <w:t>track</w:t>
-            </w:r>
-            <w:proofErr w:type="gramEnd"/>
-            <w:r>
-              <w:t>_A</w:t>
-            </w:r>
-            <w:proofErr w:type="spellEnd"/>
-            <w:r>
-              <w:t>'</w:t>
+              <w:t>'track_A'</w:t>
             </w:r>
           </w:p>
         </w:tc>
@@ -4278,21 +2680,11 @@
           </w:tcPr>
           <w:p>
             <w:r>
-              <w:t>'</w:t>
-            </w:r>
-            <w:proofErr w:type="spellStart"/>
-            <w:proofErr w:type="gramStart"/>
-            <w:r>
-              <w:t>track</w:t>
-            </w:r>
-            <w:proofErr w:type="gramEnd"/>
-            <w:r>
-              <w:t>_</w:t>
+              <w:t>'track_</w:t>
             </w:r>
             <w:r>
               <w:t>B</w:t>
             </w:r>
-            <w:proofErr w:type="spellEnd"/>
             <w:r>
               <w:t>'</w:t>
             </w:r>
@@ -4346,23 +2738,10 @@
           </w:tcPr>
           <w:p>
             <w:r>
-              <w:t>'</w:t>
-            </w:r>
-            <w:proofErr w:type="spellStart"/>
-            <w:proofErr w:type="gramStart"/>
-            <w:r>
-              <w:t>track</w:t>
-            </w:r>
-            <w:proofErr w:type="gramEnd"/>
-            <w:r>
-              <w:t>_</w:t>
-            </w:r>
-            <w:r>
-              <w:t>C</w:t>
-            </w:r>
-            <w:proofErr w:type="spellEnd"/>
-            <w:r>
-              <w:t>’</w:t>
+              <w:t>'track_</w:t>
+            </w:r>
+            <w:r>
+              <w:t>C’</w:t>
             </w:r>
           </w:p>
         </w:tc>
@@ -4414,23 +2793,10 @@
           </w:tcPr>
           <w:p>
             <w:r>
-              <w:t>'</w:t>
-            </w:r>
-            <w:proofErr w:type="spellStart"/>
-            <w:proofErr w:type="gramStart"/>
-            <w:r>
-              <w:t>track</w:t>
-            </w:r>
-            <w:proofErr w:type="gramEnd"/>
-            <w:r>
-              <w:t>_</w:t>
-            </w:r>
-            <w:r>
-              <w:t>D</w:t>
-            </w:r>
-            <w:proofErr w:type="spellEnd"/>
-            <w:r>
-              <w:t>’</w:t>
+              <w:t>'track_</w:t>
+            </w:r>
+            <w:r>
+              <w:t>D’</w:t>
             </w:r>
           </w:p>
         </w:tc>
@@ -4482,23 +2848,10 @@
           </w:tcPr>
           <w:p>
             <w:r>
-              <w:t>'</w:t>
-            </w:r>
-            <w:proofErr w:type="spellStart"/>
-            <w:proofErr w:type="gramStart"/>
-            <w:r>
-              <w:t>track</w:t>
-            </w:r>
-            <w:proofErr w:type="gramEnd"/>
-            <w:r>
-              <w:t>_</w:t>
-            </w:r>
-            <w:r>
-              <w:t>E</w:t>
-            </w:r>
-            <w:proofErr w:type="spellEnd"/>
-            <w:r>
-              <w:t>’</w:t>
+              <w:t>'track_</w:t>
+            </w:r>
+            <w:r>
+              <w:t>E’</w:t>
             </w:r>
           </w:p>
         </w:tc>
@@ -4550,23 +2903,10 @@
           </w:tcPr>
           <w:p>
             <w:r>
-              <w:t>'</w:t>
-            </w:r>
-            <w:proofErr w:type="spellStart"/>
-            <w:proofErr w:type="gramStart"/>
-            <w:r>
-              <w:t>track</w:t>
-            </w:r>
-            <w:proofErr w:type="gramEnd"/>
-            <w:r>
-              <w:t>_</w:t>
-            </w:r>
-            <w:r>
-              <w:t>F</w:t>
-            </w:r>
-            <w:proofErr w:type="spellEnd"/>
-            <w:r>
-              <w:t>’</w:t>
+              <w:t>'track_</w:t>
+            </w:r>
+            <w:r>
+              <w:t>F’</w:t>
             </w:r>
           </w:p>
         </w:tc>
@@ -4618,23 +2958,10 @@
           </w:tcPr>
           <w:p>
             <w:r>
-              <w:t>'</w:t>
-            </w:r>
-            <w:proofErr w:type="spellStart"/>
-            <w:proofErr w:type="gramStart"/>
-            <w:r>
-              <w:t>track</w:t>
-            </w:r>
-            <w:proofErr w:type="gramEnd"/>
-            <w:r>
-              <w:t>_</w:t>
-            </w:r>
-            <w:r>
-              <w:t>G</w:t>
-            </w:r>
-            <w:proofErr w:type="spellEnd"/>
-            <w:r>
-              <w:t>’</w:t>
+              <w:t>'track_</w:t>
+            </w:r>
+            <w:r>
+              <w:t>G’</w:t>
             </w:r>
           </w:p>
         </w:tc>
@@ -4686,23 +3013,10 @@
           </w:tcPr>
           <w:p>
             <w:r>
-              <w:t>'</w:t>
-            </w:r>
-            <w:proofErr w:type="spellStart"/>
-            <w:proofErr w:type="gramStart"/>
-            <w:r>
-              <w:t>track</w:t>
-            </w:r>
-            <w:proofErr w:type="gramEnd"/>
-            <w:r>
-              <w:t>_</w:t>
-            </w:r>
-            <w:r>
-              <w:t>H</w:t>
-            </w:r>
-            <w:proofErr w:type="spellEnd"/>
-            <w:r>
-              <w:t>’</w:t>
+              <w:t>'track_</w:t>
+            </w:r>
+            <w:r>
+              <w:t>H’</w:t>
             </w:r>
           </w:p>
         </w:tc>
@@ -4748,15 +3062,7 @@
         <w:spacing w:after="120" w:line="276" w:lineRule="auto"/>
       </w:pPr>
       <w:r>
-        <w:t xml:space="preserve">Group size affects training: too large and you waste computation on easy comparisons; too small and the model </w:t>
-      </w:r>
-      <w:proofErr w:type="gramStart"/>
-      <w:r>
-        <w:t>lacks</w:t>
-      </w:r>
-      <w:proofErr w:type="gramEnd"/>
-      <w:r>
-        <w:t xml:space="preserve"> sufficient positive/negative contrast</w:t>
+        <w:t>Group size affects training: too large and you waste computation on easy comparisons; too small and the model lacks sufficient positive/negative contrast</w:t>
       </w:r>
     </w:p>
     <w:p>
@@ -4768,39 +3074,7 @@
           <w:i/>
           <w:iCs/>
         </w:rPr>
-        <w:t xml:space="preserve">Author's note: In the </w:t>
-      </w:r>
-      <w:proofErr w:type="spellStart"/>
-      <w:r>
-        <w:rPr>
-          <w:i/>
-          <w:iCs/>
-        </w:rPr>
-        <w:t>Yambda</w:t>
-      </w:r>
-      <w:proofErr w:type="spellEnd"/>
-      <w:r>
-        <w:rPr>
-          <w:i/>
-          <w:iCs/>
-        </w:rPr>
-        <w:t xml:space="preserve"> tutorial, we use the Global Temporal Split (GTS) protocol from the </w:t>
-      </w:r>
-      <w:proofErr w:type="spellStart"/>
-      <w:r>
-        <w:rPr>
-          <w:i/>
-          <w:iCs/>
-        </w:rPr>
-        <w:t>Yambda</w:t>
-      </w:r>
-      <w:proofErr w:type="spellEnd"/>
-      <w:r>
-        <w:rPr>
-          <w:i/>
-          <w:iCs/>
-        </w:rPr>
-        <w:t xml:space="preserve"> paper: 300 days of training data, a 30-minute gap to prevent leakage, and 1 day of test data. </w:t>
+        <w:t xml:space="preserve">Author's note: In the Yambda tutorial, we use the Global Temporal Split (GTS) protocol from the Yambda paper: 300 days of training data, a 30-minute gap to prevent leakage, and 1 day of test data. </w:t>
       </w:r>
     </w:p>
     <w:p>
@@ -4808,15 +3082,7 @@
         <w:pStyle w:val="Heading2"/>
       </w:pPr>
       <w:r>
-        <w:t xml:space="preserve">6.5 </w:t>
-      </w:r>
-      <w:proofErr w:type="spellStart"/>
-      <w:r>
-        <w:t>DeepFM</w:t>
-      </w:r>
-      <w:proofErr w:type="spellEnd"/>
-      <w:r>
-        <w:t>: Automating Feature Crosses</w:t>
+        <w:t>6.5 DeepFM: Automating Feature Crosses</w:t>
       </w:r>
     </w:p>
     <w:p>
@@ -4824,15 +3090,7 @@
         <w:spacing w:after="200" w:line="276" w:lineRule="auto"/>
       </w:pPr>
       <w:r>
-        <w:t xml:space="preserve">While XGBoost handles feature interactions through tree splits, it relies on the model to discover them during training. </w:t>
-      </w:r>
-      <w:proofErr w:type="spellStart"/>
-      <w:r>
-        <w:t>DeepFM</w:t>
-      </w:r>
-      <w:proofErr w:type="spellEnd"/>
-      <w:r>
-        <w:t xml:space="preserve"> (Guo et al., 2017) takes a different approach: it explicitly models all pairwise feature interactions through a Factorization Machine (FM) component, combined with a deep neural network for higher-order patterns.</w:t>
+        <w:t>While XGBoost handles feature interactions through tree splits, it relies on the model to discover them during training. DeepFM (Guo et al., 2017) takes a different approach: it explicitly models all pairwise feature interactions through a Factorization Machine (FM) component, combined with a deep neural network for higher-order patterns.</w:t>
       </w:r>
     </w:p>
     <w:p>
@@ -4847,13 +3105,8 @@
       <w:pPr>
         <w:spacing w:after="200" w:line="276" w:lineRule="auto"/>
       </w:pPr>
-      <w:proofErr w:type="spellStart"/>
-      <w:r>
-        <w:t>DeepFM</w:t>
-      </w:r>
-      <w:proofErr w:type="spellEnd"/>
-      <w:r>
-        <w:t xml:space="preserve"> has two parallel components that share the same input embeddings:</w:t>
+      <w:r>
+        <w:t>DeepFM has two parallel components that share the same input embeddings:</w:t>
       </w:r>
     </w:p>
     <w:p>
@@ -4874,23 +3127,7 @@
         <w:t xml:space="preserve">FM component: </w:t>
       </w:r>
       <w:r>
-        <w:t>Assigns each feature an embedding vector and computes all pairwise dot products between these vectors. This explicitly captures second-order feature interactions (e.g., '</w:t>
-      </w:r>
-      <w:proofErr w:type="spellStart"/>
-      <w:r>
-        <w:t>user_age</w:t>
-      </w:r>
-      <w:proofErr w:type="spellEnd"/>
-      <w:r>
-        <w:t xml:space="preserve"> x </w:t>
-      </w:r>
-      <w:proofErr w:type="spellStart"/>
-      <w:r>
-        <w:t>item_genre</w:t>
-      </w:r>
-      <w:proofErr w:type="spellEnd"/>
-      <w:r>
-        <w:t>') without manual feature engineering.</w:t>
+        <w:t>Assigns each feature an embedding vector and computes all pairwise dot products between these vectors. This explicitly captures second-order feature interactions (e.g., 'user_age x item_genre') without manual feature engineering.</w:t>
       </w:r>
     </w:p>
     <w:p>
@@ -4938,43 +3175,7 @@
           <w:sz w:val="20"/>
           <w:szCs w:val="20"/>
         </w:rPr>
-        <w:t xml:space="preserve">class </w:t>
-      </w:r>
-      <w:proofErr w:type="spellStart"/>
-      <w:r>
-        <w:rPr>
-          <w:rFonts w:ascii="Consolas" w:hAnsi="Consolas" w:cs="Consolas"/>
-          <w:sz w:val="20"/>
-          <w:szCs w:val="20"/>
-        </w:rPr>
-        <w:t>FMLayer</w:t>
-      </w:r>
-      <w:proofErr w:type="spellEnd"/>
-      <w:r>
-        <w:rPr>
-          <w:rFonts w:ascii="Consolas" w:hAnsi="Consolas" w:cs="Consolas"/>
-          <w:sz w:val="20"/>
-          <w:szCs w:val="20"/>
-        </w:rPr>
-        <w:t>(</w:t>
-      </w:r>
-      <w:proofErr w:type="spellStart"/>
-      <w:r>
-        <w:rPr>
-          <w:rFonts w:ascii="Consolas" w:hAnsi="Consolas" w:cs="Consolas"/>
-          <w:sz w:val="20"/>
-          <w:szCs w:val="20"/>
-        </w:rPr>
-        <w:t>nn.Module</w:t>
-      </w:r>
-      <w:proofErr w:type="spellEnd"/>
-      <w:r>
-        <w:rPr>
-          <w:rFonts w:ascii="Consolas" w:hAnsi="Consolas" w:cs="Consolas"/>
-          <w:sz w:val="20"/>
-          <w:szCs w:val="20"/>
-        </w:rPr>
-        <w:t>):</w:t>
+        <w:t>class FMLayer(nn.Module):</w:t>
       </w:r>
       <w:r>
         <w:rPr>
@@ -4992,43 +3193,7 @@
           <w:szCs w:val="20"/>
         </w:rPr>
         <w:br/>
-        <w:t xml:space="preserve">    FM output = 0.5 * (||sum(</w:t>
-      </w:r>
-      <w:proofErr w:type="spellStart"/>
-      <w:r>
-        <w:rPr>
-          <w:rFonts w:ascii="Consolas" w:hAnsi="Consolas" w:cs="Consolas"/>
-          <w:sz w:val="20"/>
-          <w:szCs w:val="20"/>
-        </w:rPr>
-        <w:t>v_i</w:t>
-      </w:r>
-      <w:proofErr w:type="spellEnd"/>
-      <w:r>
-        <w:rPr>
-          <w:rFonts w:ascii="Consolas" w:hAnsi="Consolas" w:cs="Consolas"/>
-          <w:sz w:val="20"/>
-          <w:szCs w:val="20"/>
-        </w:rPr>
-        <w:t>)||^2 - sum(||</w:t>
-      </w:r>
-      <w:proofErr w:type="spellStart"/>
-      <w:r>
-        <w:rPr>
-          <w:rFonts w:ascii="Consolas" w:hAnsi="Consolas" w:cs="Consolas"/>
-          <w:sz w:val="20"/>
-          <w:szCs w:val="20"/>
-        </w:rPr>
-        <w:t>v_i</w:t>
-      </w:r>
-      <w:proofErr w:type="spellEnd"/>
-      <w:r>
-        <w:rPr>
-          <w:rFonts w:ascii="Consolas" w:hAnsi="Consolas" w:cs="Consolas"/>
-          <w:sz w:val="20"/>
-          <w:szCs w:val="20"/>
-        </w:rPr>
-        <w:t>||^2))</w:t>
+        <w:t xml:space="preserve">    FM output = 0.5 * (||sum(v_i)||^2 - sum(||v_i||^2))</w:t>
       </w:r>
       <w:r>
         <w:rPr>
@@ -5046,43 +3211,42 @@
           <w:szCs w:val="20"/>
         </w:rPr>
         <w:br/>
-        <w:t xml:space="preserve">    def forward(self, embeddings):  # (batch, </w:t>
-      </w:r>
-      <w:proofErr w:type="spellStart"/>
+        <w:t xml:space="preserve">    def forward(self, embeddings):  # (batch, num_fields, embed_dim)</w:t>
+      </w:r>
       <w:r>
         <w:rPr>
           <w:rFonts w:ascii="Consolas" w:hAnsi="Consolas" w:cs="Consolas"/>
           <w:sz w:val="20"/>
           <w:szCs w:val="20"/>
         </w:rPr>
-        <w:t>num_fields</w:t>
-      </w:r>
-      <w:proofErr w:type="spellEnd"/>
+        <w:br/>
+        <w:t xml:space="preserve">        square_of_sum = torch.sum(embeddings, dim=1) ** 2</w:t>
+      </w:r>
       <w:r>
         <w:rPr>
           <w:rFonts w:ascii="Consolas" w:hAnsi="Consolas" w:cs="Consolas"/>
           <w:sz w:val="20"/>
           <w:szCs w:val="20"/>
         </w:rPr>
-        <w:t xml:space="preserve">, </w:t>
-      </w:r>
-      <w:proofErr w:type="spellStart"/>
+        <w:br/>
+        <w:t xml:space="preserve">        sum_of_square = torch.sum(embeddings ** 2, dim=1)</w:t>
+      </w:r>
       <w:r>
         <w:rPr>
           <w:rFonts w:ascii="Consolas" w:hAnsi="Consolas" w:cs="Consolas"/>
           <w:sz w:val="20"/>
           <w:szCs w:val="20"/>
         </w:rPr>
-        <w:t>embed_dim</w:t>
-      </w:r>
-      <w:proofErr w:type="spellEnd"/>
+        <w:br/>
+        <w:t xml:space="preserve">        return 0.5 * torch.sum(square_of_sum - sum_of_square, dim=1, keepdim=True)</w:t>
+      </w:r>
       <w:r>
         <w:rPr>
           <w:rFonts w:ascii="Consolas" w:hAnsi="Consolas" w:cs="Consolas"/>
           <w:sz w:val="20"/>
           <w:szCs w:val="20"/>
         </w:rPr>
-        <w:t>)</w:t>
+        <w:br/>
       </w:r>
       <w:r>
         <w:rPr>
@@ -5091,267 +3255,16 @@
           <w:szCs w:val="20"/>
         </w:rPr>
         <w:br/>
-        <w:t xml:space="preserve">        </w:t>
-      </w:r>
-      <w:proofErr w:type="spellStart"/>
+        <w:t>class DeepFM(nn.Module):</w:t>
+      </w:r>
       <w:r>
         <w:rPr>
           <w:rFonts w:ascii="Consolas" w:hAnsi="Consolas" w:cs="Consolas"/>
           <w:sz w:val="20"/>
           <w:szCs w:val="20"/>
         </w:rPr>
-        <w:t>square_of_sum</w:t>
-      </w:r>
-      <w:proofErr w:type="spellEnd"/>
-      <w:r>
-        <w:rPr>
-          <w:rFonts w:ascii="Consolas" w:hAnsi="Consolas" w:cs="Consolas"/>
-          <w:sz w:val="20"/>
-          <w:szCs w:val="20"/>
-        </w:rPr>
-        <w:t xml:space="preserve"> = </w:t>
-      </w:r>
-      <w:proofErr w:type="spellStart"/>
-      <w:r>
-        <w:rPr>
-          <w:rFonts w:ascii="Consolas" w:hAnsi="Consolas" w:cs="Consolas"/>
-          <w:sz w:val="20"/>
-          <w:szCs w:val="20"/>
-        </w:rPr>
-        <w:t>torch.sum</w:t>
-      </w:r>
-      <w:proofErr w:type="spellEnd"/>
-      <w:r>
-        <w:rPr>
-          <w:rFonts w:ascii="Consolas" w:hAnsi="Consolas" w:cs="Consolas"/>
-          <w:sz w:val="20"/>
-          <w:szCs w:val="20"/>
-        </w:rPr>
-        <w:t>(embeddings, dim=1) ** 2</w:t>
-      </w:r>
-      <w:r>
-        <w:rPr>
-          <w:rFonts w:ascii="Consolas" w:hAnsi="Consolas" w:cs="Consolas"/>
-          <w:sz w:val="20"/>
-          <w:szCs w:val="20"/>
-        </w:rPr>
         <w:br/>
-        <w:t xml:space="preserve">        </w:t>
-      </w:r>
-      <w:proofErr w:type="spellStart"/>
-      <w:r>
-        <w:rPr>
-          <w:rFonts w:ascii="Consolas" w:hAnsi="Consolas" w:cs="Consolas"/>
-          <w:sz w:val="20"/>
-          <w:szCs w:val="20"/>
-        </w:rPr>
-        <w:t>sum_of_square</w:t>
-      </w:r>
-      <w:proofErr w:type="spellEnd"/>
-      <w:r>
-        <w:rPr>
-          <w:rFonts w:ascii="Consolas" w:hAnsi="Consolas" w:cs="Consolas"/>
-          <w:sz w:val="20"/>
-          <w:szCs w:val="20"/>
-        </w:rPr>
-        <w:t xml:space="preserve"> = </w:t>
-      </w:r>
-      <w:proofErr w:type="spellStart"/>
-      <w:r>
-        <w:rPr>
-          <w:rFonts w:ascii="Consolas" w:hAnsi="Consolas" w:cs="Consolas"/>
-          <w:sz w:val="20"/>
-          <w:szCs w:val="20"/>
-        </w:rPr>
-        <w:t>torch.sum</w:t>
-      </w:r>
-      <w:proofErr w:type="spellEnd"/>
-      <w:r>
-        <w:rPr>
-          <w:rFonts w:ascii="Consolas" w:hAnsi="Consolas" w:cs="Consolas"/>
-          <w:sz w:val="20"/>
-          <w:szCs w:val="20"/>
-        </w:rPr>
-        <w:t>(embeddings ** 2, dim=1)</w:t>
-      </w:r>
-      <w:r>
-        <w:rPr>
-          <w:rFonts w:ascii="Consolas" w:hAnsi="Consolas" w:cs="Consolas"/>
-          <w:sz w:val="20"/>
-          <w:szCs w:val="20"/>
-        </w:rPr>
-        <w:br/>
-        <w:t xml:space="preserve">        return 0.5 * </w:t>
-      </w:r>
-      <w:proofErr w:type="spellStart"/>
-      <w:r>
-        <w:rPr>
-          <w:rFonts w:ascii="Consolas" w:hAnsi="Consolas" w:cs="Consolas"/>
-          <w:sz w:val="20"/>
-          <w:szCs w:val="20"/>
-        </w:rPr>
-        <w:t>torch.sum</w:t>
-      </w:r>
-      <w:proofErr w:type="spellEnd"/>
-      <w:r>
-        <w:rPr>
-          <w:rFonts w:ascii="Consolas" w:hAnsi="Consolas" w:cs="Consolas"/>
-          <w:sz w:val="20"/>
-          <w:szCs w:val="20"/>
-        </w:rPr>
-        <w:t>(</w:t>
-      </w:r>
-      <w:proofErr w:type="spellStart"/>
-      <w:r>
-        <w:rPr>
-          <w:rFonts w:ascii="Consolas" w:hAnsi="Consolas" w:cs="Consolas"/>
-          <w:sz w:val="20"/>
-          <w:szCs w:val="20"/>
-        </w:rPr>
-        <w:t>square_of_sum</w:t>
-      </w:r>
-      <w:proofErr w:type="spellEnd"/>
-      <w:r>
-        <w:rPr>
-          <w:rFonts w:ascii="Consolas" w:hAnsi="Consolas" w:cs="Consolas"/>
-          <w:sz w:val="20"/>
-          <w:szCs w:val="20"/>
-        </w:rPr>
-        <w:t xml:space="preserve"> - </w:t>
-      </w:r>
-      <w:proofErr w:type="spellStart"/>
-      <w:r>
-        <w:rPr>
-          <w:rFonts w:ascii="Consolas" w:hAnsi="Consolas" w:cs="Consolas"/>
-          <w:sz w:val="20"/>
-          <w:szCs w:val="20"/>
-        </w:rPr>
-        <w:t>sum_of_square</w:t>
-      </w:r>
-      <w:proofErr w:type="spellEnd"/>
-      <w:r>
-        <w:rPr>
-          <w:rFonts w:ascii="Consolas" w:hAnsi="Consolas" w:cs="Consolas"/>
-          <w:sz w:val="20"/>
-          <w:szCs w:val="20"/>
-        </w:rPr>
-        <w:t xml:space="preserve">, dim=1, </w:t>
-      </w:r>
-      <w:proofErr w:type="spellStart"/>
-      <w:r>
-        <w:rPr>
-          <w:rFonts w:ascii="Consolas" w:hAnsi="Consolas" w:cs="Consolas"/>
-          <w:sz w:val="20"/>
-          <w:szCs w:val="20"/>
-        </w:rPr>
-        <w:t>keepdim</w:t>
-      </w:r>
-      <w:proofErr w:type="spellEnd"/>
-      <w:r>
-        <w:rPr>
-          <w:rFonts w:ascii="Consolas" w:hAnsi="Consolas" w:cs="Consolas"/>
-          <w:sz w:val="20"/>
-          <w:szCs w:val="20"/>
-        </w:rPr>
-        <w:t>=True)</w:t>
-      </w:r>
-      <w:r>
-        <w:rPr>
-          <w:rFonts w:ascii="Consolas" w:hAnsi="Consolas" w:cs="Consolas"/>
-          <w:sz w:val="20"/>
-          <w:szCs w:val="20"/>
-        </w:rPr>
-        <w:br/>
-      </w:r>
-      <w:r>
-        <w:rPr>
-          <w:rFonts w:ascii="Consolas" w:hAnsi="Consolas" w:cs="Consolas"/>
-          <w:sz w:val="20"/>
-          <w:szCs w:val="20"/>
-        </w:rPr>
-        <w:br/>
-        <w:t xml:space="preserve">class </w:t>
-      </w:r>
-      <w:proofErr w:type="spellStart"/>
-      <w:r>
-        <w:rPr>
-          <w:rFonts w:ascii="Consolas" w:hAnsi="Consolas" w:cs="Consolas"/>
-          <w:sz w:val="20"/>
-          <w:szCs w:val="20"/>
-        </w:rPr>
-        <w:t>DeepFM</w:t>
-      </w:r>
-      <w:proofErr w:type="spellEnd"/>
-      <w:r>
-        <w:rPr>
-          <w:rFonts w:ascii="Consolas" w:hAnsi="Consolas" w:cs="Consolas"/>
-          <w:sz w:val="20"/>
-          <w:szCs w:val="20"/>
-        </w:rPr>
-        <w:t>(</w:t>
-      </w:r>
-      <w:proofErr w:type="spellStart"/>
-      <w:r>
-        <w:rPr>
-          <w:rFonts w:ascii="Consolas" w:hAnsi="Consolas" w:cs="Consolas"/>
-          <w:sz w:val="20"/>
-          <w:szCs w:val="20"/>
-        </w:rPr>
-        <w:t>nn.Module</w:t>
-      </w:r>
-      <w:proofErr w:type="spellEnd"/>
-      <w:r>
-        <w:rPr>
-          <w:rFonts w:ascii="Consolas" w:hAnsi="Consolas" w:cs="Consolas"/>
-          <w:sz w:val="20"/>
-          <w:szCs w:val="20"/>
-        </w:rPr>
-        <w:t>):</w:t>
-      </w:r>
-      <w:r>
-        <w:rPr>
-          <w:rFonts w:ascii="Consolas" w:hAnsi="Consolas" w:cs="Consolas"/>
-          <w:sz w:val="20"/>
-          <w:szCs w:val="20"/>
-        </w:rPr>
-        <w:br/>
-        <w:t xml:space="preserve">    def forward(self, </w:t>
-      </w:r>
-      <w:proofErr w:type="spellStart"/>
-      <w:r>
-        <w:rPr>
-          <w:rFonts w:ascii="Consolas" w:hAnsi="Consolas" w:cs="Consolas"/>
-          <w:sz w:val="20"/>
-          <w:szCs w:val="20"/>
-        </w:rPr>
-        <w:t>sparse_inputs</w:t>
-      </w:r>
-      <w:proofErr w:type="spellEnd"/>
-      <w:r>
-        <w:rPr>
-          <w:rFonts w:ascii="Consolas" w:hAnsi="Consolas" w:cs="Consolas"/>
-          <w:sz w:val="20"/>
-          <w:szCs w:val="20"/>
-        </w:rPr>
-        <w:t xml:space="preserve">, </w:t>
-      </w:r>
-      <w:proofErr w:type="spellStart"/>
-      <w:r>
-        <w:rPr>
-          <w:rFonts w:ascii="Consolas" w:hAnsi="Consolas" w:cs="Consolas"/>
-          <w:sz w:val="20"/>
-          <w:szCs w:val="20"/>
-        </w:rPr>
-        <w:t>dense_inputs</w:t>
-      </w:r>
-      <w:proofErr w:type="spellEnd"/>
-      <w:r>
-        <w:rPr>
-          <w:rFonts w:ascii="Consolas" w:hAnsi="Consolas" w:cs="Consolas"/>
-          <w:sz w:val="20"/>
-          <w:szCs w:val="20"/>
-        </w:rPr>
-        <w:t>=None):</w:t>
+        <w:t xml:space="preserve">    def forward(self, sparse_inputs, dense_inputs=None):</w:t>
       </w:r>
       <w:r>
         <w:rPr>
@@ -5369,97 +3282,7 @@
           <w:szCs w:val="20"/>
         </w:rPr>
         <w:br/>
-        <w:t xml:space="preserve">        </w:t>
-      </w:r>
-      <w:proofErr w:type="spellStart"/>
-      <w:r>
-        <w:rPr>
-          <w:rFonts w:ascii="Consolas" w:hAnsi="Consolas" w:cs="Consolas"/>
-          <w:sz w:val="20"/>
-          <w:szCs w:val="20"/>
-        </w:rPr>
-        <w:t>linear_out</w:t>
-      </w:r>
-      <w:proofErr w:type="spellEnd"/>
-      <w:r>
-        <w:rPr>
-          <w:rFonts w:ascii="Consolas" w:hAnsi="Consolas" w:cs="Consolas"/>
-          <w:sz w:val="20"/>
-          <w:szCs w:val="20"/>
-        </w:rPr>
-        <w:t xml:space="preserve"> = sum(</w:t>
-      </w:r>
-      <w:proofErr w:type="spellStart"/>
-      <w:r>
-        <w:rPr>
-          <w:rFonts w:ascii="Consolas" w:hAnsi="Consolas" w:cs="Consolas"/>
-          <w:sz w:val="20"/>
-          <w:szCs w:val="20"/>
-        </w:rPr>
-        <w:t>self.linear_embeddings</w:t>
-      </w:r>
-      <w:proofErr w:type="spellEnd"/>
-      <w:r>
-        <w:rPr>
-          <w:rFonts w:ascii="Consolas" w:hAnsi="Consolas" w:cs="Consolas"/>
-          <w:sz w:val="20"/>
-          <w:szCs w:val="20"/>
-        </w:rPr>
-        <w:t>[f](</w:t>
-      </w:r>
-      <w:proofErr w:type="spellStart"/>
-      <w:r>
-        <w:rPr>
-          <w:rFonts w:ascii="Consolas" w:hAnsi="Consolas" w:cs="Consolas"/>
-          <w:sz w:val="20"/>
-          <w:szCs w:val="20"/>
-        </w:rPr>
-        <w:t>idx</w:t>
-      </w:r>
-      <w:proofErr w:type="spellEnd"/>
-      <w:r>
-        <w:rPr>
-          <w:rFonts w:ascii="Consolas" w:hAnsi="Consolas" w:cs="Consolas"/>
-          <w:sz w:val="20"/>
-          <w:szCs w:val="20"/>
-        </w:rPr>
-        <w:t xml:space="preserve">) for f, </w:t>
-      </w:r>
-      <w:proofErr w:type="spellStart"/>
-      <w:r>
-        <w:rPr>
-          <w:rFonts w:ascii="Consolas" w:hAnsi="Consolas" w:cs="Consolas"/>
-          <w:sz w:val="20"/>
-          <w:szCs w:val="20"/>
-        </w:rPr>
-        <w:t>idx</w:t>
-      </w:r>
-      <w:proofErr w:type="spellEnd"/>
-      <w:r>
-        <w:rPr>
-          <w:rFonts w:ascii="Consolas" w:hAnsi="Consolas" w:cs="Consolas"/>
-          <w:sz w:val="20"/>
-          <w:szCs w:val="20"/>
-        </w:rPr>
-        <w:t xml:space="preserve"> in </w:t>
-      </w:r>
-      <w:proofErr w:type="spellStart"/>
-      <w:r>
-        <w:rPr>
-          <w:rFonts w:ascii="Consolas" w:hAnsi="Consolas" w:cs="Consolas"/>
-          <w:sz w:val="20"/>
-          <w:szCs w:val="20"/>
-        </w:rPr>
-        <w:t>sparse_inputs.items</w:t>
-      </w:r>
-      <w:proofErr w:type="spellEnd"/>
-      <w:r>
-        <w:rPr>
-          <w:rFonts w:ascii="Consolas" w:hAnsi="Consolas" w:cs="Consolas"/>
-          <w:sz w:val="20"/>
-          <w:szCs w:val="20"/>
-        </w:rPr>
-        <w:t>())</w:t>
+        <w:t xml:space="preserve">        linear_out = sum(self.linear_embeddings[f](idx) for f, idx in sparse_inputs.items())</w:t>
       </w:r>
       <w:r>
         <w:rPr>
@@ -5477,124 +3300,16 @@
           <w:szCs w:val="20"/>
         </w:rPr>
         <w:br/>
-        <w:t xml:space="preserve">        stacked = </w:t>
-      </w:r>
-      <w:proofErr w:type="spellStart"/>
+        <w:t xml:space="preserve">        stacked = torch.stack([self.embeddings[f](idx) for f, idx in sparse_inputs.items()], dim=1)</w:t>
+      </w:r>
       <w:r>
         <w:rPr>
           <w:rFonts w:ascii="Consolas" w:hAnsi="Consolas" w:cs="Consolas"/>
           <w:sz w:val="20"/>
           <w:szCs w:val="20"/>
         </w:rPr>
-        <w:t>torch.stack</w:t>
-      </w:r>
-      <w:proofErr w:type="spellEnd"/>
-      <w:r>
-        <w:rPr>
-          <w:rFonts w:ascii="Consolas" w:hAnsi="Consolas" w:cs="Consolas"/>
-          <w:sz w:val="20"/>
-          <w:szCs w:val="20"/>
-        </w:rPr>
-        <w:t>([</w:t>
-      </w:r>
-      <w:proofErr w:type="spellStart"/>
-      <w:r>
-        <w:rPr>
-          <w:rFonts w:ascii="Consolas" w:hAnsi="Consolas" w:cs="Consolas"/>
-          <w:sz w:val="20"/>
-          <w:szCs w:val="20"/>
-        </w:rPr>
-        <w:t>self.embeddings</w:t>
-      </w:r>
-      <w:proofErr w:type="spellEnd"/>
-      <w:r>
-        <w:rPr>
-          <w:rFonts w:ascii="Consolas" w:hAnsi="Consolas" w:cs="Consolas"/>
-          <w:sz w:val="20"/>
-          <w:szCs w:val="20"/>
-        </w:rPr>
-        <w:t>[f](</w:t>
-      </w:r>
-      <w:proofErr w:type="spellStart"/>
-      <w:r>
-        <w:rPr>
-          <w:rFonts w:ascii="Consolas" w:hAnsi="Consolas" w:cs="Consolas"/>
-          <w:sz w:val="20"/>
-          <w:szCs w:val="20"/>
-        </w:rPr>
-        <w:t>idx</w:t>
-      </w:r>
-      <w:proofErr w:type="spellEnd"/>
-      <w:r>
-        <w:rPr>
-          <w:rFonts w:ascii="Consolas" w:hAnsi="Consolas" w:cs="Consolas"/>
-          <w:sz w:val="20"/>
-          <w:szCs w:val="20"/>
-        </w:rPr>
-        <w:t xml:space="preserve">) for f, </w:t>
-      </w:r>
-      <w:proofErr w:type="spellStart"/>
-      <w:r>
-        <w:rPr>
-          <w:rFonts w:ascii="Consolas" w:hAnsi="Consolas" w:cs="Consolas"/>
-          <w:sz w:val="20"/>
-          <w:szCs w:val="20"/>
-        </w:rPr>
-        <w:t>idx</w:t>
-      </w:r>
-      <w:proofErr w:type="spellEnd"/>
-      <w:r>
-        <w:rPr>
-          <w:rFonts w:ascii="Consolas" w:hAnsi="Consolas" w:cs="Consolas"/>
-          <w:sz w:val="20"/>
-          <w:szCs w:val="20"/>
-        </w:rPr>
-        <w:t xml:space="preserve"> in </w:t>
-      </w:r>
-      <w:proofErr w:type="spellStart"/>
-      <w:r>
-        <w:rPr>
-          <w:rFonts w:ascii="Consolas" w:hAnsi="Consolas" w:cs="Consolas"/>
-          <w:sz w:val="20"/>
-          <w:szCs w:val="20"/>
-        </w:rPr>
-        <w:t>sparse_inputs.items</w:t>
-      </w:r>
-      <w:proofErr w:type="spellEnd"/>
-      <w:r>
-        <w:rPr>
-          <w:rFonts w:ascii="Consolas" w:hAnsi="Consolas" w:cs="Consolas"/>
-          <w:sz w:val="20"/>
-          <w:szCs w:val="20"/>
-        </w:rPr>
-        <w:t>()], dim=1)</w:t>
-      </w:r>
-      <w:r>
-        <w:rPr>
-          <w:rFonts w:ascii="Consolas" w:hAnsi="Consolas" w:cs="Consolas"/>
-          <w:sz w:val="20"/>
-          <w:szCs w:val="20"/>
-        </w:rPr>
         <w:br/>
-        <w:t xml:space="preserve">        </w:t>
-      </w:r>
-      <w:proofErr w:type="spellStart"/>
-      <w:r>
-        <w:rPr>
-          <w:rFonts w:ascii="Consolas" w:hAnsi="Consolas" w:cs="Consolas"/>
-          <w:sz w:val="20"/>
-          <w:szCs w:val="20"/>
-        </w:rPr>
-        <w:t>fm_out</w:t>
-      </w:r>
-      <w:proofErr w:type="spellEnd"/>
-      <w:r>
-        <w:rPr>
-          <w:rFonts w:ascii="Consolas" w:hAnsi="Consolas" w:cs="Consolas"/>
-          <w:sz w:val="20"/>
-          <w:szCs w:val="20"/>
-        </w:rPr>
-        <w:t xml:space="preserve"> = self.fm(stacked)</w:t>
+        <w:t xml:space="preserve">        fm_out = self.fm(stacked)</w:t>
       </w:r>
       <w:r>
         <w:rPr>
@@ -5612,124 +3327,16 @@
           <w:szCs w:val="20"/>
         </w:rPr>
         <w:br/>
-        <w:t xml:space="preserve">        </w:t>
-      </w:r>
-      <w:proofErr w:type="spellStart"/>
+        <w:t xml:space="preserve">        dnn_out = self.output_layer(self.dnn(torch.cat([...], dim=1)))</w:t>
+      </w:r>
       <w:r>
         <w:rPr>
           <w:rFonts w:ascii="Consolas" w:hAnsi="Consolas" w:cs="Consolas"/>
           <w:sz w:val="20"/>
           <w:szCs w:val="20"/>
         </w:rPr>
-        <w:t>dnn_out</w:t>
-      </w:r>
-      <w:proofErr w:type="spellEnd"/>
-      <w:r>
-        <w:rPr>
-          <w:rFonts w:ascii="Consolas" w:hAnsi="Consolas" w:cs="Consolas"/>
-          <w:sz w:val="20"/>
-          <w:szCs w:val="20"/>
-        </w:rPr>
-        <w:t xml:space="preserve"> = </w:t>
-      </w:r>
-      <w:proofErr w:type="spellStart"/>
-      <w:r>
-        <w:rPr>
-          <w:rFonts w:ascii="Consolas" w:hAnsi="Consolas" w:cs="Consolas"/>
-          <w:sz w:val="20"/>
-          <w:szCs w:val="20"/>
-        </w:rPr>
-        <w:t>self.output_layer</w:t>
-      </w:r>
-      <w:proofErr w:type="spellEnd"/>
-      <w:r>
-        <w:rPr>
-          <w:rFonts w:ascii="Consolas" w:hAnsi="Consolas" w:cs="Consolas"/>
-          <w:sz w:val="20"/>
-          <w:szCs w:val="20"/>
-        </w:rPr>
-        <w:t>(</w:t>
-      </w:r>
-      <w:proofErr w:type="spellStart"/>
-      <w:r>
-        <w:rPr>
-          <w:rFonts w:ascii="Consolas" w:hAnsi="Consolas" w:cs="Consolas"/>
-          <w:sz w:val="20"/>
-          <w:szCs w:val="20"/>
-        </w:rPr>
-        <w:t>self.dnn</w:t>
-      </w:r>
-      <w:proofErr w:type="spellEnd"/>
-      <w:r>
-        <w:rPr>
-          <w:rFonts w:ascii="Consolas" w:hAnsi="Consolas" w:cs="Consolas"/>
-          <w:sz w:val="20"/>
-          <w:szCs w:val="20"/>
-        </w:rPr>
-        <w:t>(torch.cat([...], dim=1)))</w:t>
-      </w:r>
-      <w:r>
-        <w:rPr>
-          <w:rFonts w:ascii="Consolas" w:hAnsi="Consolas" w:cs="Consolas"/>
-          <w:sz w:val="20"/>
-          <w:szCs w:val="20"/>
-        </w:rPr>
         <w:br/>
-        <w:t xml:space="preserve">        return </w:t>
-      </w:r>
-      <w:proofErr w:type="spellStart"/>
-      <w:r>
-        <w:rPr>
-          <w:rFonts w:ascii="Consolas" w:hAnsi="Consolas" w:cs="Consolas"/>
-          <w:sz w:val="20"/>
-          <w:szCs w:val="20"/>
-        </w:rPr>
-        <w:t>linear_out</w:t>
-      </w:r>
-      <w:proofErr w:type="spellEnd"/>
-      <w:r>
-        <w:rPr>
-          <w:rFonts w:ascii="Consolas" w:hAnsi="Consolas" w:cs="Consolas"/>
-          <w:sz w:val="20"/>
-          <w:szCs w:val="20"/>
-        </w:rPr>
-        <w:t xml:space="preserve"> + </w:t>
-      </w:r>
-      <w:proofErr w:type="spellStart"/>
-      <w:r>
-        <w:rPr>
-          <w:rFonts w:ascii="Consolas" w:hAnsi="Consolas" w:cs="Consolas"/>
-          <w:sz w:val="20"/>
-          <w:szCs w:val="20"/>
-        </w:rPr>
-        <w:t>fm_out</w:t>
-      </w:r>
-      <w:proofErr w:type="spellEnd"/>
-      <w:r>
-        <w:rPr>
-          <w:rFonts w:ascii="Consolas" w:hAnsi="Consolas" w:cs="Consolas"/>
-          <w:sz w:val="20"/>
-          <w:szCs w:val="20"/>
-        </w:rPr>
-        <w:t xml:space="preserve"> + </w:t>
-      </w:r>
-      <w:proofErr w:type="spellStart"/>
-      <w:r>
-        <w:rPr>
-          <w:rFonts w:ascii="Consolas" w:hAnsi="Consolas" w:cs="Consolas"/>
-          <w:sz w:val="20"/>
-          <w:szCs w:val="20"/>
-        </w:rPr>
-        <w:t>dnn_out</w:t>
-      </w:r>
-      <w:proofErr w:type="spellEnd"/>
-      <w:r>
-        <w:rPr>
-          <w:rFonts w:ascii="Consolas" w:hAnsi="Consolas" w:cs="Consolas"/>
-          <w:sz w:val="20"/>
-          <w:szCs w:val="20"/>
-        </w:rPr>
-        <w:t xml:space="preserve">  # Sum all three terms</w:t>
+        <w:t xml:space="preserve">        return linear_out + fm_out + dnn_out  # Sum all three terms</w:t>
       </w:r>
     </w:p>
     <w:p>
@@ -5743,6 +3350,7 @@
       <w:r>
         <w:rPr>
           <w:i/>
+          <w:noProof/>
           <w:color w:val="808080"/>
         </w:rPr>
         <w:drawing>
@@ -5799,23 +3407,7 @@
           <w:i/>
           <w:color w:val="808080"/>
         </w:rPr>
-        <w:t xml:space="preserve">: </w:t>
-      </w:r>
-      <w:proofErr w:type="spellStart"/>
-      <w:r>
-        <w:rPr>
-          <w:i/>
-          <w:color w:val="808080"/>
-        </w:rPr>
-        <w:t>DeepFM</w:t>
-      </w:r>
-      <w:proofErr w:type="spellEnd"/>
-      <w:r>
-        <w:rPr>
-          <w:i/>
-          <w:color w:val="808080"/>
-        </w:rPr>
-        <w:t xml:space="preserve"> architecture showing shared embeddings feeding into parallel FM (pairwise dot products) and Deep (MLP) components, with outputs summed through sigmoid</w:t>
+        <w:t>: DeepFM architecture showing shared embeddings feeding into parallel FM (pairwise dot products) and Deep (MLP) components, with outputs summed through sigmoid</w:t>
       </w:r>
     </w:p>
     <w:p>
@@ -5831,15 +3423,7 @@
         <w:spacing w:after="200" w:line="276" w:lineRule="auto"/>
       </w:pPr>
       <w:r>
-        <w:t xml:space="preserve">The FM component eliminates the manual feature engineering burden that Wide &amp; Deep (Cheng et al., DLRS 2016) introduced. The original Wide &amp; Deep paper (Cheng et al., "Wide &amp; Deep Learning for Recommender Systems," Proceedings of the 1st Workshop on Deep Learning for Recommender Systems, 2016) describes how Google Play used the architecture to serve app recommendations to over one billion active users. In Wide &amp; Deep, the 'wide' linear component requires hand-crafted cross-product features. </w:t>
-      </w:r>
-      <w:proofErr w:type="spellStart"/>
-      <w:r>
-        <w:t>DeepFM</w:t>
-      </w:r>
-      <w:proofErr w:type="spellEnd"/>
-      <w:r>
-        <w:t xml:space="preserve"> replaces this with the FM layer that automatically computes all pairwise interactions:</w:t>
+        <w:t>The FM component eliminates the manual feature engineering burden that Wide &amp; Deep (Cheng et al., DLRS 2016) introduced. The original Wide &amp; Deep paper (Cheng et al., "Wide &amp; Deep Learning for Recommender Systems," Proceedings of the 1st Workshop on Deep Learning for Recommender Systems, 2016) describes how Google Play used the architecture to serve app recommendations to over one billion active users. In Wide &amp; Deep, the 'wide' linear component requires hand-crafted cross-product features. DeepFM replaces this with the FM layer that automatically computes all pairwise interactions:</w:t>
       </w:r>
     </w:p>
     <w:p>
@@ -5853,115 +3437,15 @@
           <w:i/>
           <w:iCs/>
         </w:rPr>
-        <w:t>FM output = sum over all pairs (</w:t>
-      </w:r>
-      <w:proofErr w:type="spellStart"/>
-      <w:proofErr w:type="gramStart"/>
-      <w:r>
-        <w:rPr>
-          <w:rFonts w:ascii="Consolas" w:eastAsia="Consolas" w:hAnsi="Consolas" w:cs="Consolas"/>
-          <w:i/>
-          <w:iCs/>
-        </w:rPr>
-        <w:t>i,j</w:t>
-      </w:r>
-      <w:proofErr w:type="spellEnd"/>
-      <w:proofErr w:type="gramEnd"/>
-      <w:r>
-        <w:rPr>
-          <w:rFonts w:ascii="Consolas" w:eastAsia="Consolas" w:hAnsi="Consolas" w:cs="Consolas"/>
-          <w:i/>
-          <w:iCs/>
-        </w:rPr>
-        <w:t>) of &lt;</w:t>
-      </w:r>
-      <w:proofErr w:type="spellStart"/>
-      <w:r>
-        <w:rPr>
-          <w:rFonts w:ascii="Consolas" w:eastAsia="Consolas" w:hAnsi="Consolas" w:cs="Consolas"/>
-          <w:i/>
-          <w:iCs/>
-        </w:rPr>
-        <w:t>v_i</w:t>
-      </w:r>
-      <w:proofErr w:type="spellEnd"/>
-      <w:r>
-        <w:rPr>
-          <w:rFonts w:ascii="Consolas" w:eastAsia="Consolas" w:hAnsi="Consolas" w:cs="Consolas"/>
-          <w:i/>
-          <w:iCs/>
-        </w:rPr>
-        <w:t xml:space="preserve">, </w:t>
-      </w:r>
-      <w:proofErr w:type="spellStart"/>
-      <w:r>
-        <w:rPr>
-          <w:rFonts w:ascii="Consolas" w:eastAsia="Consolas" w:hAnsi="Consolas" w:cs="Consolas"/>
-          <w:i/>
-          <w:iCs/>
-        </w:rPr>
-        <w:t>v_j</w:t>
-      </w:r>
-      <w:proofErr w:type="spellEnd"/>
-      <w:r>
-        <w:rPr>
-          <w:rFonts w:ascii="Consolas" w:eastAsia="Consolas" w:hAnsi="Consolas" w:cs="Consolas"/>
-          <w:i/>
-          <w:iCs/>
-        </w:rPr>
-        <w:t xml:space="preserve">&gt; * </w:t>
-      </w:r>
-      <w:proofErr w:type="spellStart"/>
-      <w:r>
-        <w:rPr>
-          <w:rFonts w:ascii="Consolas" w:eastAsia="Consolas" w:hAnsi="Consolas" w:cs="Consolas"/>
-          <w:i/>
-          <w:iCs/>
-        </w:rPr>
-        <w:t>x_i</w:t>
-      </w:r>
-      <w:proofErr w:type="spellEnd"/>
-      <w:r>
-        <w:rPr>
-          <w:rFonts w:ascii="Consolas" w:eastAsia="Consolas" w:hAnsi="Consolas" w:cs="Consolas"/>
-          <w:i/>
-          <w:iCs/>
-        </w:rPr>
-        <w:t xml:space="preserve"> * </w:t>
-      </w:r>
-      <w:proofErr w:type="spellStart"/>
-      <w:r>
-        <w:rPr>
-          <w:rFonts w:ascii="Consolas" w:eastAsia="Consolas" w:hAnsi="Consolas" w:cs="Consolas"/>
-          <w:i/>
-          <w:iCs/>
-        </w:rPr>
-        <w:t>x_j</w:t>
-      </w:r>
-      <w:proofErr w:type="spellEnd"/>
+        <w:t>FM output = sum over all pairs (i,j) of &lt;v_i, v_j&gt; * x_i * x_j</w:t>
+      </w:r>
     </w:p>
     <w:p>
       <w:pPr>
         <w:spacing w:after="200" w:line="276" w:lineRule="auto"/>
       </w:pPr>
       <w:r>
-        <w:t xml:space="preserve">where </w:t>
-      </w:r>
-      <w:proofErr w:type="spellStart"/>
-      <w:r>
-        <w:t>v_i</w:t>
-      </w:r>
-      <w:proofErr w:type="spellEnd"/>
-      <w:r>
-        <w:t xml:space="preserve"> is the embedding vector for feature </w:t>
-      </w:r>
-      <w:proofErr w:type="spellStart"/>
-      <w:r>
-        <w:t>i</w:t>
-      </w:r>
-      <w:proofErr w:type="spellEnd"/>
-      <w:r>
-        <w:t>. The FM trick makes this computation efficient: O(n*k) instead of O(n^2*k) where n is the number of features and k is the embedding dimension.</w:t>
+        <w:t>where v_i is the embedding vector for feature i. The FM trick makes this computation efficient: O(n*k) instead of O(n^2*k) where n is the number of features and k is the embedding dimension.</w:t>
       </w:r>
     </w:p>
     <w:p>
@@ -5969,13 +3453,8 @@
         <w:pStyle w:val="Heading3"/>
       </w:pPr>
       <w:r>
-        <w:t xml:space="preserve">6.5.3 When to Use </w:t>
-      </w:r>
-      <w:proofErr w:type="spellStart"/>
-      <w:r>
-        <w:t>DeepFM</w:t>
-      </w:r>
-      <w:proofErr w:type="spellEnd"/>
+        <w:t>6.5.3 When to Use DeepFM</w:t>
+      </w:r>
     </w:p>
     <w:p>
       <w:pPr>
@@ -6229,17 +3708,8 @@
                 <w:sz w:val="22"/>
                 <w:szCs w:val="22"/>
               </w:rPr>
-              <w:t xml:space="preserve"> to </w:t>
-            </w:r>
-            <w:proofErr w:type="gramStart"/>
-            <w:r>
-              <w:rPr>
-                <w:sz w:val="22"/>
-                <w:szCs w:val="22"/>
-              </w:rPr>
-              <w:t>low billions</w:t>
-            </w:r>
-            <w:proofErr w:type="gramEnd"/>
+              <w:t xml:space="preserve"> to low billions</w:t>
+            </w:r>
             <w:r>
               <w:rPr>
                 <w:sz w:val="22"/>
@@ -6477,23 +3947,7 @@
                 <w:sz w:val="22"/>
                 <w:szCs w:val="22"/>
               </w:rPr>
-              <w:t xml:space="preserve">Moderate (GBDT, </w:t>
-            </w:r>
-            <w:proofErr w:type="spellStart"/>
-            <w:r>
-              <w:rPr>
-                <w:sz w:val="22"/>
-                <w:szCs w:val="22"/>
-              </w:rPr>
-              <w:t>DeepFM</w:t>
-            </w:r>
-            <w:proofErr w:type="spellEnd"/>
-            <w:r>
-              <w:rPr>
-                <w:sz w:val="22"/>
-                <w:szCs w:val="22"/>
-              </w:rPr>
-              <w:t>)</w:t>
+              <w:t>Moderate (GBDT, DeepFM)</w:t>
             </w:r>
           </w:p>
         </w:tc>
@@ -6582,21 +4036,12 @@
             <w:pPr>
               <w:spacing w:after="60"/>
             </w:pPr>
-            <w:proofErr w:type="gramStart"/>
             <w:r>
               <w:rPr>
                 <w:sz w:val="22"/>
                 <w:szCs w:val="22"/>
               </w:rPr>
-              <w:t>Cross-features</w:t>
-            </w:r>
-            <w:proofErr w:type="gramEnd"/>
-            <w:r>
-              <w:rPr>
-                <w:sz w:val="22"/>
-                <w:szCs w:val="22"/>
-              </w:rPr>
-              <w:t>, aggregates, context</w:t>
+              <w:t>Cross-features, aggregates, context</w:t>
             </w:r>
           </w:p>
         </w:tc>
@@ -6655,7 +4100,6 @@
             <w:pPr>
               <w:spacing w:after="60"/>
             </w:pPr>
-            <w:proofErr w:type="spellStart"/>
             <w:r>
               <w:rPr>
                 <w:sz w:val="22"/>
@@ -6663,7 +4107,6 @@
               </w:rPr>
               <w:t>Recall@K</w:t>
             </w:r>
-            <w:proofErr w:type="spellEnd"/>
           </w:p>
         </w:tc>
         <w:tc>
@@ -6866,15 +4309,7 @@
         <w:t xml:space="preserve">Feature computation: </w:t>
       </w:r>
       <w:r>
-        <w:t xml:space="preserve">Feature fetching often dominates end-to-end latency. Pre-computing and </w:t>
-      </w:r>
-      <w:proofErr w:type="gramStart"/>
-      <w:r>
-        <w:t>caching</w:t>
-      </w:r>
-      <w:proofErr w:type="gramEnd"/>
-      <w:r>
-        <w:t xml:space="preserve"> user features in a feature store (Chapter 4) is critical.</w:t>
+        <w:t>Feature fetching often dominates end-to-end latency. Pre-computing and caching user features in a feature store (Chapter 4) is critical.</w:t>
       </w:r>
     </w:p>
     <w:p>
@@ -6941,23 +4376,7 @@
         <w:spacing w:after="120" w:line="276" w:lineRule="auto"/>
       </w:pPr>
       <w:r>
-        <w:t xml:space="preserve">For </w:t>
-      </w:r>
-      <w:proofErr w:type="spellStart"/>
-      <w:r>
-        <w:t>DeepFM</w:t>
-      </w:r>
-      <w:proofErr w:type="spellEnd"/>
-      <w:r>
-        <w:t xml:space="preserve">, export the trained model as ONNX or </w:t>
-      </w:r>
-      <w:proofErr w:type="spellStart"/>
-      <w:r>
-        <w:t>TorchScript</w:t>
-      </w:r>
-      <w:proofErr w:type="spellEnd"/>
-      <w:r>
-        <w:t xml:space="preserve"> for optimized inference</w:t>
+        <w:t>For DeepFM, export the trained model as ONNX or TorchScript for optimized inference</w:t>
       </w:r>
     </w:p>
     <w:p>
@@ -6986,15 +4405,7 @@
         <w:spacing w:after="200" w:line="276" w:lineRule="auto"/>
       </w:pPr>
       <w:r>
-        <w:t xml:space="preserve">The first-stage ranker is not meant to be the final answer. It is a filter that ensures the most promising candidates proceed to a more sophisticated second stage. Consider adding a </w:t>
-      </w:r>
-      <w:proofErr w:type="gramStart"/>
-      <w:r>
-        <w:t>second-stage</w:t>
-      </w:r>
-      <w:proofErr w:type="gramEnd"/>
-      <w:r>
-        <w:t xml:space="preserve"> (heavy) ranker when:</w:t>
+        <w:t>The first-stage ranker is not meant to be the final answer. It is a filter that ensures the most promising candidates proceed to a more sophisticated second stage. Consider adding a second-stage (heavy) ranker when:</w:t>
       </w:r>
     </w:p>
     <w:p>
@@ -7007,15 +4418,7 @@
         <w:spacing w:after="120" w:line="276" w:lineRule="auto"/>
       </w:pPr>
       <w:r>
-        <w:t xml:space="preserve">Your first-stage ranker's capacity is bottlenecked by latency </w:t>
-      </w:r>
-      <w:proofErr w:type="gramStart"/>
-      <w:r>
-        <w:t>constraints</w:t>
-      </w:r>
-      <w:proofErr w:type="gramEnd"/>
-      <w:r>
-        <w:t xml:space="preserve"> and you have measurable headroom in relevance</w:t>
+        <w:t>Your first-stage ranker's capacity is bottlenecked by latency constraints and you have measurable headroom in relevance</w:t>
       </w:r>
     </w:p>
     <w:p>
@@ -7063,23 +4466,7 @@
         <w:spacing w:after="200" w:line="276" w:lineRule="auto"/>
       </w:pPr>
       <w:r>
-        <w:t xml:space="preserve">Chapter 7 covers the </w:t>
-      </w:r>
-      <w:proofErr w:type="gramStart"/>
-      <w:r>
-        <w:t>second-stage</w:t>
-      </w:r>
-      <w:proofErr w:type="gramEnd"/>
-      <w:r>
-        <w:t xml:space="preserve"> (heavy) ranker in detail, including DCN-V2, DLRM, and multi-task models like </w:t>
-      </w:r>
-      <w:proofErr w:type="spellStart"/>
-      <w:r>
-        <w:t>MMoE</w:t>
-      </w:r>
-      <w:proofErr w:type="spellEnd"/>
-      <w:r>
-        <w:t>.</w:t>
+        <w:t>Chapter 7 covers the second-stage (heavy) ranker in detail, including DCN-V2, DLRM, and multi-task models like MMoE.</w:t>
       </w:r>
     </w:p>
     <w:p>
@@ -7087,47 +4474,32 @@
         <w:pStyle w:val="Heading2"/>
       </w:pPr>
       <w:r>
-        <w:t xml:space="preserve">6.8 Code Tutorial: XGBoost Ranking on </w:t>
-      </w:r>
-      <w:proofErr w:type="spellStart"/>
+        <w:t>6.8 Code Tutorial: XGBoost Ranking on Yambda</w:t>
+      </w:r>
+    </w:p>
+    <w:p>
+      <w:pPr>
+        <w:spacing w:after="200" w:line="276" w:lineRule="auto"/>
+      </w:pPr>
+      <w:r>
+        <w:t>The code tutorial for this chapter demonstrates first-stage ranking using the Yandex Yambda dataset, a large-scale music recommendation dataset with 50 million user-item interactions.</w:t>
+      </w:r>
+    </w:p>
+    <w:p>
+      <w:pPr>
+        <w:pStyle w:val="Heading3"/>
+      </w:pPr>
+      <w:r>
+        <w:t>6.8.1 Dataset and Evaluation Protocol</w:t>
+      </w:r>
+    </w:p>
+    <w:p>
+      <w:pPr>
+        <w:spacing w:after="200" w:line="276" w:lineRule="auto"/>
+      </w:pPr>
       <w:r>
         <w:t>Yambda</w:t>
       </w:r>
-      <w:proofErr w:type="spellEnd"/>
-    </w:p>
-    <w:p>
-      <w:pPr>
-        <w:spacing w:after="200" w:line="276" w:lineRule="auto"/>
-      </w:pPr>
-      <w:r>
-        <w:t xml:space="preserve">The code tutorial for this chapter demonstrates first-stage ranking using the Yandex </w:t>
-      </w:r>
-      <w:proofErr w:type="spellStart"/>
-      <w:r>
-        <w:t>Yambda</w:t>
-      </w:r>
-      <w:proofErr w:type="spellEnd"/>
-      <w:r>
-        <w:t xml:space="preserve"> dataset, a large-scale music recommendation dataset with 50 million user-item interactions.</w:t>
-      </w:r>
-    </w:p>
-    <w:p>
-      <w:pPr>
-        <w:pStyle w:val="Heading3"/>
-      </w:pPr>
-      <w:r>
-        <w:t>6.8.1 Dataset and Evaluation Protocol</w:t>
-      </w:r>
-    </w:p>
-    <w:p>
-      <w:pPr>
-        <w:spacing w:after="200" w:line="276" w:lineRule="auto"/>
-      </w:pPr>
-      <w:proofErr w:type="spellStart"/>
-      <w:r>
-        <w:t>Yambda</w:t>
-      </w:r>
-      <w:proofErr w:type="spellEnd"/>
       <w:r>
         <w:t xml:space="preserve"> dataset</w:t>
       </w:r>
@@ -7144,15 +4516,7 @@
         <w:t xml:space="preserve">is defined </w:t>
       </w:r>
       <w:r>
-        <w:t xml:space="preserve">as </w:t>
-      </w:r>
-      <w:proofErr w:type="spellStart"/>
-      <w:r>
-        <w:t>played_ratio</w:t>
-      </w:r>
-      <w:proofErr w:type="spellEnd"/>
-      <w:r>
-        <w:t xml:space="preserve"> &gt;= 50%, a proxy for meaningful engagement.</w:t>
+        <w:t>as played_ratio &gt;= 50%, a proxy for meaningful engagement.</w:t>
       </w:r>
     </w:p>
     <w:p>
@@ -7201,35 +4565,7 @@
         <w:spacing w:after="200" w:line="276" w:lineRule="auto"/>
       </w:pPr>
       <w:r>
-        <w:t>We train both a pointwise classifier (</w:t>
-      </w:r>
-      <w:proofErr w:type="spellStart"/>
-      <w:proofErr w:type="gramStart"/>
-      <w:r>
-        <w:t>binary:logistic</w:t>
-      </w:r>
-      <w:proofErr w:type="spellEnd"/>
-      <w:proofErr w:type="gramEnd"/>
-      <w:r>
-        <w:t xml:space="preserve"> objective) and a pairwise ranker (</w:t>
-      </w:r>
-      <w:proofErr w:type="spellStart"/>
-      <w:proofErr w:type="gramStart"/>
-      <w:r>
-        <w:t>rank:pairwise</w:t>
-      </w:r>
-      <w:proofErr w:type="spellEnd"/>
-      <w:proofErr w:type="gramEnd"/>
-      <w:r>
-        <w:t xml:space="preserve"> with </w:t>
-      </w:r>
-      <w:proofErr w:type="spellStart"/>
-      <w:r>
-        <w:t>LambdaMART</w:t>
-      </w:r>
-      <w:proofErr w:type="spellEnd"/>
-      <w:r>
-        <w:t>) and compare their performance on AUC, log loss, and NDCG metrics. The tutorial also demonstrates hyperparameter tuning with early stopping and the impact of training data volume on model performance.</w:t>
+        <w:t>We train both a pointwise classifier (binary:logistic objective) and a pairwise ranker (rank:pairwise with LambdaMART) and compare their performance on AUC, log loss, and NDCG metrics. The tutorial also demonstrates hyperparameter tuning with early stopping and the impact of training data volume on model performance.</w:t>
       </w:r>
     </w:p>
     <w:p>
@@ -7329,15 +4665,7 @@
         <w:spacing w:after="120" w:line="276" w:lineRule="auto"/>
       </w:pPr>
       <w:r>
-        <w:t xml:space="preserve">The first-stage ranker bridges the gap between fast-but-coarse retrieval and precise-but-expensive </w:t>
-      </w:r>
-      <w:proofErr w:type="gramStart"/>
-      <w:r>
-        <w:t>second-stage</w:t>
-      </w:r>
-      <w:proofErr w:type="gramEnd"/>
-      <w:r>
-        <w:t xml:space="preserve"> ranking</w:t>
+        <w:t>The first-stage ranker bridges the gap between fast-but-coarse retrieval and precise-but-expensive second-stage ranking</w:t>
       </w:r>
     </w:p>
     <w:p>
@@ -7376,23 +4704,7 @@
         <w:spacing w:after="120" w:line="276" w:lineRule="auto"/>
       </w:pPr>
       <w:r>
-        <w:t xml:space="preserve">Gradient boosted trees (XGBoost, </w:t>
-      </w:r>
-      <w:proofErr w:type="spellStart"/>
-      <w:r>
-        <w:t>LightGBM</w:t>
-      </w:r>
-      <w:proofErr w:type="spellEnd"/>
-      <w:r>
-        <w:t xml:space="preserve">) offer an excellent accuracy-to-complexity ratio for </w:t>
-      </w:r>
-      <w:proofErr w:type="gramStart"/>
-      <w:r>
-        <w:t>first-stage</w:t>
-      </w:r>
-      <w:proofErr w:type="gramEnd"/>
-      <w:r>
-        <w:t xml:space="preserve"> ranking</w:t>
+        <w:t>Gradient boosted trees (XGBoost, LightGBM) offer an excellent accuracy-to-complexity ratio for first-stage ranking</w:t>
       </w:r>
     </w:p>
     <w:p>
@@ -7404,13 +4716,8 @@
         </w:numPr>
         <w:spacing w:after="120" w:line="276" w:lineRule="auto"/>
       </w:pPr>
-      <w:proofErr w:type="spellStart"/>
-      <w:r>
-        <w:t>DeepFM</w:t>
-      </w:r>
-      <w:proofErr w:type="spellEnd"/>
-      <w:r>
-        <w:t xml:space="preserve"> automates pairwise feature crosses while adding a deep component for higher-order interactions</w:t>
+      <w:r>
+        <w:t>DeepFM automates pairwise feature crosses while adding a deep component for higher-order interactions</w:t>
       </w:r>
     </w:p>
     <w:p>
@@ -7467,7 +4774,6 @@
         </w:rPr>
         <w:t xml:space="preserve">Guo, H., Tang, R., Ye, Y., Li, Z., &amp; He, X. (2017). </w:t>
       </w:r>
-      <w:proofErr w:type="spellStart"/>
       <w:r>
         <w:rPr>
           <w:i/>
@@ -7475,17 +4781,7 @@
           <w:sz w:val="22"/>
           <w:szCs w:val="22"/>
         </w:rPr>
-        <w:t>DeepFM</w:t>
-      </w:r>
-      <w:proofErr w:type="spellEnd"/>
-      <w:r>
-        <w:rPr>
-          <w:i/>
-          <w:iCs/>
-          <w:sz w:val="22"/>
-          <w:szCs w:val="22"/>
-        </w:rPr>
-        <w:t>: A Factorization-Machine based Neural Network for CTR Prediction.</w:t>
+        <w:t>DeepFM: A Factorization-Machine based Neural Network for CTR Prediction.</w:t>
       </w:r>
       <w:r>
         <w:rPr>
@@ -7509,23 +4805,7 @@
           <w:sz w:val="22"/>
           <w:szCs w:val="22"/>
         </w:rPr>
-        <w:t xml:space="preserve">Chen, T., &amp; </w:t>
-      </w:r>
-      <w:proofErr w:type="spellStart"/>
-      <w:r>
-        <w:rPr>
-          <w:sz w:val="22"/>
-          <w:szCs w:val="22"/>
-        </w:rPr>
-        <w:t>Guestrin</w:t>
-      </w:r>
-      <w:proofErr w:type="spellEnd"/>
-      <w:r>
-        <w:rPr>
-          <w:sz w:val="22"/>
-          <w:szCs w:val="22"/>
-        </w:rPr>
-        <w:t xml:space="preserve">, C. (2016). </w:t>
+        <w:t xml:space="preserve">Chen, T., &amp; Guestrin, C. (2016). </w:t>
       </w:r>
       <w:r>
         <w:rPr>
@@ -7567,67 +4847,7 @@
           <w:sz w:val="22"/>
           <w:szCs w:val="22"/>
         </w:rPr>
-        <w:t xml:space="preserve">From </w:t>
-      </w:r>
-      <w:proofErr w:type="spellStart"/>
-      <w:r>
-        <w:rPr>
-          <w:i/>
-          <w:iCs/>
-          <w:sz w:val="22"/>
-          <w:szCs w:val="22"/>
-        </w:rPr>
-        <w:t>RankNet</w:t>
-      </w:r>
-      <w:proofErr w:type="spellEnd"/>
-      <w:r>
-        <w:rPr>
-          <w:i/>
-          <w:iCs/>
-          <w:sz w:val="22"/>
-          <w:szCs w:val="22"/>
-        </w:rPr>
-        <w:t xml:space="preserve"> to </w:t>
-      </w:r>
-      <w:proofErr w:type="spellStart"/>
-      <w:r>
-        <w:rPr>
-          <w:i/>
-          <w:iCs/>
-          <w:sz w:val="22"/>
-          <w:szCs w:val="22"/>
-        </w:rPr>
-        <w:t>LambdaRank</w:t>
-      </w:r>
-      <w:proofErr w:type="spellEnd"/>
-      <w:r>
-        <w:rPr>
-          <w:i/>
-          <w:iCs/>
-          <w:sz w:val="22"/>
-          <w:szCs w:val="22"/>
-        </w:rPr>
-        <w:t xml:space="preserve"> to </w:t>
-      </w:r>
-      <w:proofErr w:type="spellStart"/>
-      <w:r>
-        <w:rPr>
-          <w:i/>
-          <w:iCs/>
-          <w:sz w:val="22"/>
-          <w:szCs w:val="22"/>
-        </w:rPr>
-        <w:t>LambdaMART</w:t>
-      </w:r>
-      <w:proofErr w:type="spellEnd"/>
-      <w:r>
-        <w:rPr>
-          <w:i/>
-          <w:iCs/>
-          <w:sz w:val="22"/>
-          <w:szCs w:val="22"/>
-        </w:rPr>
-        <w:t>: An Overview.</w:t>
+        <w:t>From RankNet to LambdaRank to LambdaMART: An Overview.</w:t>
       </w:r>
       <w:r>
         <w:rPr>
@@ -7675,23 +4895,7 @@
           <w:sz w:val="22"/>
           <w:szCs w:val="22"/>
         </w:rPr>
-        <w:t xml:space="preserve"> DLRS Workshop, </w:t>
-      </w:r>
-      <w:proofErr w:type="spellStart"/>
-      <w:r>
-        <w:rPr>
-          <w:sz w:val="22"/>
-          <w:szCs w:val="22"/>
-        </w:rPr>
-        <w:t>RecSys</w:t>
-      </w:r>
-      <w:proofErr w:type="spellEnd"/>
-      <w:r>
-        <w:rPr>
-          <w:sz w:val="22"/>
-          <w:szCs w:val="22"/>
-        </w:rPr>
-        <w:t xml:space="preserve"> 2016.</w:t>
+        <w:t xml:space="preserve"> DLRS Workshop, RecSys 2016.</w:t>
       </w:r>
     </w:p>
     <w:p>
@@ -7776,7 +4980,6 @@
         </w:rPr>
         <w:t xml:space="preserve">Ke, G. et al. (2017). </w:t>
       </w:r>
-      <w:proofErr w:type="spellStart"/>
       <w:r>
         <w:rPr>
           <w:i/>
@@ -7784,40 +4987,14 @@
           <w:sz w:val="22"/>
           <w:szCs w:val="22"/>
         </w:rPr>
-        <w:t>LightGBM</w:t>
-      </w:r>
-      <w:proofErr w:type="spellEnd"/>
-      <w:r>
-        <w:rPr>
-          <w:i/>
-          <w:iCs/>
+        <w:t>LightGBM: A Highly Efficient Gradient Boosting Decision Tree.</w:t>
+      </w:r>
+      <w:r>
+        <w:rPr>
           <w:sz w:val="22"/>
           <w:szCs w:val="22"/>
         </w:rPr>
-        <w:t>: A Highly Efficient Gradient Boosting Decision Tree.</w:t>
-      </w:r>
-      <w:r>
-        <w:rPr>
-          <w:sz w:val="22"/>
-          <w:szCs w:val="22"/>
-        </w:rPr>
-        <w:t xml:space="preserve"> </w:t>
-      </w:r>
-      <w:proofErr w:type="spellStart"/>
-      <w:r>
-        <w:rPr>
-          <w:sz w:val="22"/>
-          <w:szCs w:val="22"/>
-        </w:rPr>
-        <w:t>NeurIPS</w:t>
-      </w:r>
-      <w:proofErr w:type="spellEnd"/>
-      <w:r>
-        <w:rPr>
-          <w:sz w:val="22"/>
-          <w:szCs w:val="22"/>
-        </w:rPr>
-        <w:t xml:space="preserve"> 2017.</w:t>
+        <w:t xml:space="preserve"> NeurIPS 2017.</w:t>
       </w:r>
     </w:p>
     <w:sectPr>
@@ -7935,46 +5112,14 @@
           <w:sz w:val="18"/>
           <w:szCs w:val="18"/>
         </w:rPr>
-        <w:t xml:space="preserve">If you are starting with a completely new </w:t>
-      </w:r>
-      <w:proofErr w:type="spellStart"/>
+        <w:t xml:space="preserve">If you are starting with a completely new recsys stack, try with a single ranking stage before </w:t>
+      </w:r>
       <w:r>
         <w:rPr>
           <w:sz w:val="18"/>
           <w:szCs w:val="18"/>
         </w:rPr>
-        <w:t>recsys</w:t>
-      </w:r>
-      <w:proofErr w:type="spellEnd"/>
-      <w:r>
-        <w:rPr>
-          <w:sz w:val="18"/>
-          <w:szCs w:val="18"/>
-        </w:rPr>
-        <w:t xml:space="preserve"> stack, try with a single ranking stage before </w:t>
-      </w:r>
-      <w:r>
-        <w:rPr>
-          <w:sz w:val="18"/>
-          <w:szCs w:val="18"/>
-        </w:rPr>
-        <w:t xml:space="preserve">moving to separate light vs heavy </w:t>
-      </w:r>
-      <w:proofErr w:type="spellStart"/>
-      <w:r>
-        <w:rPr>
-          <w:sz w:val="18"/>
-          <w:szCs w:val="18"/>
-        </w:rPr>
-        <w:t>rerankers</w:t>
-      </w:r>
-      <w:proofErr w:type="spellEnd"/>
-      <w:r>
-        <w:rPr>
-          <w:sz w:val="18"/>
-          <w:szCs w:val="18"/>
-        </w:rPr>
-        <w:t xml:space="preserve">. </w:t>
+        <w:t xml:space="preserve">moving to separate light vs heavy rerankers. </w:t>
       </w:r>
     </w:p>
   </w:footnote>

</xml_diff>

<commit_message>
Update Chapter 6 - Ranking Basics with revised docx and v3 PDF
</commit_message>
<xml_diff>
--- a/chapters/Chapter 06/Chapter 06 - Ranking Basics.docx
+++ b/chapters/Chapter 06/Chapter 06 - Ranking Basics.docx
@@ -161,7 +161,15 @@
         <w:spacing w:after="120" w:line="276" w:lineRule="auto"/>
       </w:pPr>
       <w:r>
-        <w:t xml:space="preserve">Each item receives an independent score with no awareness of what other candidates are in the list. </w:t>
+        <w:t xml:space="preserve">Each item receives an independent score with no awareness of what other candidates are </w:t>
+      </w:r>
+      <w:proofErr w:type="gramStart"/>
+      <w:r>
+        <w:t>in</w:t>
+      </w:r>
+      <w:proofErr w:type="gramEnd"/>
+      <w:r>
+        <w:t xml:space="preserve"> the list. </w:t>
       </w:r>
       <w:r>
         <w:t>Does not directly optimize the ordering of items relative to each other.</w:t>
@@ -175,7 +183,33 @@
         <w:t>Even if the pointwise score is not calibrated to be the probability of a click</w:t>
       </w:r>
       <w:r>
-        <w:t>, pointwise approaches work well in practice because ranking only requires monotonic scores: if P(click|item A) &gt; P(click|item B), the ranker will place A above B regardless of the absolute probability values</w:t>
+        <w:t xml:space="preserve">, pointwise approaches work well in practice because ranking only requires monotonic scores: if </w:t>
+      </w:r>
+      <w:proofErr w:type="gramStart"/>
+      <w:r>
+        <w:t>P(</w:t>
+      </w:r>
+      <w:proofErr w:type="spellStart"/>
+      <w:proofErr w:type="gramEnd"/>
+      <w:r>
+        <w:t>click|item</w:t>
+      </w:r>
+      <w:proofErr w:type="spellEnd"/>
+      <w:r>
+        <w:t xml:space="preserve"> A) &gt; </w:t>
+      </w:r>
+      <w:proofErr w:type="gramStart"/>
+      <w:r>
+        <w:t>P(</w:t>
+      </w:r>
+      <w:proofErr w:type="spellStart"/>
+      <w:proofErr w:type="gramEnd"/>
+      <w:r>
+        <w:t>click|item</w:t>
+      </w:r>
+      <w:proofErr w:type="spellEnd"/>
+      <w:r>
+        <w:t xml:space="preserve"> B), the ranker will place A above B regardless of the absolute probability values</w:t>
       </w:r>
     </w:p>
     <w:p>
@@ -224,8 +258,36 @@
           <w:szCs w:val="20"/>
         </w:rPr>
         <w:br/>
-        <w:t>import xgboost as xgb</w:t>
-      </w:r>
+        <w:t xml:space="preserve">import </w:t>
+      </w:r>
+      <w:proofErr w:type="spellStart"/>
+      <w:r>
+        <w:rPr>
+          <w:rFonts w:ascii="Consolas" w:hAnsi="Consolas" w:cs="Consolas"/>
+          <w:sz w:val="20"/>
+          <w:szCs w:val="20"/>
+        </w:rPr>
+        <w:t>xgboost</w:t>
+      </w:r>
+      <w:proofErr w:type="spellEnd"/>
+      <w:r>
+        <w:rPr>
+          <w:rFonts w:ascii="Consolas" w:hAnsi="Consolas" w:cs="Consolas"/>
+          <w:sz w:val="20"/>
+          <w:szCs w:val="20"/>
+        </w:rPr>
+        <w:t xml:space="preserve"> as </w:t>
+      </w:r>
+      <w:proofErr w:type="spellStart"/>
+      <w:r>
+        <w:rPr>
+          <w:rFonts w:ascii="Consolas" w:hAnsi="Consolas" w:cs="Consolas"/>
+          <w:sz w:val="20"/>
+          <w:szCs w:val="20"/>
+        </w:rPr>
+        <w:t>xgb</w:t>
+      </w:r>
+      <w:proofErr w:type="spellEnd"/>
       <w:r>
         <w:rPr>
           <w:rFonts w:ascii="Consolas" w:hAnsi="Consolas" w:cs="Consolas"/>
@@ -241,7 +303,25 @@
           <w:szCs w:val="20"/>
         </w:rPr>
         <w:br/>
-        <w:t>model = xgb.XGBClassifier(</w:t>
+        <w:t xml:space="preserve">model = </w:t>
+      </w:r>
+      <w:proofErr w:type="spellStart"/>
+      <w:r>
+        <w:rPr>
+          <w:rFonts w:ascii="Consolas" w:hAnsi="Consolas" w:cs="Consolas"/>
+          <w:sz w:val="20"/>
+          <w:szCs w:val="20"/>
+        </w:rPr>
+        <w:t>xgb.XGBClassifier</w:t>
+      </w:r>
+      <w:proofErr w:type="spellEnd"/>
+      <w:r>
+        <w:rPr>
+          <w:rFonts w:ascii="Consolas" w:hAnsi="Consolas" w:cs="Consolas"/>
+          <w:sz w:val="20"/>
+          <w:szCs w:val="20"/>
+        </w:rPr>
+        <w:t>(</w:t>
       </w:r>
       <w:r>
         <w:rPr>
@@ -250,7 +330,25 @@
           <w:szCs w:val="20"/>
         </w:rPr>
         <w:br/>
-        <w:t xml:space="preserve">    objective='binary:logistic',   # Pointwise: independent P(click) per item</w:t>
+        <w:t xml:space="preserve">    objective='</w:t>
+      </w:r>
+      <w:proofErr w:type="spellStart"/>
+      <w:r>
+        <w:rPr>
+          <w:rFonts w:ascii="Consolas" w:hAnsi="Consolas" w:cs="Consolas"/>
+          <w:sz w:val="20"/>
+          <w:szCs w:val="20"/>
+        </w:rPr>
+        <w:t>binary:logistic</w:t>
+      </w:r>
+      <w:proofErr w:type="spellEnd"/>
+      <w:r>
+        <w:rPr>
+          <w:rFonts w:ascii="Consolas" w:hAnsi="Consolas" w:cs="Consolas"/>
+          <w:sz w:val="20"/>
+          <w:szCs w:val="20"/>
+        </w:rPr>
+        <w:t>',   # Pointwise: independent P(click) per item</w:t>
       </w:r>
       <w:r>
         <w:rPr>
@@ -259,7 +357,43 @@
           <w:szCs w:val="20"/>
         </w:rPr>
         <w:br/>
-        <w:t xml:space="preserve">    eval_metric='auc',</w:t>
+        <w:t xml:space="preserve">    </w:t>
+      </w:r>
+      <w:proofErr w:type="spellStart"/>
+      <w:r>
+        <w:rPr>
+          <w:rFonts w:ascii="Consolas" w:hAnsi="Consolas" w:cs="Consolas"/>
+          <w:sz w:val="20"/>
+          <w:szCs w:val="20"/>
+        </w:rPr>
+        <w:t>eval_metric</w:t>
+      </w:r>
+      <w:proofErr w:type="spellEnd"/>
+      <w:r>
+        <w:rPr>
+          <w:rFonts w:ascii="Consolas" w:hAnsi="Consolas" w:cs="Consolas"/>
+          <w:sz w:val="20"/>
+          <w:szCs w:val="20"/>
+        </w:rPr>
+        <w:t>='</w:t>
+      </w:r>
+      <w:proofErr w:type="spellStart"/>
+      <w:r>
+        <w:rPr>
+          <w:rFonts w:ascii="Consolas" w:hAnsi="Consolas" w:cs="Consolas"/>
+          <w:sz w:val="20"/>
+          <w:szCs w:val="20"/>
+        </w:rPr>
+        <w:t>auc</w:t>
+      </w:r>
+      <w:proofErr w:type="spellEnd"/>
+      <w:r>
+        <w:rPr>
+          <w:rFonts w:ascii="Consolas" w:hAnsi="Consolas" w:cs="Consolas"/>
+          <w:sz w:val="20"/>
+          <w:szCs w:val="20"/>
+        </w:rPr>
+        <w:t>',</w:t>
       </w:r>
       <w:r>
         <w:rPr>
@@ -268,7 +402,61 @@
           <w:szCs w:val="20"/>
         </w:rPr>
         <w:br/>
-        <w:t xml:space="preserve">    n_estimators=100, max_depth=6, learning_rate=0.1</w:t>
+        <w:t xml:space="preserve">    </w:t>
+      </w:r>
+      <w:proofErr w:type="spellStart"/>
+      <w:r>
+        <w:rPr>
+          <w:rFonts w:ascii="Consolas" w:hAnsi="Consolas" w:cs="Consolas"/>
+          <w:sz w:val="20"/>
+          <w:szCs w:val="20"/>
+        </w:rPr>
+        <w:t>n_estimators</w:t>
+      </w:r>
+      <w:proofErr w:type="spellEnd"/>
+      <w:r>
+        <w:rPr>
+          <w:rFonts w:ascii="Consolas" w:hAnsi="Consolas" w:cs="Consolas"/>
+          <w:sz w:val="20"/>
+          <w:szCs w:val="20"/>
+        </w:rPr>
+        <w:t xml:space="preserve">=100, </w:t>
+      </w:r>
+      <w:proofErr w:type="spellStart"/>
+      <w:r>
+        <w:rPr>
+          <w:rFonts w:ascii="Consolas" w:hAnsi="Consolas" w:cs="Consolas"/>
+          <w:sz w:val="20"/>
+          <w:szCs w:val="20"/>
+        </w:rPr>
+        <w:t>max_depth</w:t>
+      </w:r>
+      <w:proofErr w:type="spellEnd"/>
+      <w:r>
+        <w:rPr>
+          <w:rFonts w:ascii="Consolas" w:hAnsi="Consolas" w:cs="Consolas"/>
+          <w:sz w:val="20"/>
+          <w:szCs w:val="20"/>
+        </w:rPr>
+        <w:t xml:space="preserve">=6, </w:t>
+      </w:r>
+      <w:proofErr w:type="spellStart"/>
+      <w:r>
+        <w:rPr>
+          <w:rFonts w:ascii="Consolas" w:hAnsi="Consolas" w:cs="Consolas"/>
+          <w:sz w:val="20"/>
+          <w:szCs w:val="20"/>
+        </w:rPr>
+        <w:t>learning_rate</w:t>
+      </w:r>
+      <w:proofErr w:type="spellEnd"/>
+      <w:r>
+        <w:rPr>
+          <w:rFonts w:ascii="Consolas" w:hAnsi="Consolas" w:cs="Consolas"/>
+          <w:sz w:val="20"/>
+          <w:szCs w:val="20"/>
+        </w:rPr>
+        <w:t>=0.1</w:t>
       </w:r>
       <w:r>
         <w:rPr>
@@ -286,7 +474,114 @@
           <w:szCs w:val="20"/>
         </w:rPr>
         <w:br/>
-        <w:t>model.fit(X_train, y_train, eval_set=[(X_val, y_val)])</w:t>
+      </w:r>
+      <w:proofErr w:type="spellStart"/>
+      <w:r>
+        <w:rPr>
+          <w:rFonts w:ascii="Consolas" w:hAnsi="Consolas" w:cs="Consolas"/>
+          <w:sz w:val="20"/>
+          <w:szCs w:val="20"/>
+        </w:rPr>
+        <w:t>model.fit</w:t>
+      </w:r>
+      <w:proofErr w:type="spellEnd"/>
+      <w:r>
+        <w:rPr>
+          <w:rFonts w:ascii="Consolas" w:hAnsi="Consolas" w:cs="Consolas"/>
+          <w:sz w:val="20"/>
+          <w:szCs w:val="20"/>
+        </w:rPr>
+        <w:t>(</w:t>
+      </w:r>
+      <w:proofErr w:type="spellStart"/>
+      <w:r>
+        <w:rPr>
+          <w:rFonts w:ascii="Consolas" w:hAnsi="Consolas" w:cs="Consolas"/>
+          <w:sz w:val="20"/>
+          <w:szCs w:val="20"/>
+        </w:rPr>
+        <w:t>X_train</w:t>
+      </w:r>
+      <w:proofErr w:type="spellEnd"/>
+      <w:r>
+        <w:rPr>
+          <w:rFonts w:ascii="Consolas" w:hAnsi="Consolas" w:cs="Consolas"/>
+          <w:sz w:val="20"/>
+          <w:szCs w:val="20"/>
+        </w:rPr>
+        <w:t xml:space="preserve">, </w:t>
+      </w:r>
+      <w:proofErr w:type="spellStart"/>
+      <w:r>
+        <w:rPr>
+          <w:rFonts w:ascii="Consolas" w:hAnsi="Consolas" w:cs="Consolas"/>
+          <w:sz w:val="20"/>
+          <w:szCs w:val="20"/>
+        </w:rPr>
+        <w:t>y_train</w:t>
+      </w:r>
+      <w:proofErr w:type="spellEnd"/>
+      <w:r>
+        <w:rPr>
+          <w:rFonts w:ascii="Consolas" w:hAnsi="Consolas" w:cs="Consolas"/>
+          <w:sz w:val="20"/>
+          <w:szCs w:val="20"/>
+        </w:rPr>
+        <w:t xml:space="preserve">, </w:t>
+      </w:r>
+      <w:proofErr w:type="spellStart"/>
+      <w:r>
+        <w:rPr>
+          <w:rFonts w:ascii="Consolas" w:hAnsi="Consolas" w:cs="Consolas"/>
+          <w:sz w:val="20"/>
+          <w:szCs w:val="20"/>
+        </w:rPr>
+        <w:t>eval_set</w:t>
+      </w:r>
+      <w:proofErr w:type="spellEnd"/>
+      <w:r>
+        <w:rPr>
+          <w:rFonts w:ascii="Consolas" w:hAnsi="Consolas" w:cs="Consolas"/>
+          <w:sz w:val="20"/>
+          <w:szCs w:val="20"/>
+        </w:rPr>
+        <w:t>=[(</w:t>
+      </w:r>
+      <w:proofErr w:type="spellStart"/>
+      <w:r>
+        <w:rPr>
+          <w:rFonts w:ascii="Consolas" w:hAnsi="Consolas" w:cs="Consolas"/>
+          <w:sz w:val="20"/>
+          <w:szCs w:val="20"/>
+        </w:rPr>
+        <w:t>X_val</w:t>
+      </w:r>
+      <w:proofErr w:type="spellEnd"/>
+      <w:r>
+        <w:rPr>
+          <w:rFonts w:ascii="Consolas" w:hAnsi="Consolas" w:cs="Consolas"/>
+          <w:sz w:val="20"/>
+          <w:szCs w:val="20"/>
+        </w:rPr>
+        <w:t xml:space="preserve">, </w:t>
+      </w:r>
+      <w:proofErr w:type="spellStart"/>
+      <w:r>
+        <w:rPr>
+          <w:rFonts w:ascii="Consolas" w:hAnsi="Consolas" w:cs="Consolas"/>
+          <w:sz w:val="20"/>
+          <w:szCs w:val="20"/>
+        </w:rPr>
+        <w:t>y_val</w:t>
+      </w:r>
+      <w:proofErr w:type="spellEnd"/>
+      <w:r>
+        <w:rPr>
+          <w:rFonts w:ascii="Consolas" w:hAnsi="Consolas" w:cs="Consolas"/>
+          <w:sz w:val="20"/>
+          <w:szCs w:val="20"/>
+        </w:rPr>
+        <w:t>)])</w:t>
       </w:r>
       <w:r>
         <w:rPr>
@@ -312,7 +607,60 @@
           <w:szCs w:val="20"/>
         </w:rPr>
         <w:br/>
-        <w:t>proba = model.predict_proba(X_test)[:, 1]</w:t>
+      </w:r>
+      <w:proofErr w:type="spellStart"/>
+      <w:r>
+        <w:rPr>
+          <w:rFonts w:ascii="Consolas" w:hAnsi="Consolas" w:cs="Consolas"/>
+          <w:sz w:val="20"/>
+          <w:szCs w:val="20"/>
+        </w:rPr>
+        <w:t>proba</w:t>
+      </w:r>
+      <w:proofErr w:type="spellEnd"/>
+      <w:r>
+        <w:rPr>
+          <w:rFonts w:ascii="Consolas" w:hAnsi="Consolas" w:cs="Consolas"/>
+          <w:sz w:val="20"/>
+          <w:szCs w:val="20"/>
+        </w:rPr>
+        <w:t xml:space="preserve"> = </w:t>
+      </w:r>
+      <w:proofErr w:type="spellStart"/>
+      <w:r>
+        <w:rPr>
+          <w:rFonts w:ascii="Consolas" w:hAnsi="Consolas" w:cs="Consolas"/>
+          <w:sz w:val="20"/>
+          <w:szCs w:val="20"/>
+        </w:rPr>
+        <w:t>model.predict_proba</w:t>
+      </w:r>
+      <w:proofErr w:type="spellEnd"/>
+      <w:r>
+        <w:rPr>
+          <w:rFonts w:ascii="Consolas" w:hAnsi="Consolas" w:cs="Consolas"/>
+          <w:sz w:val="20"/>
+          <w:szCs w:val="20"/>
+        </w:rPr>
+        <w:t>(</w:t>
+      </w:r>
+      <w:proofErr w:type="spellStart"/>
+      <w:r>
+        <w:rPr>
+          <w:rFonts w:ascii="Consolas" w:hAnsi="Consolas" w:cs="Consolas"/>
+          <w:sz w:val="20"/>
+          <w:szCs w:val="20"/>
+        </w:rPr>
+        <w:t>X_test</w:t>
+      </w:r>
+      <w:proofErr w:type="spellEnd"/>
+      <w:r>
+        <w:rPr>
+          <w:rFonts w:ascii="Consolas" w:hAnsi="Consolas" w:cs="Consolas"/>
+          <w:sz w:val="20"/>
+          <w:szCs w:val="20"/>
+        </w:rPr>
+        <w:t>)[:, 1]</w:t>
       </w:r>
       <w:r>
         <w:rPr>
@@ -321,7 +669,78 @@
           <w:szCs w:val="20"/>
         </w:rPr>
         <w:br/>
-        <w:t>ranked_items = item_ids[np.argsort(-proba)]</w:t>
+      </w:r>
+      <w:proofErr w:type="spellStart"/>
+      <w:r>
+        <w:rPr>
+          <w:rFonts w:ascii="Consolas" w:hAnsi="Consolas" w:cs="Consolas"/>
+          <w:sz w:val="20"/>
+          <w:szCs w:val="20"/>
+        </w:rPr>
+        <w:t>ranked_items</w:t>
+      </w:r>
+      <w:proofErr w:type="spellEnd"/>
+      <w:r>
+        <w:rPr>
+          <w:rFonts w:ascii="Consolas" w:hAnsi="Consolas" w:cs="Consolas"/>
+          <w:sz w:val="20"/>
+          <w:szCs w:val="20"/>
+        </w:rPr>
+        <w:t xml:space="preserve"> = </w:t>
+      </w:r>
+      <w:proofErr w:type="spellStart"/>
+      <w:r>
+        <w:rPr>
+          <w:rFonts w:ascii="Consolas" w:hAnsi="Consolas" w:cs="Consolas"/>
+          <w:sz w:val="20"/>
+          <w:szCs w:val="20"/>
+        </w:rPr>
+        <w:t>item_ids</w:t>
+      </w:r>
+      <w:proofErr w:type="spellEnd"/>
+      <w:r>
+        <w:rPr>
+          <w:rFonts w:ascii="Consolas" w:hAnsi="Consolas" w:cs="Consolas"/>
+          <w:sz w:val="20"/>
+          <w:szCs w:val="20"/>
+        </w:rPr>
+        <w:t>[</w:t>
+      </w:r>
+      <w:proofErr w:type="spellStart"/>
+      <w:r>
+        <w:rPr>
+          <w:rFonts w:ascii="Consolas" w:hAnsi="Consolas" w:cs="Consolas"/>
+          <w:sz w:val="20"/>
+          <w:szCs w:val="20"/>
+        </w:rPr>
+        <w:t>np.argsort</w:t>
+      </w:r>
+      <w:proofErr w:type="spellEnd"/>
+      <w:r>
+        <w:rPr>
+          <w:rFonts w:ascii="Consolas" w:hAnsi="Consolas" w:cs="Consolas"/>
+          <w:sz w:val="20"/>
+          <w:szCs w:val="20"/>
+        </w:rPr>
+        <w:t>(-</w:t>
+      </w:r>
+      <w:proofErr w:type="spellStart"/>
+      <w:r>
+        <w:rPr>
+          <w:rFonts w:ascii="Consolas" w:hAnsi="Consolas" w:cs="Consolas"/>
+          <w:sz w:val="20"/>
+          <w:szCs w:val="20"/>
+        </w:rPr>
+        <w:t>proba</w:t>
+      </w:r>
+      <w:proofErr w:type="spellEnd"/>
+      <w:r>
+        <w:rPr>
+          <w:rFonts w:ascii="Consolas" w:hAnsi="Consolas" w:cs="Consolas"/>
+          <w:sz w:val="20"/>
+          <w:szCs w:val="20"/>
+        </w:rPr>
+        <w:t>)]</w:t>
       </w:r>
     </w:p>
     <w:p>
@@ -349,12 +768,21 @@
         </w:numPr>
         <w:spacing w:after="120" w:line="276" w:lineRule="auto"/>
       </w:pPr>
+      <w:proofErr w:type="spellStart"/>
       <w:r>
         <w:rPr>
           <w:b/>
           <w:bCs/>
         </w:rPr>
-        <w:t xml:space="preserve">RankNet: </w:t>
+        <w:t>RankNet</w:t>
+      </w:r>
+      <w:proofErr w:type="spellEnd"/>
+      <w:r>
+        <w:rPr>
+          <w:b/>
+          <w:bCs/>
+        </w:rPr>
+        <w:t xml:space="preserve">: </w:t>
       </w:r>
       <w:r>
         <w:t>Uses a logistic loss on score differences to learn pairwise preferences</w:t>
@@ -369,12 +797,21 @@
         </w:numPr>
         <w:spacing w:after="120" w:line="276" w:lineRule="auto"/>
       </w:pPr>
+      <w:proofErr w:type="spellStart"/>
       <w:r>
         <w:rPr>
           <w:b/>
           <w:bCs/>
         </w:rPr>
-        <w:t xml:space="preserve">LambdaRank: </w:t>
+        <w:t>LambdaRank</w:t>
+      </w:r>
+      <w:proofErr w:type="spellEnd"/>
+      <w:r>
+        <w:rPr>
+          <w:b/>
+          <w:bCs/>
+        </w:rPr>
+        <w:t xml:space="preserve">: </w:t>
       </w:r>
       <w:r>
         <w:t>Weights pairwise gradients by the change in NDCG that swapping two items would produce, effectively optimizing NDCG through pairwise comparisons</w:t>
@@ -389,27 +826,72 @@
         </w:numPr>
         <w:spacing w:after="120" w:line="276" w:lineRule="auto"/>
       </w:pPr>
+      <w:proofErr w:type="spellStart"/>
       <w:r>
         <w:rPr>
           <w:b/>
           <w:bCs/>
         </w:rPr>
-        <w:t xml:space="preserve">LambdaMART: </w:t>
-      </w:r>
-      <w:r>
-        <w:t>Combines LambdaRank with gradient boosted trees (MART), widely considered the gold standard for feature-based ranking</w:t>
+        <w:t>LambdaMART</w:t>
+      </w:r>
+      <w:proofErr w:type="spellEnd"/>
+      <w:r>
+        <w:rPr>
+          <w:b/>
+          <w:bCs/>
+        </w:rPr>
+        <w:t xml:space="preserve">: </w:t>
+      </w:r>
+      <w:r>
+        <w:t xml:space="preserve">Combines </w:t>
+      </w:r>
+      <w:proofErr w:type="spellStart"/>
+      <w:r>
+        <w:t>LambdaRank</w:t>
+      </w:r>
+      <w:proofErr w:type="spellEnd"/>
+      <w:r>
+        <w:t xml:space="preserve"> with gradient boosted trees (MART), widely considered the gold standard for feature-based ranking</w:t>
       </w:r>
     </w:p>
     <w:p>
       <w:pPr>
         <w:spacing w:after="200" w:line="276" w:lineRule="auto"/>
       </w:pPr>
+      <w:proofErr w:type="spellStart"/>
       <w:r>
         <w:lastRenderedPageBreak/>
-        <w:t xml:space="preserve">LambdaMART deserves a deeper look because it underpins XGBoost’s rank:pairwise objective that we use in </w:t>
-      </w:r>
-      <w:r>
-        <w:t>the companion exercises</w:t>
+        <w:t>LambdaMART</w:t>
+      </w:r>
+      <w:proofErr w:type="spellEnd"/>
+      <w:r>
+        <w:t xml:space="preserve"> deserves a deeper look because it underpins </w:t>
+      </w:r>
+      <w:proofErr w:type="spellStart"/>
+      <w:r>
+        <w:t>XGBoost’s</w:t>
+      </w:r>
+      <w:proofErr w:type="spellEnd"/>
+      <w:r>
+        <w:t xml:space="preserve"> </w:t>
+      </w:r>
+      <w:proofErr w:type="spellStart"/>
+      <w:proofErr w:type="gramStart"/>
+      <w:r>
+        <w:t>rank:pairwise</w:t>
+      </w:r>
+      <w:proofErr w:type="spellEnd"/>
+      <w:proofErr w:type="gramEnd"/>
+      <w:r>
+        <w:t xml:space="preserve"> objective that we use in </w:t>
+      </w:r>
+      <w:r>
+        <w:t xml:space="preserve">the companion </w:t>
+      </w:r>
+      <w:proofErr w:type="spellStart"/>
+      <w:proofErr w:type="gramStart"/>
+      <w:r>
+        <w:t>exercises</w:t>
       </w:r>
       <w:r>
         <w:t>.</w:t>
@@ -418,7 +900,20 @@
         <w:t>R</w:t>
       </w:r>
       <w:r>
-        <w:t>ather than defining a loss function and deriving gradients from it, LambdaMART defines the gradients directly.</w:t>
+        <w:t>ather</w:t>
+      </w:r>
+      <w:proofErr w:type="spellEnd"/>
+      <w:proofErr w:type="gramEnd"/>
+      <w:r>
+        <w:t xml:space="preserve"> than defining a loss function and deriving gradients from it, </w:t>
+      </w:r>
+      <w:proofErr w:type="spellStart"/>
+      <w:r>
+        <w:t>LambdaMART</w:t>
+      </w:r>
+      <w:proofErr w:type="spellEnd"/>
+      <w:r>
+        <w:t xml:space="preserve"> defines the gradients directly.</w:t>
       </w:r>
     </w:p>
     <w:p>
@@ -426,19 +921,68 @@
         <w:spacing w:after="200" w:line="276" w:lineRule="auto"/>
       </w:pPr>
       <w:r>
-        <w:t>Traditional approaches to optimizing NDCG face a fundamental obstacle: NDCG is a step function of the ranking permutation, so it has zero gradients almost everywhere. LambdaRank sidesteps this by defining pseudo-gradients (called lambdas) for each document pair:</w:t>
+        <w:t xml:space="preserve">Traditional approaches to optimizing NDCG face a fundamental obstacle: NDCG is a step function of the ranking permutation, so it has zero gradients almost everywhere. </w:t>
+      </w:r>
+      <w:proofErr w:type="spellStart"/>
+      <w:r>
+        <w:t>LambdaRank</w:t>
+      </w:r>
+      <w:proofErr w:type="spellEnd"/>
+      <w:r>
+        <w:t xml:space="preserve"> sidesteps this by defining pseudo-gradients (called lambdas) for each document pair:</w:t>
       </w:r>
     </w:p>
     <w:p>
       <w:pPr>
         <w:spacing w:after="200" w:line="276" w:lineRule="auto"/>
       </w:pPr>
+      <w:proofErr w:type="spellStart"/>
       <w:r>
         <w:rPr>
           <w:i/>
           <w:iCs/>
         </w:rPr>
-        <w:t>lambda_ij = sigma_ij * |delta_NDCG_ij|</w:t>
+        <w:t>lambda_ij</w:t>
+      </w:r>
+      <w:proofErr w:type="spellEnd"/>
+      <w:r>
+        <w:rPr>
+          <w:i/>
+          <w:iCs/>
+        </w:rPr>
+        <w:t xml:space="preserve"> = </w:t>
+      </w:r>
+      <w:proofErr w:type="spellStart"/>
+      <w:r>
+        <w:rPr>
+          <w:i/>
+          <w:iCs/>
+        </w:rPr>
+        <w:t>sigma_ij</w:t>
+      </w:r>
+      <w:proofErr w:type="spellEnd"/>
+      <w:r>
+        <w:rPr>
+          <w:i/>
+          <w:iCs/>
+        </w:rPr>
+        <w:t xml:space="preserve"> * |</w:t>
+      </w:r>
+      <w:proofErr w:type="spellStart"/>
+      <w:r>
+        <w:rPr>
+          <w:i/>
+          <w:iCs/>
+        </w:rPr>
+        <w:t>delta_NDCG_ij</w:t>
+      </w:r>
+      <w:proofErr w:type="spellEnd"/>
+      <w:r>
+        <w:rPr>
+          <w:i/>
+          <w:iCs/>
+        </w:rPr>
+        <w:t>|</w:t>
       </w:r>
     </w:p>
     <w:p>
@@ -446,7 +990,47 @@
         <w:spacing w:after="200" w:line="276" w:lineRule="auto"/>
       </w:pPr>
       <w:r>
-        <w:t>where sigma_ij is the logistic gradient for the pair (i, j) based on their score difference, and |delta_NDCG_ij| is the absolute change in NDCG that would result from swapping items i and j in the current ranking. The logistic component provides the direction (which item should rank higher), while the NDCG delta provides the magnitude (how much the ranking metric cares about this particular swap).</w:t>
+        <w:t xml:space="preserve">where </w:t>
+      </w:r>
+      <w:proofErr w:type="spellStart"/>
+      <w:r>
+        <w:t>sigma_ij</w:t>
+      </w:r>
+      <w:proofErr w:type="spellEnd"/>
+      <w:r>
+        <w:t xml:space="preserve"> is the logistic gradient for the pair (</w:t>
+      </w:r>
+      <w:proofErr w:type="spellStart"/>
+      <w:r>
+        <w:t>i</w:t>
+      </w:r>
+      <w:proofErr w:type="spellEnd"/>
+      <w:r>
+        <w:t>, j) based on their score difference, and |</w:t>
+      </w:r>
+      <w:proofErr w:type="spellStart"/>
+      <w:r>
+        <w:t>delta_NDCG_ij</w:t>
+      </w:r>
+      <w:proofErr w:type="spellEnd"/>
+      <w:r>
+        <w:t xml:space="preserve">| is the absolute change in NDCG that would result from swapping items </w:t>
+      </w:r>
+      <w:proofErr w:type="spellStart"/>
+      <w:r>
+        <w:t>i</w:t>
+      </w:r>
+      <w:proofErr w:type="spellEnd"/>
+      <w:r>
+        <w:t xml:space="preserve"> and j in the current ranking. The logistic component provides the direction (which item should rank higher), while the NDCG delta provides the magnitude (how much the ranking metric cares about this </w:t>
+      </w:r>
+      <w:proofErr w:type="gramStart"/>
+      <w:r>
+        <w:t>particular swap</w:t>
+      </w:r>
+      <w:proofErr w:type="gramEnd"/>
+      <w:r>
+        <w:t>).</w:t>
       </w:r>
     </w:p>
     <w:p>
@@ -454,15 +1038,44 @@
         <w:spacing w:after="200" w:line="276" w:lineRule="auto"/>
       </w:pPr>
       <w:r>
-        <w:t>This weighting is what makes LambdaMART effectively listwise despite using pairwise comparisons: swapping two items near the top of the list produces a larger delta_NDCG than swapping two items at position 50 and 51, so the model focuses its capacity on getting the top of the ranking right.</w:t>
+        <w:t xml:space="preserve">This weighting is what makes </w:t>
+      </w:r>
+      <w:proofErr w:type="spellStart"/>
+      <w:r>
+        <w:t>LambdaMART</w:t>
+      </w:r>
+      <w:proofErr w:type="spellEnd"/>
+      <w:r>
+        <w:t xml:space="preserve"> effectively listwise despite using pairwise comparisons: swapping two items near the top of the list produces a larger </w:t>
+      </w:r>
+      <w:proofErr w:type="spellStart"/>
+      <w:r>
+        <w:t>delta_NDCG</w:t>
+      </w:r>
+      <w:proofErr w:type="spellEnd"/>
+      <w:r>
+        <w:t xml:space="preserve"> than swapping two items at position 50 and 51, so the model focuses its capacity on getting the top of the ranking right.</w:t>
       </w:r>
     </w:p>
     <w:p>
       <w:pPr>
         <w:spacing w:after="200" w:line="276" w:lineRule="auto"/>
       </w:pPr>
-      <w:r>
-        <w:t>LambdaMART combines these lambda gradients with gradient boosted decision trees (Multiple Additive Regression Trees, or MART). At each boosting iteration, a new tree is fit to the lambda gradients, refining the model’s ranking. The result is a model that optimizes NDCG indirectly but effectively, without ever defining a differentiable loss function.</w:t>
+      <w:proofErr w:type="spellStart"/>
+      <w:r>
+        <w:t>LambdaMART</w:t>
+      </w:r>
+      <w:proofErr w:type="spellEnd"/>
+      <w:r>
+        <w:t xml:space="preserve"> combines these lambda gradients with gradient boosted decision trees (Multiple Additive Regression Trees, or MART). At each boosting iteration, a new tree </w:t>
+      </w:r>
+      <w:proofErr w:type="gramStart"/>
+      <w:r>
+        <w:t>is fit to</w:t>
+      </w:r>
+      <w:proofErr w:type="gramEnd"/>
+      <w:r>
+        <w:t xml:space="preserve"> the lambda gradients, refining the model’s ranking. The result is a model that optimizes NDCG indirectly but effectively, without ever defining a differentiable loss function.</w:t>
       </w:r>
     </w:p>
     <w:p>
@@ -470,10 +1083,39 @@
         <w:spacing w:after="200" w:line="276" w:lineRule="auto"/>
       </w:pPr>
       <w:r>
-        <w:t>In the tutorial accompanying this chapter, LambdaMART is implemented through the XGBRanker()</w:t>
-      </w:r>
-      <w:r>
-        <w:t xml:space="preserve">. If you are using the dmlc library, the core </w:t>
+        <w:t xml:space="preserve">In the tutorial accompanying this chapter, </w:t>
+      </w:r>
+      <w:proofErr w:type="spellStart"/>
+      <w:r>
+        <w:t>LambdaMART</w:t>
+      </w:r>
+      <w:proofErr w:type="spellEnd"/>
+      <w:r>
+        <w:t xml:space="preserve"> is implemented through the </w:t>
+      </w:r>
+      <w:proofErr w:type="spellStart"/>
+      <w:proofErr w:type="gramStart"/>
+      <w:r>
+        <w:t>XGBRanker</w:t>
+      </w:r>
+      <w:proofErr w:type="spellEnd"/>
+      <w:r>
+        <w:t>(</w:t>
+      </w:r>
+      <w:proofErr w:type="gramEnd"/>
+      <w:r>
+        <w:t>)</w:t>
+      </w:r>
+      <w:r>
+        <w:t xml:space="preserve">. If you are using the </w:t>
+      </w:r>
+      <w:proofErr w:type="spellStart"/>
+      <w:r>
+        <w:t>dmlc</w:t>
+      </w:r>
+      <w:proofErr w:type="spellEnd"/>
+      <w:r>
+        <w:t xml:space="preserve"> library, the core </w:t>
       </w:r>
       <w:r>
         <w:t>logic is as follows:</w:t>
@@ -496,8 +1138,36 @@
           <w:sz w:val="20"/>
           <w:szCs w:val="20"/>
         </w:rPr>
-        <w:t># Pairwise approach: LambdaMART via XGBRanker</w:t>
-      </w:r>
+        <w:t xml:space="preserve"># Pairwise approach: </w:t>
+      </w:r>
+      <w:proofErr w:type="spellStart"/>
+      <w:r>
+        <w:rPr>
+          <w:rFonts w:ascii="Consolas" w:hAnsi="Consolas" w:cs="Consolas"/>
+          <w:sz w:val="20"/>
+          <w:szCs w:val="20"/>
+        </w:rPr>
+        <w:t>LambdaMART</w:t>
+      </w:r>
+      <w:proofErr w:type="spellEnd"/>
+      <w:r>
+        <w:rPr>
+          <w:rFonts w:ascii="Consolas" w:hAnsi="Consolas" w:cs="Consolas"/>
+          <w:sz w:val="20"/>
+          <w:szCs w:val="20"/>
+        </w:rPr>
+        <w:t xml:space="preserve"> via </w:t>
+      </w:r>
+      <w:proofErr w:type="spellStart"/>
+      <w:r>
+        <w:rPr>
+          <w:rFonts w:ascii="Consolas" w:hAnsi="Consolas" w:cs="Consolas"/>
+          <w:sz w:val="20"/>
+          <w:szCs w:val="20"/>
+        </w:rPr>
+        <w:t>XGBRanker</w:t>
+      </w:r>
+      <w:proofErr w:type="spellEnd"/>
       <w:r>
         <w:rPr>
           <w:rFonts w:ascii="Consolas" w:hAnsi="Consolas" w:cs="Consolas"/>
@@ -505,7 +1175,25 @@
           <w:szCs w:val="20"/>
         </w:rPr>
         <w:br/>
-        <w:t>model = xgb.XGBRanker(</w:t>
+        <w:t xml:space="preserve">model = </w:t>
+      </w:r>
+      <w:proofErr w:type="spellStart"/>
+      <w:r>
+        <w:rPr>
+          <w:rFonts w:ascii="Consolas" w:hAnsi="Consolas" w:cs="Consolas"/>
+          <w:sz w:val="20"/>
+          <w:szCs w:val="20"/>
+        </w:rPr>
+        <w:t>xgb.XGBRanker</w:t>
+      </w:r>
+      <w:proofErr w:type="spellEnd"/>
+      <w:r>
+        <w:rPr>
+          <w:rFonts w:ascii="Consolas" w:hAnsi="Consolas" w:cs="Consolas"/>
+          <w:sz w:val="20"/>
+          <w:szCs w:val="20"/>
+        </w:rPr>
+        <w:t>(</w:t>
       </w:r>
       <w:r>
         <w:rPr>
@@ -514,7 +1202,43 @@
           <w:szCs w:val="20"/>
         </w:rPr>
         <w:br/>
-        <w:t xml:space="preserve">    objective='rank:pairwise',     # LambdaMART: optimizes NDCG via pairwise lambdas</w:t>
+        <w:t xml:space="preserve">    objective='</w:t>
+      </w:r>
+      <w:proofErr w:type="spellStart"/>
+      <w:r>
+        <w:rPr>
+          <w:rFonts w:ascii="Consolas" w:hAnsi="Consolas" w:cs="Consolas"/>
+          <w:sz w:val="20"/>
+          <w:szCs w:val="20"/>
+        </w:rPr>
+        <w:t>rank:pairwise</w:t>
+      </w:r>
+      <w:proofErr w:type="spellEnd"/>
+      <w:r>
+        <w:rPr>
+          <w:rFonts w:ascii="Consolas" w:hAnsi="Consolas" w:cs="Consolas"/>
+          <w:sz w:val="20"/>
+          <w:szCs w:val="20"/>
+        </w:rPr>
+        <w:t xml:space="preserve">',     # </w:t>
+      </w:r>
+      <w:proofErr w:type="spellStart"/>
+      <w:r>
+        <w:rPr>
+          <w:rFonts w:ascii="Consolas" w:hAnsi="Consolas" w:cs="Consolas"/>
+          <w:sz w:val="20"/>
+          <w:szCs w:val="20"/>
+        </w:rPr>
+        <w:t>LambdaMART</w:t>
+      </w:r>
+      <w:proofErr w:type="spellEnd"/>
+      <w:r>
+        <w:rPr>
+          <w:rFonts w:ascii="Consolas" w:hAnsi="Consolas" w:cs="Consolas"/>
+          <w:sz w:val="20"/>
+          <w:szCs w:val="20"/>
+        </w:rPr>
+        <w:t>: optimizes NDCG via pairwise lambdas</w:t>
       </w:r>
       <w:r>
         <w:rPr>
@@ -523,7 +1247,61 @@
           <w:szCs w:val="20"/>
         </w:rPr>
         <w:br/>
-        <w:t xml:space="preserve">    n_estimators=100, max_depth=6, learning_rate=0.1</w:t>
+        <w:t xml:space="preserve">    </w:t>
+      </w:r>
+      <w:proofErr w:type="spellStart"/>
+      <w:r>
+        <w:rPr>
+          <w:rFonts w:ascii="Consolas" w:hAnsi="Consolas" w:cs="Consolas"/>
+          <w:sz w:val="20"/>
+          <w:szCs w:val="20"/>
+        </w:rPr>
+        <w:t>n_estimators</w:t>
+      </w:r>
+      <w:proofErr w:type="spellEnd"/>
+      <w:r>
+        <w:rPr>
+          <w:rFonts w:ascii="Consolas" w:hAnsi="Consolas" w:cs="Consolas"/>
+          <w:sz w:val="20"/>
+          <w:szCs w:val="20"/>
+        </w:rPr>
+        <w:t xml:space="preserve">=100, </w:t>
+      </w:r>
+      <w:proofErr w:type="spellStart"/>
+      <w:r>
+        <w:rPr>
+          <w:rFonts w:ascii="Consolas" w:hAnsi="Consolas" w:cs="Consolas"/>
+          <w:sz w:val="20"/>
+          <w:szCs w:val="20"/>
+        </w:rPr>
+        <w:t>max_depth</w:t>
+      </w:r>
+      <w:proofErr w:type="spellEnd"/>
+      <w:r>
+        <w:rPr>
+          <w:rFonts w:ascii="Consolas" w:hAnsi="Consolas" w:cs="Consolas"/>
+          <w:sz w:val="20"/>
+          <w:szCs w:val="20"/>
+        </w:rPr>
+        <w:t xml:space="preserve">=6, </w:t>
+      </w:r>
+      <w:proofErr w:type="spellStart"/>
+      <w:r>
+        <w:rPr>
+          <w:rFonts w:ascii="Consolas" w:hAnsi="Consolas" w:cs="Consolas"/>
+          <w:sz w:val="20"/>
+          <w:szCs w:val="20"/>
+        </w:rPr>
+        <w:t>learning_rate</w:t>
+      </w:r>
+      <w:proofErr w:type="spellEnd"/>
+      <w:r>
+        <w:rPr>
+          <w:rFonts w:ascii="Consolas" w:hAnsi="Consolas" w:cs="Consolas"/>
+          <w:sz w:val="20"/>
+          <w:szCs w:val="20"/>
+        </w:rPr>
+        <w:t>=0.1</w:t>
       </w:r>
       <w:r>
         <w:rPr>
@@ -559,7 +1337,78 @@
           <w:szCs w:val="20"/>
         </w:rPr>
         <w:br/>
-        <w:t>model.fit(X_train, y_train, group=train_groups,</w:t>
+      </w:r>
+      <w:proofErr w:type="spellStart"/>
+      <w:r>
+        <w:rPr>
+          <w:rFonts w:ascii="Consolas" w:hAnsi="Consolas" w:cs="Consolas"/>
+          <w:sz w:val="20"/>
+          <w:szCs w:val="20"/>
+        </w:rPr>
+        <w:t>model.fit</w:t>
+      </w:r>
+      <w:proofErr w:type="spellEnd"/>
+      <w:r>
+        <w:rPr>
+          <w:rFonts w:ascii="Consolas" w:hAnsi="Consolas" w:cs="Consolas"/>
+          <w:sz w:val="20"/>
+          <w:szCs w:val="20"/>
+        </w:rPr>
+        <w:t>(</w:t>
+      </w:r>
+      <w:proofErr w:type="spellStart"/>
+      <w:r>
+        <w:rPr>
+          <w:rFonts w:ascii="Consolas" w:hAnsi="Consolas" w:cs="Consolas"/>
+          <w:sz w:val="20"/>
+          <w:szCs w:val="20"/>
+        </w:rPr>
+        <w:t>X_train</w:t>
+      </w:r>
+      <w:proofErr w:type="spellEnd"/>
+      <w:r>
+        <w:rPr>
+          <w:rFonts w:ascii="Consolas" w:hAnsi="Consolas" w:cs="Consolas"/>
+          <w:sz w:val="20"/>
+          <w:szCs w:val="20"/>
+        </w:rPr>
+        <w:t xml:space="preserve">, </w:t>
+      </w:r>
+      <w:proofErr w:type="spellStart"/>
+      <w:r>
+        <w:rPr>
+          <w:rFonts w:ascii="Consolas" w:hAnsi="Consolas" w:cs="Consolas"/>
+          <w:sz w:val="20"/>
+          <w:szCs w:val="20"/>
+        </w:rPr>
+        <w:t>y_train</w:t>
+      </w:r>
+      <w:proofErr w:type="spellEnd"/>
+      <w:r>
+        <w:rPr>
+          <w:rFonts w:ascii="Consolas" w:hAnsi="Consolas" w:cs="Consolas"/>
+          <w:sz w:val="20"/>
+          <w:szCs w:val="20"/>
+        </w:rPr>
+        <w:t>, group=</w:t>
+      </w:r>
+      <w:proofErr w:type="spellStart"/>
+      <w:r>
+        <w:rPr>
+          <w:rFonts w:ascii="Consolas" w:hAnsi="Consolas" w:cs="Consolas"/>
+          <w:sz w:val="20"/>
+          <w:szCs w:val="20"/>
+        </w:rPr>
+        <w:t>train_groups</w:t>
+      </w:r>
+      <w:proofErr w:type="spellEnd"/>
+      <w:r>
+        <w:rPr>
+          <w:rFonts w:ascii="Consolas" w:hAnsi="Consolas" w:cs="Consolas"/>
+          <w:sz w:val="20"/>
+          <w:szCs w:val="20"/>
+        </w:rPr>
+        <w:t>,</w:t>
       </w:r>
       <w:r>
         <w:rPr>
@@ -568,7 +1417,97 @@
           <w:szCs w:val="20"/>
         </w:rPr>
         <w:br/>
-        <w:t xml:space="preserve">          eval_set=[(X_test, y_test)], eval_group=[test_groups])</w:t>
+        <w:t xml:space="preserve">          </w:t>
+      </w:r>
+      <w:proofErr w:type="spellStart"/>
+      <w:r>
+        <w:rPr>
+          <w:rFonts w:ascii="Consolas" w:hAnsi="Consolas" w:cs="Consolas"/>
+          <w:sz w:val="20"/>
+          <w:szCs w:val="20"/>
+        </w:rPr>
+        <w:t>eval_set</w:t>
+      </w:r>
+      <w:proofErr w:type="spellEnd"/>
+      <w:r>
+        <w:rPr>
+          <w:rFonts w:ascii="Consolas" w:hAnsi="Consolas" w:cs="Consolas"/>
+          <w:sz w:val="20"/>
+          <w:szCs w:val="20"/>
+        </w:rPr>
+        <w:t>=[(</w:t>
+      </w:r>
+      <w:proofErr w:type="spellStart"/>
+      <w:r>
+        <w:rPr>
+          <w:rFonts w:ascii="Consolas" w:hAnsi="Consolas" w:cs="Consolas"/>
+          <w:sz w:val="20"/>
+          <w:szCs w:val="20"/>
+        </w:rPr>
+        <w:t>X_test</w:t>
+      </w:r>
+      <w:proofErr w:type="spellEnd"/>
+      <w:r>
+        <w:rPr>
+          <w:rFonts w:ascii="Consolas" w:hAnsi="Consolas" w:cs="Consolas"/>
+          <w:sz w:val="20"/>
+          <w:szCs w:val="20"/>
+        </w:rPr>
+        <w:t xml:space="preserve">, </w:t>
+      </w:r>
+      <w:proofErr w:type="spellStart"/>
+      <w:r>
+        <w:rPr>
+          <w:rFonts w:ascii="Consolas" w:hAnsi="Consolas" w:cs="Consolas"/>
+          <w:sz w:val="20"/>
+          <w:szCs w:val="20"/>
+        </w:rPr>
+        <w:t>y_test</w:t>
+      </w:r>
+      <w:proofErr w:type="spellEnd"/>
+      <w:r>
+        <w:rPr>
+          <w:rFonts w:ascii="Consolas" w:hAnsi="Consolas" w:cs="Consolas"/>
+          <w:sz w:val="20"/>
+          <w:szCs w:val="20"/>
+        </w:rPr>
+        <w:t xml:space="preserve">)], </w:t>
+      </w:r>
+      <w:proofErr w:type="spellStart"/>
+      <w:r>
+        <w:rPr>
+          <w:rFonts w:ascii="Consolas" w:hAnsi="Consolas" w:cs="Consolas"/>
+          <w:sz w:val="20"/>
+          <w:szCs w:val="20"/>
+        </w:rPr>
+        <w:t>eval_group</w:t>
+      </w:r>
+      <w:proofErr w:type="spellEnd"/>
+      <w:r>
+        <w:rPr>
+          <w:rFonts w:ascii="Consolas" w:hAnsi="Consolas" w:cs="Consolas"/>
+          <w:sz w:val="20"/>
+          <w:szCs w:val="20"/>
+        </w:rPr>
+        <w:t>=[</w:t>
+      </w:r>
+      <w:proofErr w:type="spellStart"/>
+      <w:r>
+        <w:rPr>
+          <w:rFonts w:ascii="Consolas" w:hAnsi="Consolas" w:cs="Consolas"/>
+          <w:sz w:val="20"/>
+          <w:szCs w:val="20"/>
+        </w:rPr>
+        <w:t>test_groups</w:t>
+      </w:r>
+      <w:proofErr w:type="spellEnd"/>
+      <w:r>
+        <w:rPr>
+          <w:rFonts w:ascii="Consolas" w:hAnsi="Consolas" w:cs="Consolas"/>
+          <w:sz w:val="20"/>
+          <w:szCs w:val="20"/>
+        </w:rPr>
+        <w:t>])</w:t>
       </w:r>
       <w:r>
         <w:rPr>
@@ -594,7 +1533,43 @@
           <w:szCs w:val="20"/>
         </w:rPr>
         <w:br/>
-        <w:t>scores = model.predict(X_test)</w:t>
+        <w:t xml:space="preserve">scores = </w:t>
+      </w:r>
+      <w:proofErr w:type="spellStart"/>
+      <w:r>
+        <w:rPr>
+          <w:rFonts w:ascii="Consolas" w:hAnsi="Consolas" w:cs="Consolas"/>
+          <w:sz w:val="20"/>
+          <w:szCs w:val="20"/>
+        </w:rPr>
+        <w:t>model.predict</w:t>
+      </w:r>
+      <w:proofErr w:type="spellEnd"/>
+      <w:r>
+        <w:rPr>
+          <w:rFonts w:ascii="Consolas" w:hAnsi="Consolas" w:cs="Consolas"/>
+          <w:sz w:val="20"/>
+          <w:szCs w:val="20"/>
+        </w:rPr>
+        <w:t>(</w:t>
+      </w:r>
+      <w:proofErr w:type="spellStart"/>
+      <w:r>
+        <w:rPr>
+          <w:rFonts w:ascii="Consolas" w:hAnsi="Consolas" w:cs="Consolas"/>
+          <w:sz w:val="20"/>
+          <w:szCs w:val="20"/>
+        </w:rPr>
+        <w:t>X_test</w:t>
+      </w:r>
+      <w:proofErr w:type="spellEnd"/>
+      <w:r>
+        <w:rPr>
+          <w:rFonts w:ascii="Consolas" w:hAnsi="Consolas" w:cs="Consolas"/>
+          <w:sz w:val="20"/>
+          <w:szCs w:val="20"/>
+        </w:rPr>
+        <w:t>)</w:t>
       </w:r>
       <w:r>
         <w:rPr>
@@ -603,7 +1578,60 @@
           <w:szCs w:val="20"/>
         </w:rPr>
         <w:br/>
-        <w:t>ranked_items = item_ids[np.argsort(-scores)]</w:t>
+      </w:r>
+      <w:proofErr w:type="spellStart"/>
+      <w:r>
+        <w:rPr>
+          <w:rFonts w:ascii="Consolas" w:hAnsi="Consolas" w:cs="Consolas"/>
+          <w:sz w:val="20"/>
+          <w:szCs w:val="20"/>
+        </w:rPr>
+        <w:t>ranked_items</w:t>
+      </w:r>
+      <w:proofErr w:type="spellEnd"/>
+      <w:r>
+        <w:rPr>
+          <w:rFonts w:ascii="Consolas" w:hAnsi="Consolas" w:cs="Consolas"/>
+          <w:sz w:val="20"/>
+          <w:szCs w:val="20"/>
+        </w:rPr>
+        <w:t xml:space="preserve"> = </w:t>
+      </w:r>
+      <w:proofErr w:type="spellStart"/>
+      <w:r>
+        <w:rPr>
+          <w:rFonts w:ascii="Consolas" w:hAnsi="Consolas" w:cs="Consolas"/>
+          <w:sz w:val="20"/>
+          <w:szCs w:val="20"/>
+        </w:rPr>
+        <w:t>item_ids</w:t>
+      </w:r>
+      <w:proofErr w:type="spellEnd"/>
+      <w:r>
+        <w:rPr>
+          <w:rFonts w:ascii="Consolas" w:hAnsi="Consolas" w:cs="Consolas"/>
+          <w:sz w:val="20"/>
+          <w:szCs w:val="20"/>
+        </w:rPr>
+        <w:t>[</w:t>
+      </w:r>
+      <w:proofErr w:type="spellStart"/>
+      <w:r>
+        <w:rPr>
+          <w:rFonts w:ascii="Consolas" w:hAnsi="Consolas" w:cs="Consolas"/>
+          <w:sz w:val="20"/>
+          <w:szCs w:val="20"/>
+        </w:rPr>
+        <w:t>np.argsort</w:t>
+      </w:r>
+      <w:proofErr w:type="spellEnd"/>
+      <w:r>
+        <w:rPr>
+          <w:rFonts w:ascii="Consolas" w:hAnsi="Consolas" w:cs="Consolas"/>
+          <w:sz w:val="20"/>
+          <w:szCs w:val="20"/>
+        </w:rPr>
+        <w:t>(-scores)]</w:t>
       </w:r>
     </w:p>
     <w:p>
@@ -618,13 +1646,37 @@
         <w:t>nuance to keep in mind</w:t>
       </w:r>
       <w:r>
-        <w:t>: the pairwise constraint exists only during training. When forming the training data, all valid pairs within a query group must be constructed, requiring O(n^2) comparisons per group. At inference time, however, the trained model scores each candidate independently, just like a pointwise model. XGBoost’s LambdaMART implementation, for example, produces a single scalar score per item at inference</w:t>
+        <w:t xml:space="preserve">: the pairwise constraint exists only during training. When forming the training data, all valid pairs within a query group must be constructed, requiring O(n^2) comparisons per group. At inference time, however, the trained model scores each candidate independently, just like a pointwise model. </w:t>
+      </w:r>
+      <w:proofErr w:type="spellStart"/>
+      <w:r>
+        <w:t>XGBoost’s</w:t>
+      </w:r>
+      <w:proofErr w:type="spellEnd"/>
+      <w:r>
+        <w:t xml:space="preserve"> </w:t>
+      </w:r>
+      <w:proofErr w:type="spellStart"/>
+      <w:r>
+        <w:t>LambdaMART</w:t>
+      </w:r>
+      <w:proofErr w:type="spellEnd"/>
+      <w:r>
+        <w:t xml:space="preserve"> implementation, for example, produces a single scalar score per item at inference</w:t>
       </w:r>
       <w:r>
         <w:t>. T</w:t>
       </w:r>
       <w:r>
-        <w:t xml:space="preserve">he pairwise comparison was absorbed into the learned gradient structure during training. This makes pairwise models just as fast to serve as pointwise models. </w:t>
+        <w:t xml:space="preserve">he pairwise comparison was absorbed into the learned gradient structure during training. This makes pairwise models just as </w:t>
+      </w:r>
+      <w:proofErr w:type="gramStart"/>
+      <w:r>
+        <w:t>fast to serve</w:t>
+      </w:r>
+      <w:proofErr w:type="gramEnd"/>
+      <w:r>
+        <w:t xml:space="preserve"> as pointwise models. </w:t>
       </w:r>
     </w:p>
     <w:p>
@@ -632,13 +1684,71 @@
         <w:spacing w:after="200" w:line="276" w:lineRule="auto"/>
       </w:pPr>
       <w:r>
-        <w:t xml:space="preserve">Concretely, XGBoost's rank:pairwise objective does not enumerate every possible pair within a query group, which would be prohibitive for large </w:t>
+        <w:t xml:space="preserve">Concretely, </w:t>
+      </w:r>
+      <w:proofErr w:type="spellStart"/>
+      <w:r>
+        <w:t>XGBoost's</w:t>
+      </w:r>
+      <w:proofErr w:type="spellEnd"/>
+      <w:r>
+        <w:t xml:space="preserve"> </w:t>
+      </w:r>
+      <w:proofErr w:type="spellStart"/>
+      <w:proofErr w:type="gramStart"/>
+      <w:r>
+        <w:t>rank:pairwise</w:t>
+      </w:r>
+      <w:proofErr w:type="spellEnd"/>
+      <w:proofErr w:type="gramEnd"/>
+      <w:r>
+        <w:t xml:space="preserve"> objective does not enumerate every possible pair within a query group, which would be prohibitive for large </w:t>
       </w:r>
       <w:r>
         <w:t xml:space="preserve">candidate </w:t>
       </w:r>
       <w:r>
-        <w:t>groups. Instead, for each boosting round it samples a bounded number of candidate pairs per positive item. The modern LambdaRank API (controlled via the lambdarank_num_pair_per_sample and lambdarank_pair_method parameters, added in XGBoost 2.0; see the XGBoost Learning to Rank tutorial in the DMLC documentation) lets you choose between uniform random sampling and topk sampling, where negatives are drawn preferentially from items the current model already scores highly. Topk sampling is the pairwise analogue of hard-negative mining: it forces the model to spend its gradient budget on the pairs it is currently getting wrong, rather than on easy pairs it already ranks correctly. In practice this keeps training time roughly linear in the number of positives per group, even for groups containing hundreds of candidates.</w:t>
+        <w:t xml:space="preserve">groups. Instead, for each boosting round it samples a bounded number of candidate pairs per positive item. The modern </w:t>
+      </w:r>
+      <w:proofErr w:type="spellStart"/>
+      <w:r>
+        <w:t>LambdaRank</w:t>
+      </w:r>
+      <w:proofErr w:type="spellEnd"/>
+      <w:r>
+        <w:t xml:space="preserve"> API (controlled via the </w:t>
+      </w:r>
+      <w:proofErr w:type="spellStart"/>
+      <w:r>
+        <w:t>lambdarank_num_pair_per_sample</w:t>
+      </w:r>
+      <w:proofErr w:type="spellEnd"/>
+      <w:r>
+        <w:t xml:space="preserve"> and </w:t>
+      </w:r>
+      <w:proofErr w:type="spellStart"/>
+      <w:r>
+        <w:t>lambdarank_pair_method</w:t>
+      </w:r>
+      <w:proofErr w:type="spellEnd"/>
+      <w:r>
+        <w:t xml:space="preserve"> parameters, added in XGBoost 2.0; see the XGBoost Learning to Rank tutorial in the DMLC documentation) lets you choose between uniform random sampling and </w:t>
+      </w:r>
+      <w:proofErr w:type="spellStart"/>
+      <w:r>
+        <w:t>topk</w:t>
+      </w:r>
+      <w:proofErr w:type="spellEnd"/>
+      <w:r>
+        <w:t xml:space="preserve"> sampling, where negatives are drawn preferentially from items the current model already scores highly. </w:t>
+      </w:r>
+      <w:proofErr w:type="spellStart"/>
+      <w:r>
+        <w:t>Topk</w:t>
+      </w:r>
+      <w:proofErr w:type="spellEnd"/>
+      <w:r>
+        <w:t xml:space="preserve"> sampling is the pairwise analogue of hard-negative mining: it forces the model to spend its gradient budget on the pairs it is currently getting wrong, rather than on easy pairs it already ranks correctly. In practice this keeps training time roughly linear in the number of positives per group, even for groups containing hundreds of candidates.</w:t>
       </w:r>
     </w:p>
     <w:p>
@@ -654,7 +1764,15 @@
         <w:spacing w:after="200" w:line="276" w:lineRule="auto"/>
       </w:pPr>
       <w:r>
-        <w:t>Listwise methods consider the entire candidate list and optimize a metric (such as NDCG) directly. These approaches work with differentiable approximations to rank metrics or use techniques like softmax over permutation probabilities.</w:t>
+        <w:t xml:space="preserve">Listwise methods consider the entire candidate list and optimize a metric (such as NDCG) directly. These approaches work with differentiable approximations to rank metrics or use techniques like </w:t>
+      </w:r>
+      <w:proofErr w:type="spellStart"/>
+      <w:r>
+        <w:t>softmax</w:t>
+      </w:r>
+      <w:proofErr w:type="spellEnd"/>
+      <w:r>
+        <w:t xml:space="preserve"> over permutation probabilities.</w:t>
       </w:r>
     </w:p>
     <w:p>
@@ -666,8 +1784,13 @@
         </w:numPr>
         <w:spacing w:after="120" w:line="276" w:lineRule="auto"/>
       </w:pPr>
-      <w:r>
-        <w:t>LambdaRank is often considered listwise because it uses the full list's NDCG gradient via pairwise swaps weighted by NDCG change</w:t>
+      <w:proofErr w:type="spellStart"/>
+      <w:r>
+        <w:t>LambdaRank</w:t>
+      </w:r>
+      <w:proofErr w:type="spellEnd"/>
+      <w:r>
+        <w:t xml:space="preserve"> is often considered listwise because it uses the full list's NDCG gradient via pairwise swaps weighted by NDCG change</w:t>
       </w:r>
     </w:p>
     <w:p>
@@ -693,7 +1816,23 @@
         <w:spacing w:after="120" w:line="276" w:lineRule="auto"/>
       </w:pPr>
       <w:r>
-        <w:t>In practice, LambdaMART (which uses LambdaRank-style gradients in a GBDT) is the most common production-grade listwise approach</w:t>
+        <w:t xml:space="preserve">In practice, </w:t>
+      </w:r>
+      <w:proofErr w:type="spellStart"/>
+      <w:r>
+        <w:t>LambdaMART</w:t>
+      </w:r>
+      <w:proofErr w:type="spellEnd"/>
+      <w:r>
+        <w:t xml:space="preserve"> (which uses </w:t>
+      </w:r>
+      <w:proofErr w:type="spellStart"/>
+      <w:r>
+        <w:t>LambdaRank</w:t>
+      </w:r>
+      <w:proofErr w:type="spellEnd"/>
+      <w:r>
+        <w:t>-style gradients in a GBDT) is the most common production-grade listwise approach</w:t>
       </w:r>
     </w:p>
     <w:tbl>
@@ -1095,12 +2234,21 @@
             <w:pPr>
               <w:spacing w:after="60"/>
             </w:pPr>
+            <w:proofErr w:type="gramStart"/>
             <w:r>
               <w:rPr>
                 <w:sz w:val="22"/>
                 <w:szCs w:val="22"/>
               </w:rPr>
-              <w:t>O(n^2) pairs, sampling needed</w:t>
+              <w:t>O(</w:t>
+            </w:r>
+            <w:proofErr w:type="gramEnd"/>
+            <w:r>
+              <w:rPr>
+                <w:sz w:val="22"/>
+                <w:szCs w:val="22"/>
+              </w:rPr>
+              <w:t>n^2) pairs, sampling needed</w:t>
             </w:r>
           </w:p>
         </w:tc>
@@ -1189,12 +2337,21 @@
             <w:pPr>
               <w:spacing w:after="60"/>
             </w:pPr>
+            <w:proofErr w:type="gramStart"/>
             <w:r>
               <w:rPr>
                 <w:sz w:val="22"/>
                 <w:szCs w:val="22"/>
               </w:rPr>
-              <w:t>Optimizes ranking metrics</w:t>
+              <w:t>Optimizes</w:t>
+            </w:r>
+            <w:proofErr w:type="gramEnd"/>
+            <w:r>
+              <w:rPr>
+                <w:sz w:val="22"/>
+                <w:szCs w:val="22"/>
+              </w:rPr>
+              <w:t xml:space="preserve"> ranking metrics</w:t>
             </w:r>
           </w:p>
         </w:tc>
@@ -1252,7 +2409,15 @@
         <w:t>T</w:t>
       </w:r>
       <w:r>
-        <w:t>he quality and coverage of input features remains one of the most impactful levers for ranking model performance. A good feature set captures the user's preferences, the item's characteristics, and the context of the interaction.</w:t>
+        <w:t xml:space="preserve">he quality and coverage of input features </w:t>
+      </w:r>
+      <w:proofErr w:type="gramStart"/>
+      <w:r>
+        <w:t>remains</w:t>
+      </w:r>
+      <w:proofErr w:type="gramEnd"/>
+      <w:r>
+        <w:t xml:space="preserve"> one of the most impactful levers for ranking model performance. A good feature set captures the user's preferences, the item's characteristics, and the context of the interaction.</w:t>
       </w:r>
     </w:p>
     <w:p>
@@ -1378,8 +2543,18 @@
           <w:sz w:val="20"/>
           <w:szCs w:val="20"/>
         </w:rPr>
-        <w:t>from models import HistoricalFeatureBuilder</w:t>
-      </w:r>
+        <w:t xml:space="preserve">from models import </w:t>
+      </w:r>
+      <w:proofErr w:type="spellStart"/>
+      <w:r>
+        <w:rPr>
+          <w:rFonts w:ascii="Consolas" w:hAnsi="Consolas" w:cs="Consolas"/>
+          <w:sz w:val="20"/>
+          <w:szCs w:val="20"/>
+        </w:rPr>
+        <w:t>HistoricalFeatureBuilder</w:t>
+      </w:r>
+      <w:proofErr w:type="spellEnd"/>
       <w:r>
         <w:rPr>
           <w:rFonts w:ascii="Consolas" w:hAnsi="Consolas" w:cs="Consolas"/>
@@ -1404,7 +2579,25 @@
           <w:szCs w:val="20"/>
         </w:rPr>
         <w:br/>
-        <w:t>builder = HistoricalFeatureBuilder()</w:t>
+        <w:t xml:space="preserve">builder = </w:t>
+      </w:r>
+      <w:proofErr w:type="spellStart"/>
+      <w:r>
+        <w:rPr>
+          <w:rFonts w:ascii="Consolas" w:hAnsi="Consolas" w:cs="Consolas"/>
+          <w:sz w:val="20"/>
+          <w:szCs w:val="20"/>
+        </w:rPr>
+        <w:t>HistoricalFeatureBuilder</w:t>
+      </w:r>
+      <w:proofErr w:type="spellEnd"/>
+      <w:r>
+        <w:rPr>
+          <w:rFonts w:ascii="Consolas" w:hAnsi="Consolas" w:cs="Consolas"/>
+          <w:sz w:val="20"/>
+          <w:szCs w:val="20"/>
+        </w:rPr>
+        <w:t>()</w:t>
       </w:r>
       <w:r>
         <w:rPr>
@@ -1413,7 +2606,42 @@
           <w:szCs w:val="20"/>
         </w:rPr>
         <w:br/>
-        <w:t>builder.fit(train_df)  # Learns user/item/user-item statistics</w:t>
+      </w:r>
+      <w:proofErr w:type="spellStart"/>
+      <w:r>
+        <w:rPr>
+          <w:rFonts w:ascii="Consolas" w:hAnsi="Consolas" w:cs="Consolas"/>
+          <w:sz w:val="20"/>
+          <w:szCs w:val="20"/>
+        </w:rPr>
+        <w:t>builder.fit</w:t>
+      </w:r>
+      <w:proofErr w:type="spellEnd"/>
+      <w:r>
+        <w:rPr>
+          <w:rFonts w:ascii="Consolas" w:hAnsi="Consolas" w:cs="Consolas"/>
+          <w:sz w:val="20"/>
+          <w:szCs w:val="20"/>
+        </w:rPr>
+        <w:t>(</w:t>
+      </w:r>
+      <w:proofErr w:type="spellStart"/>
+      <w:r>
+        <w:rPr>
+          <w:rFonts w:ascii="Consolas" w:hAnsi="Consolas" w:cs="Consolas"/>
+          <w:sz w:val="20"/>
+          <w:szCs w:val="20"/>
+        </w:rPr>
+        <w:t>train_df</w:t>
+      </w:r>
+      <w:proofErr w:type="spellEnd"/>
+      <w:r>
+        <w:rPr>
+          <w:rFonts w:ascii="Consolas" w:hAnsi="Consolas" w:cs="Consolas"/>
+          <w:sz w:val="20"/>
+          <w:szCs w:val="20"/>
+        </w:rPr>
+        <w:t>)  # Learns user/item/user-item statistics</w:t>
       </w:r>
       <w:r>
         <w:rPr>
@@ -1439,7 +2667,60 @@
           <w:szCs w:val="20"/>
         </w:rPr>
         <w:br/>
-        <w:t>train_df = builder.transform(train_df)</w:t>
+      </w:r>
+      <w:proofErr w:type="spellStart"/>
+      <w:r>
+        <w:rPr>
+          <w:rFonts w:ascii="Consolas" w:hAnsi="Consolas" w:cs="Consolas"/>
+          <w:sz w:val="20"/>
+          <w:szCs w:val="20"/>
+        </w:rPr>
+        <w:t>train_df</w:t>
+      </w:r>
+      <w:proofErr w:type="spellEnd"/>
+      <w:r>
+        <w:rPr>
+          <w:rFonts w:ascii="Consolas" w:hAnsi="Consolas" w:cs="Consolas"/>
+          <w:sz w:val="20"/>
+          <w:szCs w:val="20"/>
+        </w:rPr>
+        <w:t xml:space="preserve"> = </w:t>
+      </w:r>
+      <w:proofErr w:type="spellStart"/>
+      <w:r>
+        <w:rPr>
+          <w:rFonts w:ascii="Consolas" w:hAnsi="Consolas" w:cs="Consolas"/>
+          <w:sz w:val="20"/>
+          <w:szCs w:val="20"/>
+        </w:rPr>
+        <w:t>builder.transform</w:t>
+      </w:r>
+      <w:proofErr w:type="spellEnd"/>
+      <w:r>
+        <w:rPr>
+          <w:rFonts w:ascii="Consolas" w:hAnsi="Consolas" w:cs="Consolas"/>
+          <w:sz w:val="20"/>
+          <w:szCs w:val="20"/>
+        </w:rPr>
+        <w:t>(</w:t>
+      </w:r>
+      <w:proofErr w:type="spellStart"/>
+      <w:r>
+        <w:rPr>
+          <w:rFonts w:ascii="Consolas" w:hAnsi="Consolas" w:cs="Consolas"/>
+          <w:sz w:val="20"/>
+          <w:szCs w:val="20"/>
+        </w:rPr>
+        <w:t>train_df</w:t>
+      </w:r>
+      <w:proofErr w:type="spellEnd"/>
+      <w:r>
+        <w:rPr>
+          <w:rFonts w:ascii="Consolas" w:hAnsi="Consolas" w:cs="Consolas"/>
+          <w:sz w:val="20"/>
+          <w:szCs w:val="20"/>
+        </w:rPr>
+        <w:t>)</w:t>
       </w:r>
       <w:r>
         <w:rPr>
@@ -1448,7 +2729,60 @@
           <w:szCs w:val="20"/>
         </w:rPr>
         <w:br/>
-        <w:t>test_df = builder.transform(test_df)</w:t>
+      </w:r>
+      <w:proofErr w:type="spellStart"/>
+      <w:r>
+        <w:rPr>
+          <w:rFonts w:ascii="Consolas" w:hAnsi="Consolas" w:cs="Consolas"/>
+          <w:sz w:val="20"/>
+          <w:szCs w:val="20"/>
+        </w:rPr>
+        <w:t>test_df</w:t>
+      </w:r>
+      <w:proofErr w:type="spellEnd"/>
+      <w:r>
+        <w:rPr>
+          <w:rFonts w:ascii="Consolas" w:hAnsi="Consolas" w:cs="Consolas"/>
+          <w:sz w:val="20"/>
+          <w:szCs w:val="20"/>
+        </w:rPr>
+        <w:t xml:space="preserve"> = </w:t>
+      </w:r>
+      <w:proofErr w:type="spellStart"/>
+      <w:r>
+        <w:rPr>
+          <w:rFonts w:ascii="Consolas" w:hAnsi="Consolas" w:cs="Consolas"/>
+          <w:sz w:val="20"/>
+          <w:szCs w:val="20"/>
+        </w:rPr>
+        <w:t>builder.transform</w:t>
+      </w:r>
+      <w:proofErr w:type="spellEnd"/>
+      <w:r>
+        <w:rPr>
+          <w:rFonts w:ascii="Consolas" w:hAnsi="Consolas" w:cs="Consolas"/>
+          <w:sz w:val="20"/>
+          <w:szCs w:val="20"/>
+        </w:rPr>
+        <w:t>(</w:t>
+      </w:r>
+      <w:proofErr w:type="spellStart"/>
+      <w:r>
+        <w:rPr>
+          <w:rFonts w:ascii="Consolas" w:hAnsi="Consolas" w:cs="Consolas"/>
+          <w:sz w:val="20"/>
+          <w:szCs w:val="20"/>
+        </w:rPr>
+        <w:t>test_df</w:t>
+      </w:r>
+      <w:proofErr w:type="spellEnd"/>
+      <w:r>
+        <w:rPr>
+          <w:rFonts w:ascii="Consolas" w:hAnsi="Consolas" w:cs="Consolas"/>
+          <w:sz w:val="20"/>
+          <w:szCs w:val="20"/>
+        </w:rPr>
+        <w:t>)</w:t>
       </w:r>
       <w:r>
         <w:rPr>
@@ -1465,7 +2799,61 @@
           <w:szCs w:val="20"/>
         </w:rPr>
         <w:br/>
-        <w:t># New features: user_avg_completion, item_total_plays, has_listened_before, etc.</w:t>
+        <w:t xml:space="preserve"># New features: </w:t>
+      </w:r>
+      <w:proofErr w:type="spellStart"/>
+      <w:r>
+        <w:rPr>
+          <w:rFonts w:ascii="Consolas" w:hAnsi="Consolas" w:cs="Consolas"/>
+          <w:sz w:val="20"/>
+          <w:szCs w:val="20"/>
+        </w:rPr>
+        <w:t>user_avg_completion</w:t>
+      </w:r>
+      <w:proofErr w:type="spellEnd"/>
+      <w:r>
+        <w:rPr>
+          <w:rFonts w:ascii="Consolas" w:hAnsi="Consolas" w:cs="Consolas"/>
+          <w:sz w:val="20"/>
+          <w:szCs w:val="20"/>
+        </w:rPr>
+        <w:t xml:space="preserve">, </w:t>
+      </w:r>
+      <w:proofErr w:type="spellStart"/>
+      <w:r>
+        <w:rPr>
+          <w:rFonts w:ascii="Consolas" w:hAnsi="Consolas" w:cs="Consolas"/>
+          <w:sz w:val="20"/>
+          <w:szCs w:val="20"/>
+        </w:rPr>
+        <w:t>item_total_plays</w:t>
+      </w:r>
+      <w:proofErr w:type="spellEnd"/>
+      <w:r>
+        <w:rPr>
+          <w:rFonts w:ascii="Consolas" w:hAnsi="Consolas" w:cs="Consolas"/>
+          <w:sz w:val="20"/>
+          <w:szCs w:val="20"/>
+        </w:rPr>
+        <w:t xml:space="preserve">, </w:t>
+      </w:r>
+      <w:proofErr w:type="spellStart"/>
+      <w:r>
+        <w:rPr>
+          <w:rFonts w:ascii="Consolas" w:hAnsi="Consolas" w:cs="Consolas"/>
+          <w:sz w:val="20"/>
+          <w:szCs w:val="20"/>
+        </w:rPr>
+        <w:t>has_listened_before</w:t>
+      </w:r>
+      <w:proofErr w:type="spellEnd"/>
+      <w:r>
+        <w:rPr>
+          <w:rFonts w:ascii="Consolas" w:hAnsi="Consolas" w:cs="Consolas"/>
+          <w:sz w:val="20"/>
+          <w:szCs w:val="20"/>
+        </w:rPr>
+        <w:t>, etc.</w:t>
       </w:r>
     </w:p>
     <w:p>
@@ -1522,7 +2910,15 @@
         <w:t xml:space="preserve">Target encoding: </w:t>
       </w:r>
       <w:r>
-        <w:t>Replace a categorical value with the average target value (e.g., average CTR) for that category. Requires careful regularization to avoid overfitting on rare categories.</w:t>
+        <w:t xml:space="preserve">Replace a categorical value with the average target value (e.g., average CTR) for that category. </w:t>
+      </w:r>
+      <w:proofErr w:type="gramStart"/>
+      <w:r>
+        <w:t>Requires</w:t>
+      </w:r>
+      <w:proofErr w:type="gramEnd"/>
+      <w:r>
+        <w:t xml:space="preserve"> careful regularization to avoid overfitting on rare categories.</w:t>
       </w:r>
     </w:p>
     <w:p>
@@ -1578,7 +2974,15 @@
         <w:spacing w:after="200" w:line="276" w:lineRule="auto"/>
       </w:pPr>
       <w:r>
-        <w:t>Temporal features deserve special attention in ranking because user intent is highly time-dependent. The same user may want different content at different times.</w:t>
+        <w:t xml:space="preserve">Temporal features deserve special attention in ranking because user intent is highly </w:t>
+      </w:r>
+      <w:proofErr w:type="gramStart"/>
+      <w:r>
+        <w:t>time-dependent</w:t>
+      </w:r>
+      <w:proofErr w:type="gramEnd"/>
+      <w:r>
+        <w:t>. The same user may want different content at different times.</w:t>
       </w:r>
     </w:p>
     <w:p>
@@ -1646,7 +3050,55 @@
         <w:spacing w:after="200" w:line="276" w:lineRule="auto"/>
       </w:pPr>
       <w:r>
-        <w:t>Gradient Boosted Decision Trees (GBDTs), particularly XGBoost and LightGBM implementations, have been workhorses for ranking in production recommender systems since XGBoost’s release in 2014 (Chen &amp; Guestrin, KDD 2016) and LightGBM in 2017 (Ke et al., NeurIPS 2017). They offer a compelling balance of accuracy, training speed, interpretability, and ease of deployment that makes them an ideal starting point for first-stage ranking.</w:t>
+        <w:t xml:space="preserve">Gradient Boosted Decision Trees (GBDTs), particularly XGBoost and </w:t>
+      </w:r>
+      <w:proofErr w:type="spellStart"/>
+      <w:r>
+        <w:t>LightGBM</w:t>
+      </w:r>
+      <w:proofErr w:type="spellEnd"/>
+      <w:r>
+        <w:t xml:space="preserve"> implementations, have been workhorses for ranking in production recommender systems since </w:t>
+      </w:r>
+      <w:proofErr w:type="spellStart"/>
+      <w:r>
+        <w:t>XGBoost’s</w:t>
+      </w:r>
+      <w:proofErr w:type="spellEnd"/>
+      <w:r>
+        <w:t xml:space="preserve"> release in 2014 (Chen &amp; </w:t>
+      </w:r>
+      <w:proofErr w:type="spellStart"/>
+      <w:r>
+        <w:t>Guestrin</w:t>
+      </w:r>
+      <w:proofErr w:type="spellEnd"/>
+      <w:r>
+        <w:t xml:space="preserve">, KDD 2016) and </w:t>
+      </w:r>
+      <w:proofErr w:type="spellStart"/>
+      <w:r>
+        <w:t>LightGBM</w:t>
+      </w:r>
+      <w:proofErr w:type="spellEnd"/>
+      <w:r>
+        <w:t xml:space="preserve"> in 2017 (Ke et al., </w:t>
+      </w:r>
+      <w:proofErr w:type="spellStart"/>
+      <w:r>
+        <w:t>NeurIPS</w:t>
+      </w:r>
+      <w:proofErr w:type="spellEnd"/>
+      <w:r>
+        <w:t xml:space="preserve"> 2017). They offer a compelling balance of accuracy, training speed, interpretability, and ease of deployment that makes them an ideal starting point for </w:t>
+      </w:r>
+      <w:proofErr w:type="gramStart"/>
+      <w:r>
+        <w:t>first-stage</w:t>
+      </w:r>
+      <w:proofErr w:type="gramEnd"/>
+      <w:r>
+        <w:t xml:space="preserve"> ranking.</w:t>
       </w:r>
     </w:p>
     <w:p>
@@ -1720,7 +3172,15 @@
         <w:spacing w:after="120" w:line="276" w:lineRule="auto"/>
       </w:pPr>
       <w:r>
-        <w:t>Support ranking-specific objectives out of the box (LambdaMART for NDCG optimization)</w:t>
+        <w:t>Support ranking-specific objectives out of the box (</w:t>
+      </w:r>
+      <w:proofErr w:type="spellStart"/>
+      <w:r>
+        <w:t>LambdaMART</w:t>
+      </w:r>
+      <w:proofErr w:type="spellEnd"/>
+      <w:r>
+        <w:t xml:space="preserve"> for NDCG optimization)</w:t>
       </w:r>
     </w:p>
     <w:p>
@@ -1732,8 +3192,13 @@
         </w:numPr>
         <w:spacing w:after="120" w:line="276" w:lineRule="auto"/>
       </w:pPr>
-      <w:r>
-        <w:t>Require less hyperparameter tuning than deep learning models and often work well with less training data</w:t>
+      <w:proofErr w:type="gramStart"/>
+      <w:r>
+        <w:t>Require</w:t>
+      </w:r>
+      <w:proofErr w:type="gramEnd"/>
+      <w:r>
+        <w:t xml:space="preserve"> less hyperparameter tuning than deep learning models and often work well with less training data</w:t>
       </w:r>
     </w:p>
     <w:p>
@@ -1760,7 +3225,15 @@
         <w:t xml:space="preserve">XGBoost </w:t>
       </w:r>
       <w:r>
-        <w:t xml:space="preserve">implementation in the dmlc library </w:t>
+        <w:t xml:space="preserve">implementation in the </w:t>
+      </w:r>
+      <w:proofErr w:type="spellStart"/>
+      <w:r>
+        <w:t>dmlc</w:t>
+      </w:r>
+      <w:proofErr w:type="spellEnd"/>
+      <w:r>
+        <w:t xml:space="preserve"> library </w:t>
       </w:r>
       <w:r>
         <w:t>supports multiple ranking objectives. The choice depends on whether you need calibrated probabilities or optimized list ordering:</w:t>
@@ -1775,15 +3248,34 @@
         </w:numPr>
         <w:spacing w:after="120" w:line="276" w:lineRule="auto"/>
       </w:pPr>
+      <w:proofErr w:type="spellStart"/>
+      <w:proofErr w:type="gramStart"/>
       <w:r>
         <w:rPr>
           <w:b/>
           <w:bCs/>
         </w:rPr>
-        <w:t xml:space="preserve">binary:logistic (pointwise): </w:t>
-      </w:r>
-      <w:r>
-        <w:t>Predicts P(click | user, item, context). Simple, produces calibrated probabilities, works well as a first baseline.</w:t>
+        <w:t>binary:logistic</w:t>
+      </w:r>
+      <w:proofErr w:type="spellEnd"/>
+      <w:proofErr w:type="gramEnd"/>
+      <w:r>
+        <w:rPr>
+          <w:b/>
+          <w:bCs/>
+        </w:rPr>
+        <w:t xml:space="preserve"> (pointwise): </w:t>
+      </w:r>
+      <w:r>
+        <w:t xml:space="preserve">Predicts </w:t>
+      </w:r>
+      <w:proofErr w:type="gramStart"/>
+      <w:r>
+        <w:t>P(</w:t>
+      </w:r>
+      <w:proofErr w:type="gramEnd"/>
+      <w:r>
+        <w:t>click | user, item, context). Simple, produces calibrated probabilities, works well as a first baseline.</w:t>
       </w:r>
     </w:p>
     <w:p>
@@ -1795,12 +3287,39 @@
         </w:numPr>
         <w:spacing w:after="120" w:line="276" w:lineRule="auto"/>
       </w:pPr>
+      <w:proofErr w:type="spellStart"/>
+      <w:proofErr w:type="gramStart"/>
       <w:r>
         <w:rPr>
           <w:b/>
           <w:bCs/>
         </w:rPr>
-        <w:t xml:space="preserve">rank:pairwise (LambdaMART): </w:t>
+        <w:t>rank:pairwise</w:t>
+      </w:r>
+      <w:proofErr w:type="spellEnd"/>
+      <w:proofErr w:type="gramEnd"/>
+      <w:r>
+        <w:rPr>
+          <w:b/>
+          <w:bCs/>
+        </w:rPr>
+        <w:t xml:space="preserve"> (</w:t>
+      </w:r>
+      <w:proofErr w:type="spellStart"/>
+      <w:r>
+        <w:rPr>
+          <w:b/>
+          <w:bCs/>
+        </w:rPr>
+        <w:t>LambdaMART</w:t>
+      </w:r>
+      <w:proofErr w:type="spellEnd"/>
+      <w:r>
+        <w:rPr>
+          <w:b/>
+          <w:bCs/>
+        </w:rPr>
+        <w:t xml:space="preserve">): </w:t>
       </w:r>
       <w:r>
         <w:t>Optimizes NDCG by comparing pairs of items within the same query group. Requires a group parameter that tells XGBoost which items belong to the same user/session context.</w:t>
@@ -1815,15 +3334,44 @@
         </w:numPr>
         <w:spacing w:after="120" w:line="276" w:lineRule="auto"/>
       </w:pPr>
+      <w:proofErr w:type="spellStart"/>
+      <w:proofErr w:type="gramStart"/>
       <w:r>
         <w:rPr>
           <w:b/>
           <w:bCs/>
         </w:rPr>
-        <w:t xml:space="preserve">rank:ndcg: </w:t>
-      </w:r>
-      <w:r>
-        <w:t>Directly optimizes a proxy of NDCG. Similar to rank:pairwise but with a different loss formulation.</w:t>
+        <w:t>rank:ndcg</w:t>
+      </w:r>
+      <w:proofErr w:type="spellEnd"/>
+      <w:proofErr w:type="gramEnd"/>
+      <w:r>
+        <w:rPr>
+          <w:b/>
+          <w:bCs/>
+        </w:rPr>
+        <w:t xml:space="preserve">: </w:t>
+      </w:r>
+      <w:r>
+        <w:t xml:space="preserve">Directly optimizes a proxy of NDCG. </w:t>
+      </w:r>
+      <w:proofErr w:type="gramStart"/>
+      <w:r>
+        <w:t>Similar to</w:t>
+      </w:r>
+      <w:proofErr w:type="gramEnd"/>
+      <w:r>
+        <w:t xml:space="preserve"> </w:t>
+      </w:r>
+      <w:proofErr w:type="spellStart"/>
+      <w:proofErr w:type="gramStart"/>
+      <w:r>
+        <w:t>rank:pairwise</w:t>
+      </w:r>
+      <w:proofErr w:type="spellEnd"/>
+      <w:proofErr w:type="gramEnd"/>
+      <w:r>
+        <w:t xml:space="preserve"> but with a different loss formulation.</w:t>
       </w:r>
     </w:p>
     <w:p>
@@ -1890,7 +3438,39 @@
           <w:i/>
           <w:sz w:val="20"/>
         </w:rPr>
-        <w:t xml:space="preserve"> search ranking training set. Each row is one (query, candidate) pair. Items with the same query_id form one query group; the graded label (0/1/2) is what LambdaMART optimizes via pairwise comparisons within a group.</w:t>
+        <w:t xml:space="preserve"> search ranking training set. Each row is one (query, candidate) pair. Items with the same </w:t>
+      </w:r>
+      <w:proofErr w:type="spellStart"/>
+      <w:r>
+        <w:rPr>
+          <w:i/>
+          <w:sz w:val="20"/>
+        </w:rPr>
+        <w:t>query_id</w:t>
+      </w:r>
+      <w:proofErr w:type="spellEnd"/>
+      <w:r>
+        <w:rPr>
+          <w:i/>
+          <w:sz w:val="20"/>
+        </w:rPr>
+        <w:t xml:space="preserve"> form one query group; the graded label (0/1/2) is what </w:t>
+      </w:r>
+      <w:proofErr w:type="spellStart"/>
+      <w:r>
+        <w:rPr>
+          <w:i/>
+          <w:sz w:val="20"/>
+        </w:rPr>
+        <w:t>LambdaMART</w:t>
+      </w:r>
+      <w:proofErr w:type="spellEnd"/>
+      <w:r>
+        <w:rPr>
+          <w:i/>
+          <w:sz w:val="20"/>
+        </w:rPr>
+        <w:t xml:space="preserve"> optimizes via pairwise comparisons within a group.</w:t>
       </w:r>
     </w:p>
     <w:tbl>
@@ -1921,6 +3501,7 @@
             <w:shd w:val="clear" w:color="auto" w:fill="E8EEF7"/>
           </w:tcPr>
           <w:p>
+            <w:proofErr w:type="spellStart"/>
             <w:r>
               <w:rPr>
                 <w:b/>
@@ -1928,6 +3509,7 @@
               <w:lastRenderedPageBreak/>
               <w:t>query_id</w:t>
             </w:r>
+            <w:proofErr w:type="spellEnd"/>
           </w:p>
         </w:tc>
         <w:tc>
@@ -1936,12 +3518,14 @@
             <w:shd w:val="clear" w:color="auto" w:fill="E8EEF7"/>
           </w:tcPr>
           <w:p>
+            <w:proofErr w:type="spellStart"/>
             <w:r>
               <w:rPr>
                 <w:b/>
               </w:rPr>
               <w:t>query_text</w:t>
             </w:r>
+            <w:proofErr w:type="spellEnd"/>
           </w:p>
         </w:tc>
         <w:tc>
@@ -1950,12 +3534,14 @@
             <w:shd w:val="clear" w:color="auto" w:fill="E8EEF7"/>
           </w:tcPr>
           <w:p>
+            <w:proofErr w:type="spellStart"/>
             <w:r>
               <w:rPr>
                 <w:b/>
               </w:rPr>
               <w:t>product_id</w:t>
             </w:r>
+            <w:proofErr w:type="spellEnd"/>
           </w:p>
         </w:tc>
         <w:tc>
@@ -2490,6 +4076,7 @@
         </w:rPr>
         <w:t xml:space="preserve">, candidate) pair. Items with the same </w:t>
       </w:r>
+      <w:proofErr w:type="spellStart"/>
       <w:r>
         <w:rPr>
           <w:i/>
@@ -2502,7 +4089,15 @@
           <w:i/>
           <w:sz w:val="20"/>
         </w:rPr>
-        <w:t>_id form one group</w:t>
+        <w:t>_id</w:t>
+      </w:r>
+      <w:proofErr w:type="spellEnd"/>
+      <w:r>
+        <w:rPr>
+          <w:i/>
+          <w:sz w:val="20"/>
+        </w:rPr>
+        <w:t xml:space="preserve"> form one group</w:t>
       </w:r>
       <w:r>
         <w:rPr>
@@ -2539,12 +4134,14 @@
             <w:shd w:val="clear" w:color="auto" w:fill="E8EEF7"/>
           </w:tcPr>
           <w:p>
+            <w:proofErr w:type="spellStart"/>
             <w:r>
               <w:rPr>
                 <w:b/>
               </w:rPr>
               <w:t>User_id</w:t>
             </w:r>
+            <w:proofErr w:type="spellEnd"/>
           </w:p>
         </w:tc>
         <w:tc>
@@ -2553,12 +4150,14 @@
             <w:shd w:val="clear" w:color="auto" w:fill="E8EEF7"/>
           </w:tcPr>
           <w:p>
+            <w:proofErr w:type="spellStart"/>
             <w:r>
               <w:rPr>
                 <w:b/>
               </w:rPr>
               <w:t>item_id</w:t>
             </w:r>
+            <w:proofErr w:type="spellEnd"/>
           </w:p>
         </w:tc>
         <w:tc>
@@ -2567,12 +4166,14 @@
             <w:shd w:val="clear" w:color="auto" w:fill="E8EEF7"/>
           </w:tcPr>
           <w:p>
+            <w:proofErr w:type="spellStart"/>
             <w:r>
               <w:rPr>
                 <w:b/>
               </w:rPr>
               <w:t>User_genre_pref_score</w:t>
             </w:r>
+            <w:proofErr w:type="spellEnd"/>
           </w:p>
         </w:tc>
         <w:tc>
@@ -2581,12 +4182,14 @@
             <w:shd w:val="clear" w:color="auto" w:fill="E8EEF7"/>
           </w:tcPr>
           <w:p>
+            <w:proofErr w:type="spellStart"/>
             <w:r>
               <w:rPr>
                 <w:b/>
               </w:rPr>
               <w:t>Item_popularity</w:t>
             </w:r>
+            <w:proofErr w:type="spellEnd"/>
           </w:p>
         </w:tc>
         <w:tc>
@@ -2628,7 +4231,20 @@
           </w:tcPr>
           <w:p>
             <w:r>
-              <w:t>'track_A'</w:t>
+              <w:t>'</w:t>
+            </w:r>
+            <w:proofErr w:type="spellStart"/>
+            <w:proofErr w:type="gramStart"/>
+            <w:r>
+              <w:t>track</w:t>
+            </w:r>
+            <w:proofErr w:type="gramEnd"/>
+            <w:r>
+              <w:t>_A</w:t>
+            </w:r>
+            <w:proofErr w:type="spellEnd"/>
+            <w:r>
+              <w:t>'</w:t>
             </w:r>
           </w:p>
         </w:tc>
@@ -2680,11 +4296,21 @@
           </w:tcPr>
           <w:p>
             <w:r>
-              <w:t>'track_</w:t>
+              <w:t>'</w:t>
+            </w:r>
+            <w:proofErr w:type="spellStart"/>
+            <w:proofErr w:type="gramStart"/>
+            <w:r>
+              <w:t>track</w:t>
+            </w:r>
+            <w:proofErr w:type="gramEnd"/>
+            <w:r>
+              <w:t>_</w:t>
             </w:r>
             <w:r>
               <w:t>B</w:t>
             </w:r>
+            <w:proofErr w:type="spellEnd"/>
             <w:r>
               <w:t>'</w:t>
             </w:r>
@@ -2738,10 +4364,23 @@
           </w:tcPr>
           <w:p>
             <w:r>
-              <w:t>'track_</w:t>
-            </w:r>
-            <w:r>
-              <w:t>C’</w:t>
+              <w:t>'</w:t>
+            </w:r>
+            <w:proofErr w:type="spellStart"/>
+            <w:proofErr w:type="gramStart"/>
+            <w:r>
+              <w:t>track</w:t>
+            </w:r>
+            <w:proofErr w:type="gramEnd"/>
+            <w:r>
+              <w:t>_</w:t>
+            </w:r>
+            <w:r>
+              <w:t>C</w:t>
+            </w:r>
+            <w:proofErr w:type="spellEnd"/>
+            <w:r>
+              <w:t>’</w:t>
             </w:r>
           </w:p>
         </w:tc>
@@ -2793,10 +4432,23 @@
           </w:tcPr>
           <w:p>
             <w:r>
-              <w:t>'track_</w:t>
-            </w:r>
-            <w:r>
-              <w:t>D’</w:t>
+              <w:t>'</w:t>
+            </w:r>
+            <w:proofErr w:type="spellStart"/>
+            <w:proofErr w:type="gramStart"/>
+            <w:r>
+              <w:t>track</w:t>
+            </w:r>
+            <w:proofErr w:type="gramEnd"/>
+            <w:r>
+              <w:t>_</w:t>
+            </w:r>
+            <w:r>
+              <w:t>D</w:t>
+            </w:r>
+            <w:proofErr w:type="spellEnd"/>
+            <w:r>
+              <w:t>’</w:t>
             </w:r>
           </w:p>
         </w:tc>
@@ -2848,10 +4500,23 @@
           </w:tcPr>
           <w:p>
             <w:r>
-              <w:t>'track_</w:t>
-            </w:r>
-            <w:r>
-              <w:t>E’</w:t>
+              <w:t>'</w:t>
+            </w:r>
+            <w:proofErr w:type="spellStart"/>
+            <w:proofErr w:type="gramStart"/>
+            <w:r>
+              <w:t>track</w:t>
+            </w:r>
+            <w:proofErr w:type="gramEnd"/>
+            <w:r>
+              <w:t>_</w:t>
+            </w:r>
+            <w:r>
+              <w:t>E</w:t>
+            </w:r>
+            <w:proofErr w:type="spellEnd"/>
+            <w:r>
+              <w:t>’</w:t>
             </w:r>
           </w:p>
         </w:tc>
@@ -2903,10 +4568,23 @@
           </w:tcPr>
           <w:p>
             <w:r>
-              <w:t>'track_</w:t>
-            </w:r>
-            <w:r>
-              <w:t>F’</w:t>
+              <w:t>'</w:t>
+            </w:r>
+            <w:proofErr w:type="spellStart"/>
+            <w:proofErr w:type="gramStart"/>
+            <w:r>
+              <w:t>track</w:t>
+            </w:r>
+            <w:proofErr w:type="gramEnd"/>
+            <w:r>
+              <w:t>_</w:t>
+            </w:r>
+            <w:r>
+              <w:t>F</w:t>
+            </w:r>
+            <w:proofErr w:type="spellEnd"/>
+            <w:r>
+              <w:t>’</w:t>
             </w:r>
           </w:p>
         </w:tc>
@@ -2958,10 +4636,23 @@
           </w:tcPr>
           <w:p>
             <w:r>
-              <w:t>'track_</w:t>
-            </w:r>
-            <w:r>
-              <w:t>G’</w:t>
+              <w:t>'</w:t>
+            </w:r>
+            <w:proofErr w:type="spellStart"/>
+            <w:proofErr w:type="gramStart"/>
+            <w:r>
+              <w:t>track</w:t>
+            </w:r>
+            <w:proofErr w:type="gramEnd"/>
+            <w:r>
+              <w:t>_</w:t>
+            </w:r>
+            <w:r>
+              <w:t>G</w:t>
+            </w:r>
+            <w:proofErr w:type="spellEnd"/>
+            <w:r>
+              <w:t>’</w:t>
             </w:r>
           </w:p>
         </w:tc>
@@ -3013,10 +4704,23 @@
           </w:tcPr>
           <w:p>
             <w:r>
-              <w:t>'track_</w:t>
-            </w:r>
-            <w:r>
-              <w:t>H’</w:t>
+              <w:t>'</w:t>
+            </w:r>
+            <w:proofErr w:type="spellStart"/>
+            <w:proofErr w:type="gramStart"/>
+            <w:r>
+              <w:t>track</w:t>
+            </w:r>
+            <w:proofErr w:type="gramEnd"/>
+            <w:r>
+              <w:t>_</w:t>
+            </w:r>
+            <w:r>
+              <w:t>H</w:t>
+            </w:r>
+            <w:proofErr w:type="spellEnd"/>
+            <w:r>
+              <w:t>’</w:t>
             </w:r>
           </w:p>
         </w:tc>
@@ -3062,7 +4766,15 @@
         <w:spacing w:after="120" w:line="276" w:lineRule="auto"/>
       </w:pPr>
       <w:r>
-        <w:t>Group size affects training: too large and you waste computation on easy comparisons; too small and the model lacks sufficient positive/negative contrast</w:t>
+        <w:t xml:space="preserve">Group size affects training: too large and you waste computation on easy comparisons; too small and the model </w:t>
+      </w:r>
+      <w:proofErr w:type="gramStart"/>
+      <w:r>
+        <w:t>lacks</w:t>
+      </w:r>
+      <w:proofErr w:type="gramEnd"/>
+      <w:r>
+        <w:t xml:space="preserve"> sufficient positive/negative contrast</w:t>
       </w:r>
     </w:p>
     <w:p>
@@ -3074,7 +4786,39 @@
           <w:i/>
           <w:iCs/>
         </w:rPr>
-        <w:t xml:space="preserve">Author's note: In the Yambda tutorial, we use the Global Temporal Split (GTS) protocol from the Yambda paper: 300 days of training data, a 30-minute gap to prevent leakage, and 1 day of test data. </w:t>
+        <w:t xml:space="preserve">Author's note: In the </w:t>
+      </w:r>
+      <w:proofErr w:type="spellStart"/>
+      <w:r>
+        <w:rPr>
+          <w:i/>
+          <w:iCs/>
+        </w:rPr>
+        <w:t>Yambda</w:t>
+      </w:r>
+      <w:proofErr w:type="spellEnd"/>
+      <w:r>
+        <w:rPr>
+          <w:i/>
+          <w:iCs/>
+        </w:rPr>
+        <w:t xml:space="preserve"> tutorial, we use the Global Temporal Split (GTS) protocol from the </w:t>
+      </w:r>
+      <w:proofErr w:type="spellStart"/>
+      <w:r>
+        <w:rPr>
+          <w:i/>
+          <w:iCs/>
+        </w:rPr>
+        <w:t>Yambda</w:t>
+      </w:r>
+      <w:proofErr w:type="spellEnd"/>
+      <w:r>
+        <w:rPr>
+          <w:i/>
+          <w:iCs/>
+        </w:rPr>
+        <w:t xml:space="preserve"> paper: 300 days of training data, a 30-minute gap to prevent leakage, and 1 day of test data. </w:t>
       </w:r>
     </w:p>
     <w:p>
@@ -3082,7 +4826,15 @@
         <w:pStyle w:val="Heading2"/>
       </w:pPr>
       <w:r>
-        <w:t>6.5 DeepFM: Automating Feature Crosses</w:t>
+        <w:t xml:space="preserve">6.5 </w:t>
+      </w:r>
+      <w:proofErr w:type="spellStart"/>
+      <w:r>
+        <w:t>DeepFM</w:t>
+      </w:r>
+      <w:proofErr w:type="spellEnd"/>
+      <w:r>
+        <w:t>: Automating Feature Crosses</w:t>
       </w:r>
     </w:p>
     <w:p>
@@ -3090,7 +4842,15 @@
         <w:spacing w:after="200" w:line="276" w:lineRule="auto"/>
       </w:pPr>
       <w:r>
-        <w:t>While XGBoost handles feature interactions through tree splits, it relies on the model to discover them during training. DeepFM (Guo et al., 2017) takes a different approach: it explicitly models all pairwise feature interactions through a Factorization Machine (FM) component, combined with a deep neural network for higher-order patterns.</w:t>
+        <w:t xml:space="preserve">While XGBoost handles feature interactions through tree splits, it relies on the model to discover them during training. </w:t>
+      </w:r>
+      <w:proofErr w:type="spellStart"/>
+      <w:r>
+        <w:t>DeepFM</w:t>
+      </w:r>
+      <w:proofErr w:type="spellEnd"/>
+      <w:r>
+        <w:t xml:space="preserve"> (Guo et al., 2017) takes a different approach: it explicitly models all pairwise feature interactions through a Factorization Machine (FM) component, combined with a deep neural network for higher-order patterns.</w:t>
       </w:r>
     </w:p>
     <w:p>
@@ -3105,8 +4865,13 @@
       <w:pPr>
         <w:spacing w:after="200" w:line="276" w:lineRule="auto"/>
       </w:pPr>
-      <w:r>
-        <w:t>DeepFM has two parallel components that share the same input embeddings:</w:t>
+      <w:proofErr w:type="spellStart"/>
+      <w:r>
+        <w:t>DeepFM</w:t>
+      </w:r>
+      <w:proofErr w:type="spellEnd"/>
+      <w:r>
+        <w:t xml:space="preserve"> has two parallel components that share the same input embeddings:</w:t>
       </w:r>
     </w:p>
     <w:p>
@@ -3127,7 +4892,23 @@
         <w:t xml:space="preserve">FM component: </w:t>
       </w:r>
       <w:r>
-        <w:t>Assigns each feature an embedding vector and computes all pairwise dot products between these vectors. This explicitly captures second-order feature interactions (e.g., 'user_age x item_genre') without manual feature engineering.</w:t>
+        <w:t>Assigns each feature an embedding vector and computes all pairwise dot products between these vectors. This explicitly captures second-order feature interactions (e.g., '</w:t>
+      </w:r>
+      <w:proofErr w:type="spellStart"/>
+      <w:r>
+        <w:t>user_age</w:t>
+      </w:r>
+      <w:proofErr w:type="spellEnd"/>
+      <w:r>
+        <w:t xml:space="preserve"> x </w:t>
+      </w:r>
+      <w:proofErr w:type="spellStart"/>
+      <w:r>
+        <w:t>item_genre</w:t>
+      </w:r>
+      <w:proofErr w:type="spellEnd"/>
+      <w:r>
+        <w:t>') without manual feature engineering.</w:t>
       </w:r>
     </w:p>
     <w:p>
@@ -3160,187 +4941,6 @@
     </w:p>
     <w:p>
       <w:pPr>
-        <w:pBdr>
-          <w:top w:val="single" w:sz="4" w:space="4" w:color="CCCCCC"/>
-          <w:left w:val="single" w:sz="4" w:space="4" w:color="CCCCCC"/>
-          <w:bottom w:val="single" w:sz="4" w:space="4" w:color="CCCCCC"/>
-          <w:right w:val="single" w:sz="4" w:space="4" w:color="CCCCCC"/>
-        </w:pBdr>
-        <w:shd w:val="clear" w:color="auto" w:fill="F2F2F2"/>
-        <w:spacing w:before="120" w:after="200"/>
-      </w:pPr>
-      <w:r>
-        <w:rPr>
-          <w:rFonts w:ascii="Consolas" w:hAnsi="Consolas" w:cs="Consolas"/>
-          <w:sz w:val="20"/>
-          <w:szCs w:val="20"/>
-        </w:rPr>
-        <w:t>class FMLayer(nn.Module):</w:t>
-      </w:r>
-      <w:r>
-        <w:rPr>
-          <w:rFonts w:ascii="Consolas" w:hAnsi="Consolas" w:cs="Consolas"/>
-          <w:sz w:val="20"/>
-          <w:szCs w:val="20"/>
-        </w:rPr>
-        <w:br/>
-        <w:t xml:space="preserve">    """Factorization Machine: efficient 2nd-order feature interactions.</w:t>
-      </w:r>
-      <w:r>
-        <w:rPr>
-          <w:rFonts w:ascii="Consolas" w:hAnsi="Consolas" w:cs="Consolas"/>
-          <w:sz w:val="20"/>
-          <w:szCs w:val="20"/>
-        </w:rPr>
-        <w:br/>
-        <w:t xml:space="preserve">    FM output = 0.5 * (||sum(v_i)||^2 - sum(||v_i||^2))</w:t>
-      </w:r>
-      <w:r>
-        <w:rPr>
-          <w:rFonts w:ascii="Consolas" w:hAnsi="Consolas" w:cs="Consolas"/>
-          <w:sz w:val="20"/>
-          <w:szCs w:val="20"/>
-        </w:rPr>
-        <w:br/>
-        <w:t xml:space="preserve">    """</w:t>
-      </w:r>
-      <w:r>
-        <w:rPr>
-          <w:rFonts w:ascii="Consolas" w:hAnsi="Consolas" w:cs="Consolas"/>
-          <w:sz w:val="20"/>
-          <w:szCs w:val="20"/>
-        </w:rPr>
-        <w:br/>
-        <w:t xml:space="preserve">    def forward(self, embeddings):  # (batch, num_fields, embed_dim)</w:t>
-      </w:r>
-      <w:r>
-        <w:rPr>
-          <w:rFonts w:ascii="Consolas" w:hAnsi="Consolas" w:cs="Consolas"/>
-          <w:sz w:val="20"/>
-          <w:szCs w:val="20"/>
-        </w:rPr>
-        <w:br/>
-        <w:t xml:space="preserve">        square_of_sum = torch.sum(embeddings, dim=1) ** 2</w:t>
-      </w:r>
-      <w:r>
-        <w:rPr>
-          <w:rFonts w:ascii="Consolas" w:hAnsi="Consolas" w:cs="Consolas"/>
-          <w:sz w:val="20"/>
-          <w:szCs w:val="20"/>
-        </w:rPr>
-        <w:br/>
-        <w:t xml:space="preserve">        sum_of_square = torch.sum(embeddings ** 2, dim=1)</w:t>
-      </w:r>
-      <w:r>
-        <w:rPr>
-          <w:rFonts w:ascii="Consolas" w:hAnsi="Consolas" w:cs="Consolas"/>
-          <w:sz w:val="20"/>
-          <w:szCs w:val="20"/>
-        </w:rPr>
-        <w:br/>
-        <w:t xml:space="preserve">        return 0.5 * torch.sum(square_of_sum - sum_of_square, dim=1, keepdim=True)</w:t>
-      </w:r>
-      <w:r>
-        <w:rPr>
-          <w:rFonts w:ascii="Consolas" w:hAnsi="Consolas" w:cs="Consolas"/>
-          <w:sz w:val="20"/>
-          <w:szCs w:val="20"/>
-        </w:rPr>
-        <w:br/>
-      </w:r>
-      <w:r>
-        <w:rPr>
-          <w:rFonts w:ascii="Consolas" w:hAnsi="Consolas" w:cs="Consolas"/>
-          <w:sz w:val="20"/>
-          <w:szCs w:val="20"/>
-        </w:rPr>
-        <w:br/>
-        <w:t>class DeepFM(nn.Module):</w:t>
-      </w:r>
-      <w:r>
-        <w:rPr>
-          <w:rFonts w:ascii="Consolas" w:hAnsi="Consolas" w:cs="Consolas"/>
-          <w:sz w:val="20"/>
-          <w:szCs w:val="20"/>
-        </w:rPr>
-        <w:br/>
-        <w:t xml:space="preserve">    def forward(self, sparse_inputs, dense_inputs=None):</w:t>
-      </w:r>
-      <w:r>
-        <w:rPr>
-          <w:rFonts w:ascii="Consolas" w:hAnsi="Consolas" w:cs="Consolas"/>
-          <w:sz w:val="20"/>
-          <w:szCs w:val="20"/>
-        </w:rPr>
-        <w:br/>
-        <w:t xml:space="preserve">        # 1st order: linear embeddings</w:t>
-      </w:r>
-      <w:r>
-        <w:rPr>
-          <w:rFonts w:ascii="Consolas" w:hAnsi="Consolas" w:cs="Consolas"/>
-          <w:sz w:val="20"/>
-          <w:szCs w:val="20"/>
-        </w:rPr>
-        <w:br/>
-        <w:t xml:space="preserve">        linear_out = sum(self.linear_embeddings[f](idx) for f, idx in sparse_inputs.items())</w:t>
-      </w:r>
-      <w:r>
-        <w:rPr>
-          <w:rFonts w:ascii="Consolas" w:hAnsi="Consolas" w:cs="Consolas"/>
-          <w:sz w:val="20"/>
-          <w:szCs w:val="20"/>
-        </w:rPr>
-        <w:br/>
-        <w:t xml:space="preserve">        # 2nd order: FM pairwise interactions</w:t>
-      </w:r>
-      <w:r>
-        <w:rPr>
-          <w:rFonts w:ascii="Consolas" w:hAnsi="Consolas" w:cs="Consolas"/>
-          <w:sz w:val="20"/>
-          <w:szCs w:val="20"/>
-        </w:rPr>
-        <w:br/>
-        <w:t xml:space="preserve">        stacked = torch.stack([self.embeddings[f](idx) for f, idx in sparse_inputs.items()], dim=1)</w:t>
-      </w:r>
-      <w:r>
-        <w:rPr>
-          <w:rFonts w:ascii="Consolas" w:hAnsi="Consolas" w:cs="Consolas"/>
-          <w:sz w:val="20"/>
-          <w:szCs w:val="20"/>
-        </w:rPr>
-        <w:br/>
-        <w:t xml:space="preserve">        fm_out = self.fm(stacked)</w:t>
-      </w:r>
-      <w:r>
-        <w:rPr>
-          <w:rFonts w:ascii="Consolas" w:hAnsi="Consolas" w:cs="Consolas"/>
-          <w:sz w:val="20"/>
-          <w:szCs w:val="20"/>
-        </w:rPr>
-        <w:br/>
-        <w:t xml:space="preserve">        # Higher order: DNN on concatenated embeddings</w:t>
-      </w:r>
-      <w:r>
-        <w:rPr>
-          <w:rFonts w:ascii="Consolas" w:hAnsi="Consolas" w:cs="Consolas"/>
-          <w:sz w:val="20"/>
-          <w:szCs w:val="20"/>
-        </w:rPr>
-        <w:br/>
-        <w:t xml:space="preserve">        dnn_out = self.output_layer(self.dnn(torch.cat([...], dim=1)))</w:t>
-      </w:r>
-      <w:r>
-        <w:rPr>
-          <w:rFonts w:ascii="Consolas" w:hAnsi="Consolas" w:cs="Consolas"/>
-          <w:sz w:val="20"/>
-          <w:szCs w:val="20"/>
-        </w:rPr>
-        <w:br/>
-        <w:t xml:space="preserve">        return linear_out + fm_out + dnn_out  # Sum all three terms</w:t>
-      </w:r>
-    </w:p>
-    <w:p>
-      <w:pPr>
         <w:jc w:val="center"/>
         <w:rPr>
           <w:i/>
@@ -3354,7 +4954,7 @@
           <w:color w:val="808080"/>
         </w:rPr>
         <w:drawing>
-          <wp:inline distT="0" distB="0" distL="0" distR="0" wp14:anchorId="541A68A3" wp14:editId="23F6E31F">
+          <wp:inline distT="0" distB="0" distL="0" distR="0" wp14:anchorId="58E8488E" wp14:editId="62345A48">
             <wp:extent cx="5943600" cy="2439670"/>
             <wp:effectExtent l="0" t="0" r="0" b="0"/>
             <wp:docPr id="1271002756" name="Picture 1"/>
@@ -3399,16 +4999,924 @@
           <w:i/>
           <w:color w:val="808080"/>
         </w:rPr>
-        <w:lastRenderedPageBreak/>
-        <w:t>Figure 1</w:t>
-      </w:r>
+        <w:t xml:space="preserve">Figure 1: </w:t>
+      </w:r>
+      <w:proofErr w:type="spellStart"/>
       <w:r>
         <w:rPr>
           <w:i/>
           <w:color w:val="808080"/>
         </w:rPr>
-        <w:t>: DeepFM architecture showing shared embeddings feeding into parallel FM (pairwise dot products) and Deep (MLP) components, with outputs summed through sigmoid</w:t>
-      </w:r>
+        <w:t>DeepFM</w:t>
+      </w:r>
+      <w:proofErr w:type="spellEnd"/>
+      <w:r>
+        <w:rPr>
+          <w:i/>
+          <w:color w:val="808080"/>
+        </w:rPr>
+        <w:t xml:space="preserve"> neural architecture - </w:t>
+      </w:r>
+      <w:r>
+        <w:rPr>
+          <w:i/>
+          <w:color w:val="808080"/>
+        </w:rPr>
+        <w:t xml:space="preserve">Raw sparse features feed two paths: per-feature scalar weights wᵢ drive the FM component's order-1 linear term, while shared dense embeddings Vᵢ are reused by both the FM component's order-2 pairwise inner products and the deep MLP for higher-order interactions. FM and Deep outputs are summed through a sigmoid, ŷ = </w:t>
+      </w:r>
+      <w:proofErr w:type="gramStart"/>
+      <w:r>
+        <w:rPr>
+          <w:i/>
+          <w:color w:val="808080"/>
+        </w:rPr>
+        <w:t>σ(</w:t>
+      </w:r>
+      <w:proofErr w:type="spellStart"/>
+      <w:proofErr w:type="gramEnd"/>
+      <w:r>
+        <w:rPr>
+          <w:i/>
+          <w:color w:val="808080"/>
+        </w:rPr>
+        <w:t>y_FM</w:t>
+      </w:r>
+      <w:proofErr w:type="spellEnd"/>
+      <w:r>
+        <w:rPr>
+          <w:i/>
+          <w:color w:val="808080"/>
+        </w:rPr>
+        <w:t xml:space="preserve"> + </w:t>
+      </w:r>
+      <w:proofErr w:type="spellStart"/>
+      <w:r>
+        <w:rPr>
+          <w:i/>
+          <w:color w:val="808080"/>
+        </w:rPr>
+        <w:t>y_DNN</w:t>
+      </w:r>
+      <w:proofErr w:type="spellEnd"/>
+      <w:r>
+        <w:rPr>
+          <w:i/>
+          <w:color w:val="808080"/>
+        </w:rPr>
+        <w:t>).</w:t>
+      </w:r>
+    </w:p>
+    <w:p>
+      <w:pPr>
+        <w:spacing w:after="200" w:line="276" w:lineRule="auto"/>
+      </w:pPr>
+    </w:p>
+    <w:p>
+      <w:pPr>
+        <w:spacing w:after="200" w:line="276" w:lineRule="auto"/>
+      </w:pPr>
+    </w:p>
+    <w:p>
+      <w:pPr>
+        <w:spacing w:after="200" w:line="276" w:lineRule="auto"/>
+      </w:pPr>
+    </w:p>
+    <w:p>
+      <w:pPr>
+        <w:spacing w:after="200" w:line="276" w:lineRule="auto"/>
+      </w:pPr>
+      <w:r>
+        <w:t>The portions of the code are as follows:</w:t>
+      </w:r>
+    </w:p>
+    <w:p>
+      <w:pPr>
+        <w:pBdr>
+          <w:top w:val="single" w:sz="4" w:space="4" w:color="CCCCCC"/>
+          <w:left w:val="single" w:sz="4" w:space="4" w:color="CCCCCC"/>
+          <w:bottom w:val="single" w:sz="4" w:space="4" w:color="CCCCCC"/>
+          <w:right w:val="single" w:sz="4" w:space="4" w:color="CCCCCC"/>
+        </w:pBdr>
+        <w:shd w:val="clear" w:color="auto" w:fill="F2F2F2"/>
+        <w:spacing w:before="120" w:after="200"/>
+        <w:rPr>
+          <w:rFonts w:ascii="Consolas" w:hAnsi="Consolas" w:cs="Consolas"/>
+          <w:sz w:val="20"/>
+          <w:szCs w:val="20"/>
+        </w:rPr>
+      </w:pPr>
+      <w:r>
+        <w:rPr>
+          <w:rFonts w:ascii="Consolas" w:hAnsi="Consolas" w:cs="Consolas"/>
+          <w:sz w:val="20"/>
+          <w:szCs w:val="20"/>
+        </w:rPr>
+        <w:t xml:space="preserve">class </w:t>
+      </w:r>
+      <w:proofErr w:type="spellStart"/>
+      <w:r>
+        <w:rPr>
+          <w:rFonts w:ascii="Consolas" w:hAnsi="Consolas" w:cs="Consolas"/>
+          <w:sz w:val="20"/>
+          <w:szCs w:val="20"/>
+        </w:rPr>
+        <w:t>FMLayer</w:t>
+      </w:r>
+      <w:proofErr w:type="spellEnd"/>
+      <w:r>
+        <w:rPr>
+          <w:rFonts w:ascii="Consolas" w:hAnsi="Consolas" w:cs="Consolas"/>
+          <w:sz w:val="20"/>
+          <w:szCs w:val="20"/>
+        </w:rPr>
+        <w:t>(</w:t>
+      </w:r>
+      <w:proofErr w:type="spellStart"/>
+      <w:r>
+        <w:rPr>
+          <w:rFonts w:ascii="Consolas" w:hAnsi="Consolas" w:cs="Consolas"/>
+          <w:sz w:val="20"/>
+          <w:szCs w:val="20"/>
+        </w:rPr>
+        <w:t>nn.Module</w:t>
+      </w:r>
+      <w:proofErr w:type="spellEnd"/>
+      <w:r>
+        <w:rPr>
+          <w:rFonts w:ascii="Consolas" w:hAnsi="Consolas" w:cs="Consolas"/>
+          <w:sz w:val="20"/>
+          <w:szCs w:val="20"/>
+        </w:rPr>
+        <w:t>):</w:t>
+      </w:r>
+      <w:r>
+        <w:rPr>
+          <w:rFonts w:ascii="Consolas" w:hAnsi="Consolas" w:cs="Consolas"/>
+          <w:sz w:val="20"/>
+          <w:szCs w:val="20"/>
+        </w:rPr>
+        <w:br/>
+        <w:t xml:space="preserve">    """Factorization Machine: efficient 2nd-order feature interactions.</w:t>
+      </w:r>
+      <w:r>
+        <w:rPr>
+          <w:rFonts w:ascii="Consolas" w:hAnsi="Consolas" w:cs="Consolas"/>
+          <w:sz w:val="20"/>
+          <w:szCs w:val="20"/>
+        </w:rPr>
+        <w:br/>
+        <w:t xml:space="preserve">    FM output = 0.5 * (||sum(</w:t>
+      </w:r>
+      <w:proofErr w:type="spellStart"/>
+      <w:r>
+        <w:rPr>
+          <w:rFonts w:ascii="Consolas" w:hAnsi="Consolas" w:cs="Consolas"/>
+          <w:sz w:val="20"/>
+          <w:szCs w:val="20"/>
+        </w:rPr>
+        <w:t>v_i</w:t>
+      </w:r>
+      <w:proofErr w:type="spellEnd"/>
+      <w:r>
+        <w:rPr>
+          <w:rFonts w:ascii="Consolas" w:hAnsi="Consolas" w:cs="Consolas"/>
+          <w:sz w:val="20"/>
+          <w:szCs w:val="20"/>
+        </w:rPr>
+        <w:t>)||^2 - sum(||</w:t>
+      </w:r>
+      <w:proofErr w:type="spellStart"/>
+      <w:r>
+        <w:rPr>
+          <w:rFonts w:ascii="Consolas" w:hAnsi="Consolas" w:cs="Consolas"/>
+          <w:sz w:val="20"/>
+          <w:szCs w:val="20"/>
+        </w:rPr>
+        <w:t>v_i</w:t>
+      </w:r>
+      <w:proofErr w:type="spellEnd"/>
+      <w:r>
+        <w:rPr>
+          <w:rFonts w:ascii="Consolas" w:hAnsi="Consolas" w:cs="Consolas"/>
+          <w:sz w:val="20"/>
+          <w:szCs w:val="20"/>
+        </w:rPr>
+        <w:t>||^2))</w:t>
+      </w:r>
+      <w:r>
+        <w:rPr>
+          <w:rFonts w:ascii="Consolas" w:hAnsi="Consolas" w:cs="Consolas"/>
+          <w:sz w:val="20"/>
+          <w:szCs w:val="20"/>
+        </w:rPr>
+        <w:br/>
+        <w:t xml:space="preserve">    """</w:t>
+      </w:r>
+      <w:r>
+        <w:rPr>
+          <w:rFonts w:ascii="Consolas" w:hAnsi="Consolas" w:cs="Consolas"/>
+          <w:sz w:val="20"/>
+          <w:szCs w:val="20"/>
+        </w:rPr>
+        <w:br/>
+        <w:t xml:space="preserve">    def forward(self, embeddings):  # (batch, </w:t>
+      </w:r>
+      <w:proofErr w:type="spellStart"/>
+      <w:r>
+        <w:rPr>
+          <w:rFonts w:ascii="Consolas" w:hAnsi="Consolas" w:cs="Consolas"/>
+          <w:sz w:val="20"/>
+          <w:szCs w:val="20"/>
+        </w:rPr>
+        <w:t>num_fields</w:t>
+      </w:r>
+      <w:proofErr w:type="spellEnd"/>
+      <w:r>
+        <w:rPr>
+          <w:rFonts w:ascii="Consolas" w:hAnsi="Consolas" w:cs="Consolas"/>
+          <w:sz w:val="20"/>
+          <w:szCs w:val="20"/>
+        </w:rPr>
+        <w:t xml:space="preserve">, </w:t>
+      </w:r>
+      <w:proofErr w:type="spellStart"/>
+      <w:r>
+        <w:rPr>
+          <w:rFonts w:ascii="Consolas" w:hAnsi="Consolas" w:cs="Consolas"/>
+          <w:sz w:val="20"/>
+          <w:szCs w:val="20"/>
+        </w:rPr>
+        <w:t>embed_dim</w:t>
+      </w:r>
+      <w:proofErr w:type="spellEnd"/>
+      <w:r>
+        <w:rPr>
+          <w:rFonts w:ascii="Consolas" w:hAnsi="Consolas" w:cs="Consolas"/>
+          <w:sz w:val="20"/>
+          <w:szCs w:val="20"/>
+        </w:rPr>
+        <w:t>)</w:t>
+      </w:r>
+      <w:r>
+        <w:rPr>
+          <w:rFonts w:ascii="Consolas" w:hAnsi="Consolas" w:cs="Consolas"/>
+          <w:sz w:val="20"/>
+          <w:szCs w:val="20"/>
+        </w:rPr>
+        <w:br/>
+        <w:t xml:space="preserve">        </w:t>
+      </w:r>
+      <w:proofErr w:type="spellStart"/>
+      <w:r>
+        <w:rPr>
+          <w:rFonts w:ascii="Consolas" w:hAnsi="Consolas" w:cs="Consolas"/>
+          <w:sz w:val="20"/>
+          <w:szCs w:val="20"/>
+        </w:rPr>
+        <w:t>square_of_sum</w:t>
+      </w:r>
+      <w:proofErr w:type="spellEnd"/>
+      <w:r>
+        <w:rPr>
+          <w:rFonts w:ascii="Consolas" w:hAnsi="Consolas" w:cs="Consolas"/>
+          <w:sz w:val="20"/>
+          <w:szCs w:val="20"/>
+        </w:rPr>
+        <w:t xml:space="preserve"> = </w:t>
+      </w:r>
+      <w:proofErr w:type="spellStart"/>
+      <w:r>
+        <w:rPr>
+          <w:rFonts w:ascii="Consolas" w:hAnsi="Consolas" w:cs="Consolas"/>
+          <w:sz w:val="20"/>
+          <w:szCs w:val="20"/>
+        </w:rPr>
+        <w:t>torch.sum</w:t>
+      </w:r>
+      <w:proofErr w:type="spellEnd"/>
+      <w:r>
+        <w:rPr>
+          <w:rFonts w:ascii="Consolas" w:hAnsi="Consolas" w:cs="Consolas"/>
+          <w:sz w:val="20"/>
+          <w:szCs w:val="20"/>
+        </w:rPr>
+        <w:t>(embeddings, dim=1) ** 2</w:t>
+      </w:r>
+      <w:r>
+        <w:rPr>
+          <w:rFonts w:ascii="Consolas" w:hAnsi="Consolas" w:cs="Consolas"/>
+          <w:sz w:val="20"/>
+          <w:szCs w:val="20"/>
+        </w:rPr>
+        <w:br/>
+        <w:t xml:space="preserve">        </w:t>
+      </w:r>
+      <w:proofErr w:type="spellStart"/>
+      <w:r>
+        <w:rPr>
+          <w:rFonts w:ascii="Consolas" w:hAnsi="Consolas" w:cs="Consolas"/>
+          <w:sz w:val="20"/>
+          <w:szCs w:val="20"/>
+        </w:rPr>
+        <w:t>sum_of_square</w:t>
+      </w:r>
+      <w:proofErr w:type="spellEnd"/>
+      <w:r>
+        <w:rPr>
+          <w:rFonts w:ascii="Consolas" w:hAnsi="Consolas" w:cs="Consolas"/>
+          <w:sz w:val="20"/>
+          <w:szCs w:val="20"/>
+        </w:rPr>
+        <w:t xml:space="preserve"> = </w:t>
+      </w:r>
+      <w:proofErr w:type="spellStart"/>
+      <w:r>
+        <w:rPr>
+          <w:rFonts w:ascii="Consolas" w:hAnsi="Consolas" w:cs="Consolas"/>
+          <w:sz w:val="20"/>
+          <w:szCs w:val="20"/>
+        </w:rPr>
+        <w:t>torch.sum</w:t>
+      </w:r>
+      <w:proofErr w:type="spellEnd"/>
+      <w:r>
+        <w:rPr>
+          <w:rFonts w:ascii="Consolas" w:hAnsi="Consolas" w:cs="Consolas"/>
+          <w:sz w:val="20"/>
+          <w:szCs w:val="20"/>
+        </w:rPr>
+        <w:t>(embeddings ** 2, dim=1)</w:t>
+      </w:r>
+      <w:r>
+        <w:rPr>
+          <w:rFonts w:ascii="Consolas" w:hAnsi="Consolas" w:cs="Consolas"/>
+          <w:sz w:val="20"/>
+          <w:szCs w:val="20"/>
+        </w:rPr>
+        <w:br/>
+        <w:t xml:space="preserve">        return 0.5 * </w:t>
+      </w:r>
+      <w:proofErr w:type="spellStart"/>
+      <w:r>
+        <w:rPr>
+          <w:rFonts w:ascii="Consolas" w:hAnsi="Consolas" w:cs="Consolas"/>
+          <w:sz w:val="20"/>
+          <w:szCs w:val="20"/>
+        </w:rPr>
+        <w:t>torch.sum</w:t>
+      </w:r>
+      <w:proofErr w:type="spellEnd"/>
+      <w:r>
+        <w:rPr>
+          <w:rFonts w:ascii="Consolas" w:hAnsi="Consolas" w:cs="Consolas"/>
+          <w:sz w:val="20"/>
+          <w:szCs w:val="20"/>
+        </w:rPr>
+        <w:t>(</w:t>
+      </w:r>
+      <w:proofErr w:type="spellStart"/>
+      <w:r>
+        <w:rPr>
+          <w:rFonts w:ascii="Consolas" w:hAnsi="Consolas" w:cs="Consolas"/>
+          <w:sz w:val="20"/>
+          <w:szCs w:val="20"/>
+        </w:rPr>
+        <w:t>square_of_sum</w:t>
+      </w:r>
+      <w:proofErr w:type="spellEnd"/>
+      <w:r>
+        <w:rPr>
+          <w:rFonts w:ascii="Consolas" w:hAnsi="Consolas" w:cs="Consolas"/>
+          <w:sz w:val="20"/>
+          <w:szCs w:val="20"/>
+        </w:rPr>
+        <w:t xml:space="preserve"> - </w:t>
+      </w:r>
+      <w:proofErr w:type="spellStart"/>
+      <w:r>
+        <w:rPr>
+          <w:rFonts w:ascii="Consolas" w:hAnsi="Consolas" w:cs="Consolas"/>
+          <w:sz w:val="20"/>
+          <w:szCs w:val="20"/>
+        </w:rPr>
+        <w:t>sum_of_square</w:t>
+      </w:r>
+      <w:proofErr w:type="spellEnd"/>
+      <w:r>
+        <w:rPr>
+          <w:rFonts w:ascii="Consolas" w:hAnsi="Consolas" w:cs="Consolas"/>
+          <w:sz w:val="20"/>
+          <w:szCs w:val="20"/>
+        </w:rPr>
+        <w:t xml:space="preserve">, dim=1, </w:t>
+      </w:r>
+      <w:proofErr w:type="spellStart"/>
+      <w:r>
+        <w:rPr>
+          <w:rFonts w:ascii="Consolas" w:hAnsi="Consolas" w:cs="Consolas"/>
+          <w:sz w:val="20"/>
+          <w:szCs w:val="20"/>
+        </w:rPr>
+        <w:t>keepdim</w:t>
+      </w:r>
+      <w:proofErr w:type="spellEnd"/>
+      <w:r>
+        <w:rPr>
+          <w:rFonts w:ascii="Consolas" w:hAnsi="Consolas" w:cs="Consolas"/>
+          <w:sz w:val="20"/>
+          <w:szCs w:val="20"/>
+        </w:rPr>
+        <w:t>=True)</w:t>
+      </w:r>
+      <w:r>
+        <w:rPr>
+          <w:rFonts w:ascii="Consolas" w:hAnsi="Consolas" w:cs="Consolas"/>
+          <w:sz w:val="20"/>
+          <w:szCs w:val="20"/>
+        </w:rPr>
+        <w:br/>
+      </w:r>
+      <w:r>
+        <w:rPr>
+          <w:rFonts w:ascii="Consolas" w:hAnsi="Consolas" w:cs="Consolas"/>
+          <w:sz w:val="20"/>
+          <w:szCs w:val="20"/>
+        </w:rPr>
+        <w:lastRenderedPageBreak/>
+        <w:br/>
+        <w:t xml:space="preserve">class </w:t>
+      </w:r>
+      <w:proofErr w:type="spellStart"/>
+      <w:r>
+        <w:rPr>
+          <w:rFonts w:ascii="Consolas" w:hAnsi="Consolas" w:cs="Consolas"/>
+          <w:sz w:val="20"/>
+          <w:szCs w:val="20"/>
+        </w:rPr>
+        <w:t>DeepFM</w:t>
+      </w:r>
+      <w:proofErr w:type="spellEnd"/>
+      <w:r>
+        <w:rPr>
+          <w:rFonts w:ascii="Consolas" w:hAnsi="Consolas" w:cs="Consolas"/>
+          <w:sz w:val="20"/>
+          <w:szCs w:val="20"/>
+        </w:rPr>
+        <w:t>(</w:t>
+      </w:r>
+      <w:proofErr w:type="spellStart"/>
+      <w:r>
+        <w:rPr>
+          <w:rFonts w:ascii="Consolas" w:hAnsi="Consolas" w:cs="Consolas"/>
+          <w:sz w:val="20"/>
+          <w:szCs w:val="20"/>
+        </w:rPr>
+        <w:t>nn.Module</w:t>
+      </w:r>
+      <w:proofErr w:type="spellEnd"/>
+      <w:r>
+        <w:rPr>
+          <w:rFonts w:ascii="Consolas" w:hAnsi="Consolas" w:cs="Consolas"/>
+          <w:sz w:val="20"/>
+          <w:szCs w:val="20"/>
+        </w:rPr>
+        <w:t>):</w:t>
+      </w:r>
+      <w:r>
+        <w:rPr>
+          <w:rFonts w:ascii="Consolas" w:hAnsi="Consolas" w:cs="Consolas"/>
+          <w:sz w:val="20"/>
+          <w:szCs w:val="20"/>
+        </w:rPr>
+        <w:br/>
+        <w:t xml:space="preserve">    def forward(self, </w:t>
+      </w:r>
+      <w:proofErr w:type="spellStart"/>
+      <w:r>
+        <w:rPr>
+          <w:rFonts w:ascii="Consolas" w:hAnsi="Consolas" w:cs="Consolas"/>
+          <w:sz w:val="20"/>
+          <w:szCs w:val="20"/>
+        </w:rPr>
+        <w:t>sparse_inputs</w:t>
+      </w:r>
+      <w:proofErr w:type="spellEnd"/>
+      <w:r>
+        <w:rPr>
+          <w:rFonts w:ascii="Consolas" w:hAnsi="Consolas" w:cs="Consolas"/>
+          <w:sz w:val="20"/>
+          <w:szCs w:val="20"/>
+        </w:rPr>
+        <w:t xml:space="preserve">, </w:t>
+      </w:r>
+      <w:proofErr w:type="spellStart"/>
+      <w:r>
+        <w:rPr>
+          <w:rFonts w:ascii="Consolas" w:hAnsi="Consolas" w:cs="Consolas"/>
+          <w:sz w:val="20"/>
+          <w:szCs w:val="20"/>
+        </w:rPr>
+        <w:t>dense_inputs</w:t>
+      </w:r>
+      <w:proofErr w:type="spellEnd"/>
+      <w:r>
+        <w:rPr>
+          <w:rFonts w:ascii="Consolas" w:hAnsi="Consolas" w:cs="Consolas"/>
+          <w:sz w:val="20"/>
+          <w:szCs w:val="20"/>
+        </w:rPr>
+        <w:t>=None):</w:t>
+      </w:r>
+      <w:r>
+        <w:rPr>
+          <w:rFonts w:ascii="Consolas" w:hAnsi="Consolas" w:cs="Consolas"/>
+          <w:sz w:val="20"/>
+          <w:szCs w:val="20"/>
+        </w:rPr>
+        <w:br/>
+        <w:t xml:space="preserve">        # 1st order: linear embeddings</w:t>
+      </w:r>
+      <w:r>
+        <w:rPr>
+          <w:rFonts w:ascii="Consolas" w:hAnsi="Consolas" w:cs="Consolas"/>
+          <w:sz w:val="20"/>
+          <w:szCs w:val="20"/>
+        </w:rPr>
+        <w:br/>
+        <w:t xml:space="preserve">        </w:t>
+      </w:r>
+      <w:proofErr w:type="spellStart"/>
+      <w:r>
+        <w:rPr>
+          <w:rFonts w:ascii="Consolas" w:hAnsi="Consolas" w:cs="Consolas"/>
+          <w:sz w:val="20"/>
+          <w:szCs w:val="20"/>
+        </w:rPr>
+        <w:t>linear_out</w:t>
+      </w:r>
+      <w:proofErr w:type="spellEnd"/>
+      <w:r>
+        <w:rPr>
+          <w:rFonts w:ascii="Consolas" w:hAnsi="Consolas" w:cs="Consolas"/>
+          <w:sz w:val="20"/>
+          <w:szCs w:val="20"/>
+        </w:rPr>
+        <w:t xml:space="preserve"> = sum(</w:t>
+      </w:r>
+      <w:proofErr w:type="spellStart"/>
+      <w:r>
+        <w:rPr>
+          <w:rFonts w:ascii="Consolas" w:hAnsi="Consolas" w:cs="Consolas"/>
+          <w:sz w:val="20"/>
+          <w:szCs w:val="20"/>
+        </w:rPr>
+        <w:t>self.linear_embeddings</w:t>
+      </w:r>
+      <w:proofErr w:type="spellEnd"/>
+      <w:r>
+        <w:rPr>
+          <w:rFonts w:ascii="Consolas" w:hAnsi="Consolas" w:cs="Consolas"/>
+          <w:sz w:val="20"/>
+          <w:szCs w:val="20"/>
+        </w:rPr>
+        <w:t>[f](</w:t>
+      </w:r>
+      <w:proofErr w:type="spellStart"/>
+      <w:r>
+        <w:rPr>
+          <w:rFonts w:ascii="Consolas" w:hAnsi="Consolas" w:cs="Consolas"/>
+          <w:sz w:val="20"/>
+          <w:szCs w:val="20"/>
+        </w:rPr>
+        <w:t>idx</w:t>
+      </w:r>
+      <w:proofErr w:type="spellEnd"/>
+      <w:r>
+        <w:rPr>
+          <w:rFonts w:ascii="Consolas" w:hAnsi="Consolas" w:cs="Consolas"/>
+          <w:sz w:val="20"/>
+          <w:szCs w:val="20"/>
+        </w:rPr>
+        <w:t xml:space="preserve">) for f, </w:t>
+      </w:r>
+      <w:proofErr w:type="spellStart"/>
+      <w:r>
+        <w:rPr>
+          <w:rFonts w:ascii="Consolas" w:hAnsi="Consolas" w:cs="Consolas"/>
+          <w:sz w:val="20"/>
+          <w:szCs w:val="20"/>
+        </w:rPr>
+        <w:t>idx</w:t>
+      </w:r>
+      <w:proofErr w:type="spellEnd"/>
+      <w:r>
+        <w:rPr>
+          <w:rFonts w:ascii="Consolas" w:hAnsi="Consolas" w:cs="Consolas"/>
+          <w:sz w:val="20"/>
+          <w:szCs w:val="20"/>
+        </w:rPr>
+        <w:t xml:space="preserve"> in </w:t>
+      </w:r>
+      <w:proofErr w:type="spellStart"/>
+      <w:r>
+        <w:rPr>
+          <w:rFonts w:ascii="Consolas" w:hAnsi="Consolas" w:cs="Consolas"/>
+          <w:sz w:val="20"/>
+          <w:szCs w:val="20"/>
+        </w:rPr>
+        <w:t>sparse_inputs.items</w:t>
+      </w:r>
+      <w:proofErr w:type="spellEnd"/>
+      <w:r>
+        <w:rPr>
+          <w:rFonts w:ascii="Consolas" w:hAnsi="Consolas" w:cs="Consolas"/>
+          <w:sz w:val="20"/>
+          <w:szCs w:val="20"/>
+        </w:rPr>
+        <w:t>())</w:t>
+      </w:r>
+      <w:r>
+        <w:rPr>
+          <w:rFonts w:ascii="Consolas" w:hAnsi="Consolas" w:cs="Consolas"/>
+          <w:sz w:val="20"/>
+          <w:szCs w:val="20"/>
+        </w:rPr>
+        <w:br/>
+        <w:t xml:space="preserve">        # 2nd order: FM pairwise interactions</w:t>
+      </w:r>
+      <w:r>
+        <w:rPr>
+          <w:rFonts w:ascii="Consolas" w:hAnsi="Consolas" w:cs="Consolas"/>
+          <w:sz w:val="20"/>
+          <w:szCs w:val="20"/>
+        </w:rPr>
+        <w:br/>
+        <w:t xml:space="preserve">        stacked = </w:t>
+      </w:r>
+      <w:proofErr w:type="spellStart"/>
+      <w:r>
+        <w:rPr>
+          <w:rFonts w:ascii="Consolas" w:hAnsi="Consolas" w:cs="Consolas"/>
+          <w:sz w:val="20"/>
+          <w:szCs w:val="20"/>
+        </w:rPr>
+        <w:t>torch.stack</w:t>
+      </w:r>
+      <w:proofErr w:type="spellEnd"/>
+      <w:r>
+        <w:rPr>
+          <w:rFonts w:ascii="Consolas" w:hAnsi="Consolas" w:cs="Consolas"/>
+          <w:sz w:val="20"/>
+          <w:szCs w:val="20"/>
+        </w:rPr>
+        <w:t>([</w:t>
+      </w:r>
+      <w:proofErr w:type="spellStart"/>
+      <w:r>
+        <w:rPr>
+          <w:rFonts w:ascii="Consolas" w:hAnsi="Consolas" w:cs="Consolas"/>
+          <w:sz w:val="20"/>
+          <w:szCs w:val="20"/>
+        </w:rPr>
+        <w:t>self.embeddings</w:t>
+      </w:r>
+      <w:proofErr w:type="spellEnd"/>
+      <w:r>
+        <w:rPr>
+          <w:rFonts w:ascii="Consolas" w:hAnsi="Consolas" w:cs="Consolas"/>
+          <w:sz w:val="20"/>
+          <w:szCs w:val="20"/>
+        </w:rPr>
+        <w:t>[f](</w:t>
+      </w:r>
+      <w:proofErr w:type="spellStart"/>
+      <w:r>
+        <w:rPr>
+          <w:rFonts w:ascii="Consolas" w:hAnsi="Consolas" w:cs="Consolas"/>
+          <w:sz w:val="20"/>
+          <w:szCs w:val="20"/>
+        </w:rPr>
+        <w:t>idx</w:t>
+      </w:r>
+      <w:proofErr w:type="spellEnd"/>
+      <w:r>
+        <w:rPr>
+          <w:rFonts w:ascii="Consolas" w:hAnsi="Consolas" w:cs="Consolas"/>
+          <w:sz w:val="20"/>
+          <w:szCs w:val="20"/>
+        </w:rPr>
+        <w:t xml:space="preserve">) for f, </w:t>
+      </w:r>
+      <w:proofErr w:type="spellStart"/>
+      <w:r>
+        <w:rPr>
+          <w:rFonts w:ascii="Consolas" w:hAnsi="Consolas" w:cs="Consolas"/>
+          <w:sz w:val="20"/>
+          <w:szCs w:val="20"/>
+        </w:rPr>
+        <w:t>idx</w:t>
+      </w:r>
+      <w:proofErr w:type="spellEnd"/>
+      <w:r>
+        <w:rPr>
+          <w:rFonts w:ascii="Consolas" w:hAnsi="Consolas" w:cs="Consolas"/>
+          <w:sz w:val="20"/>
+          <w:szCs w:val="20"/>
+        </w:rPr>
+        <w:t xml:space="preserve"> in </w:t>
+      </w:r>
+      <w:proofErr w:type="spellStart"/>
+      <w:r>
+        <w:rPr>
+          <w:rFonts w:ascii="Consolas" w:hAnsi="Consolas" w:cs="Consolas"/>
+          <w:sz w:val="20"/>
+          <w:szCs w:val="20"/>
+        </w:rPr>
+        <w:t>sparse_inputs.items</w:t>
+      </w:r>
+      <w:proofErr w:type="spellEnd"/>
+      <w:r>
+        <w:rPr>
+          <w:rFonts w:ascii="Consolas" w:hAnsi="Consolas" w:cs="Consolas"/>
+          <w:sz w:val="20"/>
+          <w:szCs w:val="20"/>
+        </w:rPr>
+        <w:t>()], dim=1)</w:t>
+      </w:r>
+      <w:r>
+        <w:rPr>
+          <w:rFonts w:ascii="Consolas" w:hAnsi="Consolas" w:cs="Consolas"/>
+          <w:sz w:val="20"/>
+          <w:szCs w:val="20"/>
+        </w:rPr>
+        <w:br/>
+        <w:t xml:space="preserve">        </w:t>
+      </w:r>
+      <w:proofErr w:type="spellStart"/>
+      <w:r>
+        <w:rPr>
+          <w:rFonts w:ascii="Consolas" w:hAnsi="Consolas" w:cs="Consolas"/>
+          <w:sz w:val="20"/>
+          <w:szCs w:val="20"/>
+        </w:rPr>
+        <w:t>fm_out</w:t>
+      </w:r>
+      <w:proofErr w:type="spellEnd"/>
+      <w:r>
+        <w:rPr>
+          <w:rFonts w:ascii="Consolas" w:hAnsi="Consolas" w:cs="Consolas"/>
+          <w:sz w:val="20"/>
+          <w:szCs w:val="20"/>
+        </w:rPr>
+        <w:t xml:space="preserve"> = self.fm(stacked)</w:t>
+      </w:r>
+      <w:r>
+        <w:rPr>
+          <w:rFonts w:ascii="Consolas" w:hAnsi="Consolas" w:cs="Consolas"/>
+          <w:sz w:val="20"/>
+          <w:szCs w:val="20"/>
+        </w:rPr>
+        <w:br/>
+        <w:t xml:space="preserve">        # Higher order: DNN on concatenated embeddings</w:t>
+      </w:r>
+      <w:r>
+        <w:rPr>
+          <w:rFonts w:ascii="Consolas" w:hAnsi="Consolas" w:cs="Consolas"/>
+          <w:sz w:val="20"/>
+          <w:szCs w:val="20"/>
+        </w:rPr>
+        <w:br/>
+        <w:t xml:space="preserve">        </w:t>
+      </w:r>
+      <w:proofErr w:type="spellStart"/>
+      <w:r>
+        <w:rPr>
+          <w:rFonts w:ascii="Consolas" w:hAnsi="Consolas" w:cs="Consolas"/>
+          <w:sz w:val="20"/>
+          <w:szCs w:val="20"/>
+        </w:rPr>
+        <w:t>dnn_out</w:t>
+      </w:r>
+      <w:proofErr w:type="spellEnd"/>
+      <w:r>
+        <w:rPr>
+          <w:rFonts w:ascii="Consolas" w:hAnsi="Consolas" w:cs="Consolas"/>
+          <w:sz w:val="20"/>
+          <w:szCs w:val="20"/>
+        </w:rPr>
+        <w:t xml:space="preserve"> = </w:t>
+      </w:r>
+      <w:proofErr w:type="spellStart"/>
+      <w:r>
+        <w:rPr>
+          <w:rFonts w:ascii="Consolas" w:hAnsi="Consolas" w:cs="Consolas"/>
+          <w:sz w:val="20"/>
+          <w:szCs w:val="20"/>
+        </w:rPr>
+        <w:t>self.output_layer</w:t>
+      </w:r>
+      <w:proofErr w:type="spellEnd"/>
+      <w:r>
+        <w:rPr>
+          <w:rFonts w:ascii="Consolas" w:hAnsi="Consolas" w:cs="Consolas"/>
+          <w:sz w:val="20"/>
+          <w:szCs w:val="20"/>
+        </w:rPr>
+        <w:t>(</w:t>
+      </w:r>
+      <w:proofErr w:type="spellStart"/>
+      <w:r>
+        <w:rPr>
+          <w:rFonts w:ascii="Consolas" w:hAnsi="Consolas" w:cs="Consolas"/>
+          <w:sz w:val="20"/>
+          <w:szCs w:val="20"/>
+        </w:rPr>
+        <w:t>self.dnn</w:t>
+      </w:r>
+      <w:proofErr w:type="spellEnd"/>
+      <w:r>
+        <w:rPr>
+          <w:rFonts w:ascii="Consolas" w:hAnsi="Consolas" w:cs="Consolas"/>
+          <w:sz w:val="20"/>
+          <w:szCs w:val="20"/>
+        </w:rPr>
+        <w:t>(torch.cat([...], dim=1)))</w:t>
+      </w:r>
+      <w:r>
+        <w:rPr>
+          <w:rFonts w:ascii="Consolas" w:hAnsi="Consolas" w:cs="Consolas"/>
+          <w:sz w:val="20"/>
+          <w:szCs w:val="20"/>
+        </w:rPr>
+        <w:br/>
+        <w:t xml:space="preserve">        return </w:t>
+      </w:r>
+      <w:proofErr w:type="spellStart"/>
+      <w:r>
+        <w:rPr>
+          <w:rFonts w:ascii="Consolas" w:hAnsi="Consolas" w:cs="Consolas"/>
+          <w:sz w:val="20"/>
+          <w:szCs w:val="20"/>
+        </w:rPr>
+        <w:t>linear_out</w:t>
+      </w:r>
+      <w:proofErr w:type="spellEnd"/>
+      <w:r>
+        <w:rPr>
+          <w:rFonts w:ascii="Consolas" w:hAnsi="Consolas" w:cs="Consolas"/>
+          <w:sz w:val="20"/>
+          <w:szCs w:val="20"/>
+        </w:rPr>
+        <w:t xml:space="preserve"> + </w:t>
+      </w:r>
+      <w:proofErr w:type="spellStart"/>
+      <w:r>
+        <w:rPr>
+          <w:rFonts w:ascii="Consolas" w:hAnsi="Consolas" w:cs="Consolas"/>
+          <w:sz w:val="20"/>
+          <w:szCs w:val="20"/>
+        </w:rPr>
+        <w:t>fm_out</w:t>
+      </w:r>
+      <w:proofErr w:type="spellEnd"/>
+      <w:r>
+        <w:rPr>
+          <w:rFonts w:ascii="Consolas" w:hAnsi="Consolas" w:cs="Consolas"/>
+          <w:sz w:val="20"/>
+          <w:szCs w:val="20"/>
+        </w:rPr>
+        <w:t xml:space="preserve"> + </w:t>
+      </w:r>
+      <w:proofErr w:type="spellStart"/>
+      <w:r>
+        <w:rPr>
+          <w:rFonts w:ascii="Consolas" w:hAnsi="Consolas" w:cs="Consolas"/>
+          <w:sz w:val="20"/>
+          <w:szCs w:val="20"/>
+        </w:rPr>
+        <w:t>dnn_out</w:t>
+      </w:r>
+      <w:proofErr w:type="spellEnd"/>
+      <w:r>
+        <w:rPr>
+          <w:rFonts w:ascii="Consolas" w:hAnsi="Consolas" w:cs="Consolas"/>
+          <w:sz w:val="20"/>
+          <w:szCs w:val="20"/>
+        </w:rPr>
+        <w:t xml:space="preserve">  # Sum all three terms</w:t>
+      </w:r>
+    </w:p>
+    <w:p>
+      <w:pPr>
+        <w:pBdr>
+          <w:top w:val="single" w:sz="4" w:space="4" w:color="CCCCCC"/>
+          <w:left w:val="single" w:sz="4" w:space="4" w:color="CCCCCC"/>
+          <w:bottom w:val="single" w:sz="4" w:space="4" w:color="CCCCCC"/>
+          <w:right w:val="single" w:sz="4" w:space="4" w:color="CCCCCC"/>
+        </w:pBdr>
+        <w:shd w:val="clear" w:color="auto" w:fill="F2F2F2"/>
+        <w:spacing w:before="120" w:after="200"/>
+      </w:pPr>
     </w:p>
     <w:p>
       <w:pPr>
@@ -3423,7 +5931,15 @@
         <w:spacing w:after="200" w:line="276" w:lineRule="auto"/>
       </w:pPr>
       <w:r>
-        <w:t>The FM component eliminates the manual feature engineering burden that Wide &amp; Deep (Cheng et al., DLRS 2016) introduced. The original Wide &amp; Deep paper (Cheng et al., "Wide &amp; Deep Learning for Recommender Systems," Proceedings of the 1st Workshop on Deep Learning for Recommender Systems, 2016) describes how Google Play used the architecture to serve app recommendations to over one billion active users. In Wide &amp; Deep, the 'wide' linear component requires hand-crafted cross-product features. DeepFM replaces this with the FM layer that automatically computes all pairwise interactions:</w:t>
+        <w:t xml:space="preserve">The FM component eliminates the manual feature engineering burden that Wide &amp; Deep (Cheng et al., DLRS 2016) introduced. The original Wide &amp; Deep paper (Cheng et al., "Wide &amp; Deep Learning for Recommender Systems," Proceedings of the 1st Workshop on Deep Learning for Recommender Systems, 2016) describes how Google Play used the architecture to serve app recommendations to over one billion active users. In Wide &amp; Deep, the 'wide' linear component requires hand-crafted cross-product features. </w:t>
+      </w:r>
+      <w:proofErr w:type="spellStart"/>
+      <w:r>
+        <w:t>DeepFM</w:t>
+      </w:r>
+      <w:proofErr w:type="spellEnd"/>
+      <w:r>
+        <w:t xml:space="preserve"> replaces this with the FM layer that automatically computes all pairwise interactions:</w:t>
       </w:r>
     </w:p>
     <w:p>
@@ -3437,15 +5953,115 @@
           <w:i/>
           <w:iCs/>
         </w:rPr>
-        <w:t>FM output = sum over all pairs (i,j) of &lt;v_i, v_j&gt; * x_i * x_j</w:t>
-      </w:r>
+        <w:t>FM output = sum over all pairs (</w:t>
+      </w:r>
+      <w:proofErr w:type="spellStart"/>
+      <w:proofErr w:type="gramStart"/>
+      <w:r>
+        <w:rPr>
+          <w:rFonts w:ascii="Consolas" w:eastAsia="Consolas" w:hAnsi="Consolas" w:cs="Consolas"/>
+          <w:i/>
+          <w:iCs/>
+        </w:rPr>
+        <w:t>i,j</w:t>
+      </w:r>
+      <w:proofErr w:type="spellEnd"/>
+      <w:proofErr w:type="gramEnd"/>
+      <w:r>
+        <w:rPr>
+          <w:rFonts w:ascii="Consolas" w:eastAsia="Consolas" w:hAnsi="Consolas" w:cs="Consolas"/>
+          <w:i/>
+          <w:iCs/>
+        </w:rPr>
+        <w:t>) of &lt;</w:t>
+      </w:r>
+      <w:proofErr w:type="spellStart"/>
+      <w:r>
+        <w:rPr>
+          <w:rFonts w:ascii="Consolas" w:eastAsia="Consolas" w:hAnsi="Consolas" w:cs="Consolas"/>
+          <w:i/>
+          <w:iCs/>
+        </w:rPr>
+        <w:t>v_i</w:t>
+      </w:r>
+      <w:proofErr w:type="spellEnd"/>
+      <w:r>
+        <w:rPr>
+          <w:rFonts w:ascii="Consolas" w:eastAsia="Consolas" w:hAnsi="Consolas" w:cs="Consolas"/>
+          <w:i/>
+          <w:iCs/>
+        </w:rPr>
+        <w:t xml:space="preserve">, </w:t>
+      </w:r>
+      <w:proofErr w:type="spellStart"/>
+      <w:r>
+        <w:rPr>
+          <w:rFonts w:ascii="Consolas" w:eastAsia="Consolas" w:hAnsi="Consolas" w:cs="Consolas"/>
+          <w:i/>
+          <w:iCs/>
+        </w:rPr>
+        <w:t>v_j</w:t>
+      </w:r>
+      <w:proofErr w:type="spellEnd"/>
+      <w:r>
+        <w:rPr>
+          <w:rFonts w:ascii="Consolas" w:eastAsia="Consolas" w:hAnsi="Consolas" w:cs="Consolas"/>
+          <w:i/>
+          <w:iCs/>
+        </w:rPr>
+        <w:t xml:space="preserve">&gt; * </w:t>
+      </w:r>
+      <w:proofErr w:type="spellStart"/>
+      <w:r>
+        <w:rPr>
+          <w:rFonts w:ascii="Consolas" w:eastAsia="Consolas" w:hAnsi="Consolas" w:cs="Consolas"/>
+          <w:i/>
+          <w:iCs/>
+        </w:rPr>
+        <w:t>x_i</w:t>
+      </w:r>
+      <w:proofErr w:type="spellEnd"/>
+      <w:r>
+        <w:rPr>
+          <w:rFonts w:ascii="Consolas" w:eastAsia="Consolas" w:hAnsi="Consolas" w:cs="Consolas"/>
+          <w:i/>
+          <w:iCs/>
+        </w:rPr>
+        <w:t xml:space="preserve"> * </w:t>
+      </w:r>
+      <w:proofErr w:type="spellStart"/>
+      <w:r>
+        <w:rPr>
+          <w:rFonts w:ascii="Consolas" w:eastAsia="Consolas" w:hAnsi="Consolas" w:cs="Consolas"/>
+          <w:i/>
+          <w:iCs/>
+        </w:rPr>
+        <w:t>x_j</w:t>
+      </w:r>
+      <w:proofErr w:type="spellEnd"/>
     </w:p>
     <w:p>
       <w:pPr>
         <w:spacing w:after="200" w:line="276" w:lineRule="auto"/>
       </w:pPr>
       <w:r>
-        <w:t>where v_i is the embedding vector for feature i. The FM trick makes this computation efficient: O(n*k) instead of O(n^2*k) where n is the number of features and k is the embedding dimension.</w:t>
+        <w:t xml:space="preserve">where </w:t>
+      </w:r>
+      <w:proofErr w:type="spellStart"/>
+      <w:r>
+        <w:t>v_i</w:t>
+      </w:r>
+      <w:proofErr w:type="spellEnd"/>
+      <w:r>
+        <w:t xml:space="preserve"> is the embedding vector for feature </w:t>
+      </w:r>
+      <w:proofErr w:type="spellStart"/>
+      <w:r>
+        <w:t>i</w:t>
+      </w:r>
+      <w:proofErr w:type="spellEnd"/>
+      <w:r>
+        <w:t>. The FM trick makes this computation efficient: O(n*k) instead of O(n^2*k) where n is the number of features and k is the embedding dimension.</w:t>
       </w:r>
     </w:p>
     <w:p>
@@ -3453,8 +6069,13 @@
         <w:pStyle w:val="Heading3"/>
       </w:pPr>
       <w:r>
-        <w:t>6.5.3 When to Use DeepFM</w:t>
-      </w:r>
+        <w:t xml:space="preserve">6.5.3 When to Use </w:t>
+      </w:r>
+      <w:proofErr w:type="spellStart"/>
+      <w:r>
+        <w:t>DeepFM</w:t>
+      </w:r>
+      <w:proofErr w:type="spellEnd"/>
     </w:p>
     <w:p>
       <w:pPr>
@@ -3510,9 +6131,17 @@
     </w:p>
     <w:p>
       <w:pPr>
+        <w:pStyle w:val="ListParagraph"/>
+        <w:spacing w:after="120" w:line="276" w:lineRule="auto"/>
+        <w:ind w:left="360"/>
+      </w:pPr>
+    </w:p>
+    <w:p>
+      <w:pPr>
         <w:pStyle w:val="Heading2"/>
       </w:pPr>
       <w:r>
+        <w:lastRenderedPageBreak/>
         <w:t>6.6 Ranking vs. Retrieval: Key Differences</w:t>
       </w:r>
     </w:p>
@@ -3708,8 +6337,17 @@
                 <w:sz w:val="22"/>
                 <w:szCs w:val="22"/>
               </w:rPr>
-              <w:t xml:space="preserve"> to low billions</w:t>
-            </w:r>
+              <w:t xml:space="preserve"> to </w:t>
+            </w:r>
+            <w:proofErr w:type="gramStart"/>
+            <w:r>
+              <w:rPr>
+                <w:sz w:val="22"/>
+                <w:szCs w:val="22"/>
+              </w:rPr>
+              <w:t>low billions</w:t>
+            </w:r>
+            <w:proofErr w:type="gramEnd"/>
             <w:r>
               <w:rPr>
                 <w:sz w:val="22"/>
@@ -3947,7 +6585,23 @@
                 <w:sz w:val="22"/>
                 <w:szCs w:val="22"/>
               </w:rPr>
-              <w:t>Moderate (GBDT, DeepFM)</w:t>
+              <w:t xml:space="preserve">Moderate (GBDT, </w:t>
+            </w:r>
+            <w:proofErr w:type="spellStart"/>
+            <w:r>
+              <w:rPr>
+                <w:sz w:val="22"/>
+                <w:szCs w:val="22"/>
+              </w:rPr>
+              <w:t>DeepFM</w:t>
+            </w:r>
+            <w:proofErr w:type="spellEnd"/>
+            <w:r>
+              <w:rPr>
+                <w:sz w:val="22"/>
+                <w:szCs w:val="22"/>
+              </w:rPr>
+              <w:t>)</w:t>
             </w:r>
           </w:p>
         </w:tc>
@@ -4036,12 +6690,21 @@
             <w:pPr>
               <w:spacing w:after="60"/>
             </w:pPr>
+            <w:proofErr w:type="gramStart"/>
             <w:r>
               <w:rPr>
                 <w:sz w:val="22"/>
                 <w:szCs w:val="22"/>
               </w:rPr>
-              <w:t>Cross-features, aggregates, context</w:t>
+              <w:t>Cross-features</w:t>
+            </w:r>
+            <w:proofErr w:type="gramEnd"/>
+            <w:r>
+              <w:rPr>
+                <w:sz w:val="22"/>
+                <w:szCs w:val="22"/>
+              </w:rPr>
+              <w:t>, aggregates, context</w:t>
             </w:r>
           </w:p>
         </w:tc>
@@ -4100,6 +6763,7 @@
             <w:pPr>
               <w:spacing w:after="60"/>
             </w:pPr>
+            <w:proofErr w:type="spellStart"/>
             <w:r>
               <w:rPr>
                 <w:sz w:val="22"/>
@@ -4107,6 +6771,7 @@
               </w:rPr>
               <w:t>Recall@K</w:t>
             </w:r>
+            <w:proofErr w:type="spellEnd"/>
           </w:p>
         </w:tc>
         <w:tc>
@@ -4309,7 +6974,15 @@
         <w:t xml:space="preserve">Feature computation: </w:t>
       </w:r>
       <w:r>
-        <w:t>Feature fetching often dominates end-to-end latency. Pre-computing and caching user features in a feature store (Chapter 4) is critical.</w:t>
+        <w:t xml:space="preserve">Feature fetching often dominates end-to-end latency. Pre-computing and </w:t>
+      </w:r>
+      <w:proofErr w:type="gramStart"/>
+      <w:r>
+        <w:t>caching</w:t>
+      </w:r>
+      <w:proofErr w:type="gramEnd"/>
+      <w:r>
+        <w:t xml:space="preserve"> user features in a feature store (Chapter 4) is critical.</w:t>
       </w:r>
     </w:p>
     <w:p>
@@ -4376,7 +7049,23 @@
         <w:spacing w:after="120" w:line="276" w:lineRule="auto"/>
       </w:pPr>
       <w:r>
-        <w:t>For DeepFM, export the trained model as ONNX or TorchScript for optimized inference</w:t>
+        <w:t xml:space="preserve">For </w:t>
+      </w:r>
+      <w:proofErr w:type="spellStart"/>
+      <w:r>
+        <w:t>DeepFM</w:t>
+      </w:r>
+      <w:proofErr w:type="spellEnd"/>
+      <w:r>
+        <w:t xml:space="preserve">, export the trained model as ONNX or </w:t>
+      </w:r>
+      <w:proofErr w:type="spellStart"/>
+      <w:r>
+        <w:t>TorchScript</w:t>
+      </w:r>
+      <w:proofErr w:type="spellEnd"/>
+      <w:r>
+        <w:t xml:space="preserve"> for optimized inference</w:t>
       </w:r>
     </w:p>
     <w:p>
@@ -4389,6 +7078,7 @@
         <w:spacing w:after="120" w:line="276" w:lineRule="auto"/>
       </w:pPr>
       <w:r>
+        <w:lastRenderedPageBreak/>
         <w:t>Consider model distillation: train a complex model offline, then distill it into a simpler model for serving</w:t>
       </w:r>
     </w:p>
@@ -4405,7 +7095,15 @@
         <w:spacing w:after="200" w:line="276" w:lineRule="auto"/>
       </w:pPr>
       <w:r>
-        <w:t>The first-stage ranker is not meant to be the final answer. It is a filter that ensures the most promising candidates proceed to a more sophisticated second stage. Consider adding a second-stage (heavy) ranker when:</w:t>
+        <w:t xml:space="preserve">The first-stage ranker is not meant to be the final answer. It is a filter that ensures the most promising candidates proceed to a more sophisticated second stage. Consider adding a </w:t>
+      </w:r>
+      <w:proofErr w:type="gramStart"/>
+      <w:r>
+        <w:t>second-stage</w:t>
+      </w:r>
+      <w:proofErr w:type="gramEnd"/>
+      <w:r>
+        <w:t xml:space="preserve"> (heavy) ranker when:</w:t>
       </w:r>
     </w:p>
     <w:p>
@@ -4418,7 +7116,15 @@
         <w:spacing w:after="120" w:line="276" w:lineRule="auto"/>
       </w:pPr>
       <w:r>
-        <w:t>Your first-stage ranker's capacity is bottlenecked by latency constraints and you have measurable headroom in relevance</w:t>
+        <w:t xml:space="preserve">Your first-stage ranker's capacity is bottlenecked by latency </w:t>
+      </w:r>
+      <w:proofErr w:type="gramStart"/>
+      <w:r>
+        <w:t>constraints</w:t>
+      </w:r>
+      <w:proofErr w:type="gramEnd"/>
+      <w:r>
+        <w:t xml:space="preserve"> and you have measurable headroom in relevance</w:t>
       </w:r>
     </w:p>
     <w:p>
@@ -4444,7 +7150,6 @@
         <w:spacing w:after="120" w:line="276" w:lineRule="auto"/>
       </w:pPr>
       <w:r>
-        <w:lastRenderedPageBreak/>
         <w:t>Cross-feature interactions between user history and candidate items require deeper modeling (attention mechanisms, sequence modeling)</w:t>
       </w:r>
     </w:p>
@@ -4466,7 +7171,23 @@
         <w:spacing w:after="200" w:line="276" w:lineRule="auto"/>
       </w:pPr>
       <w:r>
-        <w:t>Chapter 7 covers the second-stage (heavy) ranker in detail, including DCN-V2, DLRM, and multi-task models like MMoE.</w:t>
+        <w:t xml:space="preserve">Chapter 7 covers the </w:t>
+      </w:r>
+      <w:proofErr w:type="gramStart"/>
+      <w:r>
+        <w:t>second-stage</w:t>
+      </w:r>
+      <w:proofErr w:type="gramEnd"/>
+      <w:r>
+        <w:t xml:space="preserve"> (heavy) ranker in detail, including DCN-V2, DLRM, and multi-task models like </w:t>
+      </w:r>
+      <w:proofErr w:type="spellStart"/>
+      <w:r>
+        <w:t>MMoE</w:t>
+      </w:r>
+      <w:proofErr w:type="spellEnd"/>
+      <w:r>
+        <w:t>.</w:t>
       </w:r>
     </w:p>
     <w:p>
@@ -4474,15 +7195,28 @@
         <w:pStyle w:val="Heading2"/>
       </w:pPr>
       <w:r>
-        <w:t>6.8 Code Tutorial: XGBoost Ranking on Yambda</w:t>
-      </w:r>
+        <w:t xml:space="preserve">6.8 Code Tutorial: XGBoost Ranking on </w:t>
+      </w:r>
+      <w:proofErr w:type="spellStart"/>
+      <w:r>
+        <w:t>Yambda</w:t>
+      </w:r>
+      <w:proofErr w:type="spellEnd"/>
     </w:p>
     <w:p>
       <w:pPr>
         <w:spacing w:after="200" w:line="276" w:lineRule="auto"/>
       </w:pPr>
       <w:r>
-        <w:t>The code tutorial for this chapter demonstrates first-stage ranking using the Yandex Yambda dataset, a large-scale music recommendation dataset with 50 million user-item interactions.</w:t>
+        <w:t xml:space="preserve">The code tutorial for this chapter demonstrates first-stage ranking using the Yandex </w:t>
+      </w:r>
+      <w:proofErr w:type="spellStart"/>
+      <w:r>
+        <w:t>Yambda</w:t>
+      </w:r>
+      <w:proofErr w:type="spellEnd"/>
+      <w:r>
+        <w:t xml:space="preserve"> dataset, a large-scale music recommendation dataset with 50 million user-item interactions.</w:t>
       </w:r>
     </w:p>
     <w:p>
@@ -4497,9 +7231,11 @@
       <w:pPr>
         <w:spacing w:after="200" w:line="276" w:lineRule="auto"/>
       </w:pPr>
+      <w:proofErr w:type="spellStart"/>
       <w:r>
         <w:t>Yambda</w:t>
       </w:r>
+      <w:proofErr w:type="spellEnd"/>
       <w:r>
         <w:t xml:space="preserve"> dataset</w:t>
       </w:r>
@@ -4516,7 +7252,15 @@
         <w:t xml:space="preserve">is defined </w:t>
       </w:r>
       <w:r>
-        <w:t>as played_ratio &gt;= 50%, a proxy for meaningful engagement.</w:t>
+        <w:t xml:space="preserve">as </w:t>
+      </w:r>
+      <w:proofErr w:type="spellStart"/>
+      <w:r>
+        <w:t>played_ratio</w:t>
+      </w:r>
+      <w:proofErr w:type="spellEnd"/>
+      <w:r>
+        <w:t xml:space="preserve"> &gt;= 50%, a proxy for meaningful engagement.</w:t>
       </w:r>
     </w:p>
     <w:p>
@@ -4548,6 +7292,7 @@
         <w:spacing w:after="200" w:line="276" w:lineRule="auto"/>
       </w:pPr>
       <w:r>
+        <w:lastRenderedPageBreak/>
         <w:t>This matters because the single most common source of silent production bugs in ranking systems is train-serve skew: the model is trained on one definition of a feature but served on a slightly different one. A classic failure mode is recomputing frequency-encoding vocabularies at inference time from live data, which means a user whose ID was rare at training time gets mapped to a different bucket in production. By serializing the fitted encoder (vocabularies, bin edges, imputation values, scaler parameters) and loading the exact same object at inference, we guarantee that the function the model learned is the function it is being asked to apply. This property is also what makes a feature pipeline unit-testable: we can assert that transform(x) produces identical output across training and serving code paths.</w:t>
       </w:r>
     </w:p>
@@ -4556,7 +7301,6 @@
         <w:pStyle w:val="Heading3"/>
       </w:pPr>
       <w:r>
-        <w:lastRenderedPageBreak/>
         <w:t>6.8.3 Model Training and Evaluation</w:t>
       </w:r>
     </w:p>
@@ -4565,7 +7309,35 @@
         <w:spacing w:after="200" w:line="276" w:lineRule="auto"/>
       </w:pPr>
       <w:r>
-        <w:t>We train both a pointwise classifier (binary:logistic objective) and a pairwise ranker (rank:pairwise with LambdaMART) and compare their performance on AUC, log loss, and NDCG metrics. The tutorial also demonstrates hyperparameter tuning with early stopping and the impact of training data volume on model performance.</w:t>
+        <w:t>We train both a pointwise classifier (</w:t>
+      </w:r>
+      <w:proofErr w:type="spellStart"/>
+      <w:proofErr w:type="gramStart"/>
+      <w:r>
+        <w:t>binary:logistic</w:t>
+      </w:r>
+      <w:proofErr w:type="spellEnd"/>
+      <w:proofErr w:type="gramEnd"/>
+      <w:r>
+        <w:t xml:space="preserve"> objective) and a pairwise ranker (</w:t>
+      </w:r>
+      <w:proofErr w:type="spellStart"/>
+      <w:proofErr w:type="gramStart"/>
+      <w:r>
+        <w:t>rank:pairwise</w:t>
+      </w:r>
+      <w:proofErr w:type="spellEnd"/>
+      <w:proofErr w:type="gramEnd"/>
+      <w:r>
+        <w:t xml:space="preserve"> with </w:t>
+      </w:r>
+      <w:proofErr w:type="spellStart"/>
+      <w:r>
+        <w:t>LambdaMART</w:t>
+      </w:r>
+      <w:proofErr w:type="spellEnd"/>
+      <w:r>
+        <w:t>) and compare their performance on AUC, log loss, and NDCG metrics. The tutorial also demonstrates hyperparameter tuning with early stopping and the impact of training data volume on model performance.</w:t>
       </w:r>
     </w:p>
     <w:p>
@@ -4665,7 +7437,15 @@
         <w:spacing w:after="120" w:line="276" w:lineRule="auto"/>
       </w:pPr>
       <w:r>
-        <w:t>The first-stage ranker bridges the gap between fast-but-coarse retrieval and precise-but-expensive second-stage ranking</w:t>
+        <w:t xml:space="preserve">The first-stage ranker bridges the gap between fast-but-coarse retrieval and precise-but-expensive </w:t>
+      </w:r>
+      <w:proofErr w:type="gramStart"/>
+      <w:r>
+        <w:t>second-stage</w:t>
+      </w:r>
+      <w:proofErr w:type="gramEnd"/>
+      <w:r>
+        <w:t xml:space="preserve"> ranking</w:t>
       </w:r>
     </w:p>
     <w:p>
@@ -4678,6 +7458,7 @@
         <w:spacing w:after="120" w:line="276" w:lineRule="auto"/>
       </w:pPr>
       <w:r>
+        <w:lastRenderedPageBreak/>
         <w:t>Learning to Rank provides three paradigms (pointwise, pairwise, listwise); pointwise is the pragmatic starting point for most systems</w:t>
       </w:r>
     </w:p>
@@ -4704,7 +7485,23 @@
         <w:spacing w:after="120" w:line="276" w:lineRule="auto"/>
       </w:pPr>
       <w:r>
-        <w:t>Gradient boosted trees (XGBoost, LightGBM) offer an excellent accuracy-to-complexity ratio for first-stage ranking</w:t>
+        <w:t xml:space="preserve">Gradient boosted trees (XGBoost, </w:t>
+      </w:r>
+      <w:proofErr w:type="spellStart"/>
+      <w:r>
+        <w:t>LightGBM</w:t>
+      </w:r>
+      <w:proofErr w:type="spellEnd"/>
+      <w:r>
+        <w:t xml:space="preserve">) offer an excellent accuracy-to-complexity ratio for </w:t>
+      </w:r>
+      <w:proofErr w:type="gramStart"/>
+      <w:r>
+        <w:t>first-stage</w:t>
+      </w:r>
+      <w:proofErr w:type="gramEnd"/>
+      <w:r>
+        <w:t xml:space="preserve"> ranking</w:t>
       </w:r>
     </w:p>
     <w:p>
@@ -4716,8 +7513,13 @@
         </w:numPr>
         <w:spacing w:after="120" w:line="276" w:lineRule="auto"/>
       </w:pPr>
-      <w:r>
-        <w:t>DeepFM automates pairwise feature crosses while adding a deep component for higher-order interactions</w:t>
+      <w:proofErr w:type="spellStart"/>
+      <w:r>
+        <w:t>DeepFM</w:t>
+      </w:r>
+      <w:proofErr w:type="spellEnd"/>
+      <w:r>
+        <w:t xml:space="preserve"> automates pairwise feature crosses while adding a deep component for higher-order interactions</w:t>
       </w:r>
     </w:p>
     <w:p>
@@ -4730,7 +7532,6 @@
         <w:spacing w:after="120" w:line="276" w:lineRule="auto"/>
       </w:pPr>
       <w:r>
-        <w:lastRenderedPageBreak/>
         <w:t>Deployment requires balancing model complexity against latency budgets, with feature fetching often being the true bottleneck</w:t>
       </w:r>
     </w:p>
@@ -4774,6 +7575,7 @@
         </w:rPr>
         <w:t xml:space="preserve">Guo, H., Tang, R., Ye, Y., Li, Z., &amp; He, X. (2017). </w:t>
       </w:r>
+      <w:proofErr w:type="spellStart"/>
       <w:r>
         <w:rPr>
           <w:i/>
@@ -4781,7 +7583,17 @@
           <w:sz w:val="22"/>
           <w:szCs w:val="22"/>
         </w:rPr>
-        <w:t>DeepFM: A Factorization-Machine based Neural Network for CTR Prediction.</w:t>
+        <w:t>DeepFM</w:t>
+      </w:r>
+      <w:proofErr w:type="spellEnd"/>
+      <w:r>
+        <w:rPr>
+          <w:i/>
+          <w:iCs/>
+          <w:sz w:val="22"/>
+          <w:szCs w:val="22"/>
+        </w:rPr>
+        <w:t>: A Factorization-Machine based Neural Network for CTR Prediction.</w:t>
       </w:r>
       <w:r>
         <w:rPr>
@@ -4805,7 +7617,23 @@
           <w:sz w:val="22"/>
           <w:szCs w:val="22"/>
         </w:rPr>
-        <w:t xml:space="preserve">Chen, T., &amp; Guestrin, C. (2016). </w:t>
+        <w:t xml:space="preserve">Chen, T., &amp; </w:t>
+      </w:r>
+      <w:proofErr w:type="spellStart"/>
+      <w:r>
+        <w:rPr>
+          <w:sz w:val="22"/>
+          <w:szCs w:val="22"/>
+        </w:rPr>
+        <w:t>Guestrin</w:t>
+      </w:r>
+      <w:proofErr w:type="spellEnd"/>
+      <w:r>
+        <w:rPr>
+          <w:sz w:val="22"/>
+          <w:szCs w:val="22"/>
+        </w:rPr>
+        <w:t xml:space="preserve">, C. (2016). </w:t>
       </w:r>
       <w:r>
         <w:rPr>
@@ -4847,7 +7675,67 @@
           <w:sz w:val="22"/>
           <w:szCs w:val="22"/>
         </w:rPr>
-        <w:t>From RankNet to LambdaRank to LambdaMART: An Overview.</w:t>
+        <w:t xml:space="preserve">From </w:t>
+      </w:r>
+      <w:proofErr w:type="spellStart"/>
+      <w:r>
+        <w:rPr>
+          <w:i/>
+          <w:iCs/>
+          <w:sz w:val="22"/>
+          <w:szCs w:val="22"/>
+        </w:rPr>
+        <w:t>RankNet</w:t>
+      </w:r>
+      <w:proofErr w:type="spellEnd"/>
+      <w:r>
+        <w:rPr>
+          <w:i/>
+          <w:iCs/>
+          <w:sz w:val="22"/>
+          <w:szCs w:val="22"/>
+        </w:rPr>
+        <w:t xml:space="preserve"> to </w:t>
+      </w:r>
+      <w:proofErr w:type="spellStart"/>
+      <w:r>
+        <w:rPr>
+          <w:i/>
+          <w:iCs/>
+          <w:sz w:val="22"/>
+          <w:szCs w:val="22"/>
+        </w:rPr>
+        <w:t>LambdaRank</w:t>
+      </w:r>
+      <w:proofErr w:type="spellEnd"/>
+      <w:r>
+        <w:rPr>
+          <w:i/>
+          <w:iCs/>
+          <w:sz w:val="22"/>
+          <w:szCs w:val="22"/>
+        </w:rPr>
+        <w:t xml:space="preserve"> to </w:t>
+      </w:r>
+      <w:proofErr w:type="spellStart"/>
+      <w:r>
+        <w:rPr>
+          <w:i/>
+          <w:iCs/>
+          <w:sz w:val="22"/>
+          <w:szCs w:val="22"/>
+        </w:rPr>
+        <w:t>LambdaMART</w:t>
+      </w:r>
+      <w:proofErr w:type="spellEnd"/>
+      <w:r>
+        <w:rPr>
+          <w:i/>
+          <w:iCs/>
+          <w:sz w:val="22"/>
+          <w:szCs w:val="22"/>
+        </w:rPr>
+        <w:t>: An Overview.</w:t>
       </w:r>
       <w:r>
         <w:rPr>
@@ -4895,7 +7783,23 @@
           <w:sz w:val="22"/>
           <w:szCs w:val="22"/>
         </w:rPr>
-        <w:t xml:space="preserve"> DLRS Workshop, RecSys 2016.</w:t>
+        <w:t xml:space="preserve"> DLRS Workshop, </w:t>
+      </w:r>
+      <w:proofErr w:type="spellStart"/>
+      <w:r>
+        <w:rPr>
+          <w:sz w:val="22"/>
+          <w:szCs w:val="22"/>
+        </w:rPr>
+        <w:t>RecSys</w:t>
+      </w:r>
+      <w:proofErr w:type="spellEnd"/>
+      <w:r>
+        <w:rPr>
+          <w:sz w:val="22"/>
+          <w:szCs w:val="22"/>
+        </w:rPr>
+        <w:t xml:space="preserve"> 2016.</w:t>
       </w:r>
     </w:p>
     <w:p>
@@ -4980,6 +7884,7 @@
         </w:rPr>
         <w:t xml:space="preserve">Ke, G. et al. (2017). </w:t>
       </w:r>
+      <w:proofErr w:type="spellStart"/>
       <w:r>
         <w:rPr>
           <w:i/>
@@ -4987,14 +7892,40 @@
           <w:sz w:val="22"/>
           <w:szCs w:val="22"/>
         </w:rPr>
-        <w:t>LightGBM: A Highly Efficient Gradient Boosting Decision Tree.</w:t>
-      </w:r>
-      <w:r>
-        <w:rPr>
+        <w:t>LightGBM</w:t>
+      </w:r>
+      <w:proofErr w:type="spellEnd"/>
+      <w:r>
+        <w:rPr>
+          <w:i/>
+          <w:iCs/>
           <w:sz w:val="22"/>
           <w:szCs w:val="22"/>
         </w:rPr>
-        <w:t xml:space="preserve"> NeurIPS 2017.</w:t>
+        <w:t>: A Highly Efficient Gradient Boosting Decision Tree.</w:t>
+      </w:r>
+      <w:r>
+        <w:rPr>
+          <w:sz w:val="22"/>
+          <w:szCs w:val="22"/>
+        </w:rPr>
+        <w:t xml:space="preserve"> </w:t>
+      </w:r>
+      <w:proofErr w:type="spellStart"/>
+      <w:r>
+        <w:rPr>
+          <w:sz w:val="22"/>
+          <w:szCs w:val="22"/>
+        </w:rPr>
+        <w:t>NeurIPS</w:t>
+      </w:r>
+      <w:proofErr w:type="spellEnd"/>
+      <w:r>
+        <w:rPr>
+          <w:sz w:val="22"/>
+          <w:szCs w:val="22"/>
+        </w:rPr>
+        <w:t xml:space="preserve"> 2017.</w:t>
       </w:r>
     </w:p>
     <w:sectPr>
@@ -5924,7 +8855,6 @@
   <w:style w:type="character" w:default="1" w:styleId="DefaultParagraphFont">
     <w:name w:val="Default Paragraph Font"/>
     <w:uiPriority w:val="1"/>
-    <w:semiHidden/>
     <w:unhideWhenUsed/>
   </w:style>
   <w:style w:type="table" w:default="1" w:styleId="TableNormal">

</xml_diff>